<commit_message>
docs(grocery): plan voice-assisted shopping lists
</commit_message>
<xml_diff>
--- a/LifeOS Leitfaden.docx
+++ b/LifeOS Leitfaden.docx
@@ -72,7 +72,7 @@
         </w:rPr>
       </w:pPr>
       <w:r>
-        <w:t>Stand: 07.09.2026</w:t>
+        <w:t>Stand: 21.09.2026</w:t>
       </w:r>
     </w:p>
     <w:p>
@@ -174,7 +174,7 @@
         </w:rPr>
       </w:pPr>
       <w:r>
-        <w:t>Stand: 07.09.2026</w:t>
+        <w:t>Stand: 21.09.2026</w:t>
       </w:r>
     </w:p>
     <w:p>
@@ -908,6 +908,19 @@
       </w:pPr>
       <w:r>
         <w:t>Fitness</w:t>
+      </w:r>
+    </w:p>
+    <w:p>
+      <w:pPr>
+        <w:numPr>
+          <w:ilvl w:val="0"/>
+          <w:numId w:val="1"/>
+        </w:numPr>
+        <w:spacing w:after="80"/>
+        <w:ind w:hanging="271"/>
+      </w:pPr>
+      <w:r>
+        <w:t>Einkauf</w:t>
       </w:r>
     </w:p>
     <w:p>
@@ -1602,6 +1615,38 @@
             <w:tcW w:w="2100" w:type="dxa"/>
           </w:tcPr>
           <w:p>
+            <w:r>
+              <w:t>Einkauf</w:t>
+            </w:r>
+          </w:p>
+        </w:tc>
+        <w:tc>
+          <w:tcPr>
+            <w:tcW w:w="2500" w:type="dxa"/>
+          </w:tcPr>
+          <w:p>
+            <w:r>
+              <w:t>Lebensmittel schnell erfassen und nach Kategorien einkaufen</w:t>
+            </w:r>
+          </w:p>
+        </w:tc>
+        <w:tc>
+          <w:tcPr>
+            <w:tcW w:w="4760" w:type="dxa"/>
+          </w:tcPr>
+          <w:p>
+            <w:r>
+              <w:t>Einstellungen, lokale Spracheingabe</w:t>
+            </w:r>
+          </w:p>
+        </w:tc>
+      </w:tr>
+      <w:tr>
+        <w:tc>
+          <w:tcPr>
+            <w:tcW w:w="2100" w:type="dxa"/>
+          </w:tcPr>
+          <w:p>
             <w:pPr>
               <w:spacing w:after="0"/>
             </w:pPr>
@@ -5030,30 +5075,357 @@
     <w:p>
       <w:pPr>
         <w:pStyle w:val="Heading2"/>
-        <w:rPr>
-          <w:lang w:val="de-DE"/>
-        </w:rPr>
-      </w:pPr>
+      </w:pPr>
+      <w:r>
+        <w:t>5.9 Einkaufsliste und Spracheingabe</w:t>
+      </w:r>
+    </w:p>
+    <w:p>
+      <w:pPr/>
+      <w:r>
+        <w:t>Die Einkaufsliste erfasst Lebensmittel lokal und gruppiert sie nach nachvollziehbaren Kategorien. Sprache ist eine zusätzliche Eingabemethode und keine allgemeine Sprachsteuerung.</w:t>
+      </w:r>
+    </w:p>
+    <w:p>
+      <w:pPr>
+        <w:pStyle w:val="Heading3"/>
+      </w:pPr>
+      <w:r>
+        <w:t>Funktionen</w:t>
+      </w:r>
+    </w:p>
+    <w:p>
+      <w:pPr>
+        <w:numPr>
+          <w:ilvl w:val="0"/>
+          <w:numId w:val="18"/>
+        </w:numPr>
+        <w:spacing w:after="80"/>
+        <w:ind w:hanging="271"/>
+      </w:pPr>
+      <w:r>
+        <w:t>Mehrere Lebensmittel als Text oder Diktat in einem Eingabefeld erfassen.</w:t>
+      </w:r>
+    </w:p>
+    <w:p>
+      <w:pPr>
+        <w:numPr>
+          <w:ilvl w:val="0"/>
+          <w:numId w:val="18"/>
+        </w:numPr>
+        <w:spacing w:after="80"/>
+        <w:ind w:hanging="271"/>
+      </w:pPr>
+      <w:r>
+        <w:t>Einträge in einer bearbeitbaren Vorschau trennen und Mengen sowie Einheiten soweit eindeutig erkennen.</w:t>
+      </w:r>
+    </w:p>
+    <w:p>
+      <w:pPr>
+        <w:numPr>
+          <w:ilvl w:val="0"/>
+          <w:numId w:val="18"/>
+        </w:numPr>
+        <w:spacing w:after="80"/>
+        <w:ind w:hanging="271"/>
+      </w:pPr>
+      <w:r>
+        <w:t>Produkte über lokale, versionierte Regeln Kategorien wie Obst und Gemüse, Milchprodukte und Eier, Fleisch und Fisch, Getränke, Snacks und Sonstiges zuordnen.</w:t>
+      </w:r>
+    </w:p>
+    <w:p>
+      <w:pPr>
+        <w:numPr>
+          <w:ilvl w:val="0"/>
+          <w:numId w:val="18"/>
+        </w:numPr>
+        <w:spacing w:after="80"/>
+        <w:ind w:hanging="271"/>
+      </w:pPr>
+      <w:r>
+        <w:t>Unbekannte oder mehrdeutige Begriffe sichtbar unter Sonstiges einordnen und manuell korrigierbar halten.</w:t>
+      </w:r>
+    </w:p>
+    <w:p>
+      <w:pPr>
+        <w:numPr>
+          <w:ilvl w:val="0"/>
+          <w:numId w:val="18"/>
+        </w:numPr>
+        <w:spacing w:after="80"/>
+        <w:ind w:hanging="271"/>
+      </w:pPr>
+      <w:r>
+        <w:t>Erst nach ausdrücklicher Bestätigung alle Positionen atomar in die aktive Einkaufsliste übernehmen.</w:t>
+      </w:r>
+    </w:p>
+    <w:p>
+      <w:pPr>
+        <w:numPr>
+          <w:ilvl w:val="0"/>
+          <w:numId w:val="18"/>
+        </w:numPr>
+        <w:spacing w:after="80"/>
+        <w:ind w:hanging="271"/>
+      </w:pPr>
+      <w:r>
+        <w:t>Offene und erledigte Positionen untereinander nach Kategorie gruppieren, bearbeiten, abhaken, wieder öffnen und archivieren.</w:t>
+      </w:r>
+    </w:p>
+    <w:p>
+      <w:pPr>
+        <w:pStyle w:val="Heading3"/>
+      </w:pPr>
+      <w:r>
+        <w:t>Regeln</w:t>
+      </w:r>
+    </w:p>
+    <w:p>
+      <w:pPr>
+        <w:numPr>
+          <w:ilvl w:val="0"/>
+          <w:numId w:val="18"/>
+        </w:numPr>
+        <w:spacing w:after="80"/>
+        <w:ind w:hanging="271"/>
+      </w:pPr>
+      <w:r>
+        <w:t>LifeOS speichert und protokolliert kein Audio. Ein eigener Mikrofonmodus ist nur zulässig, wenn die konkrete Plattform lokale deutsche Spracherkennung erzwingen kann; andernfalls bleiben Text und Systemdiktat verfügbar.</w:t>
+      </w:r>
+    </w:p>
+    <w:p>
+      <w:pPr>
+        <w:numPr>
+          <w:ilvl w:val="0"/>
+          <w:numId w:val="18"/>
+        </w:numPr>
+        <w:spacing w:after="80"/>
+        <w:ind w:hanging="271"/>
+      </w:pPr>
+      <w:r>
+        <w:t>Die Funktion erstellt keine Ernährungs-, Gesundheits- oder Kaufempfehlung und verändert keine Fitness-, Finanz-, Aufgaben- oder Kalenderdaten automatisch.</w:t>
+      </w:r>
+    </w:p>
+    <w:p>
+      <w:pPr>
+        <w:pStyle w:val="Heading2"/>
+        <w:rPr>
+          <w:lang w:val="de-DE"/>
+        </w:rPr>
+      </w:pPr>
+      <w:r>
+        <w:t>5.10 Wissen</w:t>
+      </w:r>
+    </w:p>
+    <w:p>
+      <w:pPr>
+        <w:rPr>
+          <w:lang w:val="de-DE"/>
+        </w:rPr>
+      </w:pPr>
+      <w:r>
+        <w:rPr>
+          <w:lang w:val="de-DE"/>
+        </w:rPr>
+        <w:t>Das Wissensmodul ist eine persönliche, durchsuchbare Ablage für Notizen und Dokumente.</w:t>
+      </w:r>
+    </w:p>
+    <w:p>
+      <w:pPr>
+        <w:pStyle w:val="Heading3"/>
+      </w:pPr>
+      <w:proofErr w:type="spellStart"/>
       <w:r>
         <w:rPr>
           <w:rFonts w:ascii="Calibri" w:hAnsi="Calibri"/>
-          <w:lang w:val="de-DE"/>
-        </w:rPr>
-        <w:lastRenderedPageBreak/>
-        <w:t>5.9 Wissen</w:t>
-      </w:r>
-    </w:p>
-    <w:p>
-      <w:pPr>
-        <w:rPr>
-          <w:lang w:val="de-DE"/>
-        </w:rPr>
-      </w:pPr>
-      <w:r>
-        <w:rPr>
-          <w:lang w:val="de-DE"/>
-        </w:rPr>
-        <w:t>Das Wissensmodul ist eine persönliche, durchsuchbare Ablage für Notizen und Dokumente.</w:t>
+        </w:rPr>
+        <w:t>Funktionen</w:t>
+      </w:r>
+      <w:proofErr w:type="spellEnd"/>
+    </w:p>
+    <w:p>
+      <w:pPr>
+        <w:numPr>
+          <w:ilvl w:val="0"/>
+          <w:numId w:val="19"/>
+        </w:numPr>
+        <w:spacing w:after="80"/>
+        <w:ind w:hanging="271"/>
+      </w:pPr>
+      <w:proofErr w:type="spellStart"/>
+      <w:r>
+        <w:t>Notizen</w:t>
+      </w:r>
+      <w:proofErr w:type="spellEnd"/>
+      <w:r>
+        <w:t xml:space="preserve"> </w:t>
+      </w:r>
+      <w:proofErr w:type="spellStart"/>
+      <w:r>
+        <w:t>mit</w:t>
+      </w:r>
+      <w:proofErr w:type="spellEnd"/>
+      <w:r>
+        <w:t xml:space="preserve"> Markdown </w:t>
+      </w:r>
+      <w:proofErr w:type="spellStart"/>
+      <w:r>
+        <w:t>oder</w:t>
+      </w:r>
+      <w:proofErr w:type="spellEnd"/>
+      <w:r>
+        <w:t xml:space="preserve"> Rich Text.</w:t>
+      </w:r>
+    </w:p>
+    <w:p>
+      <w:pPr>
+        <w:numPr>
+          <w:ilvl w:val="0"/>
+          <w:numId w:val="19"/>
+        </w:numPr>
+        <w:spacing w:after="80"/>
+        <w:ind w:hanging="271"/>
+      </w:pPr>
+      <w:proofErr w:type="spellStart"/>
+      <w:r>
+        <w:t>Dokumente</w:t>
+      </w:r>
+      <w:proofErr w:type="spellEnd"/>
+      <w:r>
+        <w:t xml:space="preserve"> und </w:t>
+      </w:r>
+      <w:proofErr w:type="spellStart"/>
+      <w:r>
+        <w:t>Anhänge</w:t>
+      </w:r>
+      <w:proofErr w:type="spellEnd"/>
+      <w:r>
+        <w:t>.</w:t>
+      </w:r>
+    </w:p>
+    <w:p>
+      <w:pPr>
+        <w:numPr>
+          <w:ilvl w:val="0"/>
+          <w:numId w:val="19"/>
+        </w:numPr>
+        <w:spacing w:after="80"/>
+        <w:ind w:hanging="271"/>
+      </w:pPr>
+      <w:proofErr w:type="spellStart"/>
+      <w:r>
+        <w:t>Kategorien</w:t>
+      </w:r>
+      <w:proofErr w:type="spellEnd"/>
+      <w:r>
+        <w:t xml:space="preserve">, Tags und </w:t>
+      </w:r>
+      <w:proofErr w:type="spellStart"/>
+      <w:r>
+        <w:t>Verknüpfungen</w:t>
+      </w:r>
+      <w:proofErr w:type="spellEnd"/>
+      <w:r>
+        <w:t>.</w:t>
+      </w:r>
+    </w:p>
+    <w:p>
+      <w:pPr>
+        <w:numPr>
+          <w:ilvl w:val="0"/>
+          <w:numId w:val="19"/>
+        </w:numPr>
+        <w:spacing w:after="80"/>
+        <w:ind w:hanging="271"/>
+      </w:pPr>
+      <w:proofErr w:type="spellStart"/>
+      <w:r>
+        <w:t>Volltextsuche</w:t>
+      </w:r>
+      <w:proofErr w:type="spellEnd"/>
+      <w:r>
+        <w:t>.</w:t>
+      </w:r>
+    </w:p>
+    <w:p>
+      <w:pPr>
+        <w:numPr>
+          <w:ilvl w:val="0"/>
+          <w:numId w:val="19"/>
+        </w:numPr>
+        <w:spacing w:after="80"/>
+        <w:ind w:hanging="271"/>
+        <w:rPr>
+          <w:lang w:val="de-DE"/>
+        </w:rPr>
+      </w:pPr>
+      <w:r>
+        <w:rPr>
+          <w:lang w:val="de-DE"/>
+        </w:rPr>
+        <w:t>Favoriten und zuletzt bearbeitete Inhalte.</w:t>
+      </w:r>
+    </w:p>
+    <w:p>
+      <w:pPr>
+        <w:numPr>
+          <w:ilvl w:val="0"/>
+          <w:numId w:val="19"/>
+        </w:numPr>
+        <w:spacing w:after="80"/>
+        <w:ind w:hanging="271"/>
+        <w:rPr>
+          <w:lang w:val="de-DE"/>
+        </w:rPr>
+      </w:pPr>
+      <w:r>
+        <w:rPr>
+          <w:lang w:val="de-DE"/>
+        </w:rPr>
+        <w:t>Quellenangaben und Versionierung wichtiger Notizen.</w:t>
+      </w:r>
+    </w:p>
+    <w:p>
+      <w:pPr>
+        <w:numPr>
+          <w:ilvl w:val="0"/>
+          <w:numId w:val="19"/>
+        </w:numPr>
+        <w:spacing w:after="80"/>
+        <w:ind w:hanging="271"/>
+        <w:rPr>
+          <w:lang w:val="de-DE"/>
+        </w:rPr>
+      </w:pPr>
+      <w:r>
+        <w:rPr>
+          <w:lang w:val="de-DE"/>
+        </w:rPr>
+        <w:t>KI-Zusammenfassung und Fragen zu freigegebenen Inhalten.</w:t>
+      </w:r>
+    </w:p>
+    <w:p>
+      <w:pPr>
+        <w:pStyle w:val="Heading2"/>
+        <w:rPr>
+          <w:lang w:val="de-DE"/>
+        </w:rPr>
+      </w:pPr>
+      <w:r>
+        <w:t>5.11 KI-Assistent</w:t>
+      </w:r>
+    </w:p>
+    <w:p>
+      <w:pPr>
+        <w:rPr>
+          <w:lang w:val="de-DE"/>
+        </w:rPr>
+      </w:pPr>
+      <w:r>
+        <w:rPr>
+          <w:lang w:val="de-DE"/>
+        </w:rPr>
+        <w:t>Der KI-Assistent ist eine Querschnittsfunktion und keine eigenständige Datenquelle.</w:t>
       </w:r>
     </w:p>
     <w:p>
@@ -5073,14 +5445,33 @@
       <w:pPr>
         <w:numPr>
           <w:ilvl w:val="0"/>
-          <w:numId w:val="19"/>
+          <w:numId w:val="20"/>
+        </w:numPr>
+        <w:spacing w:after="80"/>
+        <w:ind w:hanging="271"/>
+        <w:rPr>
+          <w:lang w:val="de-DE"/>
+        </w:rPr>
+      </w:pPr>
+      <w:r>
+        <w:rPr>
+          <w:lang w:val="de-DE"/>
+        </w:rPr>
+        <w:t>Tagesplanung aus vorhandenen Aufgaben, Terminen und Deadlines.</w:t>
+      </w:r>
+    </w:p>
+    <w:p>
+      <w:pPr>
+        <w:numPr>
+          <w:ilvl w:val="0"/>
+          <w:numId w:val="20"/>
         </w:numPr>
         <w:spacing w:after="80"/>
         <w:ind w:hanging="271"/>
       </w:pPr>
       <w:proofErr w:type="spellStart"/>
       <w:r>
-        <w:t>Notizen</w:t>
+        <w:t>Wochenplanung</w:t>
       </w:r>
       <w:proofErr w:type="spellEnd"/>
       <w:r>
@@ -5092,40 +5483,64 @@
       </w:r>
       <w:proofErr w:type="spellEnd"/>
       <w:r>
-        <w:t xml:space="preserve"> Markdown </w:t>
+        <w:t xml:space="preserve"> </w:t>
       </w:r>
       <w:proofErr w:type="spellStart"/>
       <w:r>
-        <w:t>oder</w:t>
+        <w:t>verfügbaren</w:t>
       </w:r>
       <w:proofErr w:type="spellEnd"/>
       <w:r>
-        <w:t xml:space="preserve"> Rich Text.</w:t>
-      </w:r>
-    </w:p>
-    <w:p>
-      <w:pPr>
-        <w:numPr>
-          <w:ilvl w:val="0"/>
-          <w:numId w:val="19"/>
-        </w:numPr>
-        <w:spacing w:after="80"/>
-        <w:ind w:hanging="271"/>
-      </w:pPr>
+        <w:t xml:space="preserve"> </w:t>
+      </w:r>
       <w:proofErr w:type="spellStart"/>
       <w:r>
-        <w:t>Dokumente</w:t>
+        <w:t>Zeitblöcken</w:t>
       </w:r>
       <w:proofErr w:type="spellEnd"/>
       <w:r>
-        <w:t xml:space="preserve"> und </w:t>
-      </w:r>
+        <w:t>.</w:t>
+      </w:r>
+    </w:p>
+    <w:p>
+      <w:pPr>
+        <w:numPr>
+          <w:ilvl w:val="0"/>
+          <w:numId w:val="20"/>
+        </w:numPr>
+        <w:spacing w:after="80"/>
+        <w:ind w:hanging="271"/>
+      </w:pPr>
       <w:proofErr w:type="spellStart"/>
       <w:r>
-        <w:t>Anhänge</w:t>
+        <w:t>Priorisierung</w:t>
       </w:r>
       <w:proofErr w:type="spellEnd"/>
       <w:r>
+        <w:t xml:space="preserve"> </w:t>
+      </w:r>
+      <w:proofErr w:type="spellStart"/>
+      <w:r>
+        <w:t>mit</w:t>
+      </w:r>
+      <w:proofErr w:type="spellEnd"/>
+      <w:r>
+        <w:t xml:space="preserve"> </w:t>
+      </w:r>
+      <w:proofErr w:type="spellStart"/>
+      <w:r>
+        <w:t>kurzer</w:t>
+      </w:r>
+      <w:proofErr w:type="spellEnd"/>
+      <w:r>
+        <w:t xml:space="preserve"> </w:t>
+      </w:r>
+      <w:proofErr w:type="spellStart"/>
+      <w:r>
+        <w:t>Begründung</w:t>
+      </w:r>
+      <w:proofErr w:type="spellEnd"/>
+      <w:r>
         <w:t>.</w:t>
       </w:r>
     </w:p>
@@ -5133,43 +5548,196 @@
       <w:pPr>
         <w:numPr>
           <w:ilvl w:val="0"/>
-          <w:numId w:val="19"/>
+          <w:numId w:val="20"/>
+        </w:numPr>
+        <w:spacing w:after="80"/>
+        <w:ind w:hanging="271"/>
+        <w:rPr>
+          <w:lang w:val="de-DE"/>
+        </w:rPr>
+      </w:pPr>
+      <w:r>
+        <w:rPr>
+          <w:lang w:val="de-DE"/>
+        </w:rPr>
+        <w:t>Zusammenfassungen von Tagesberichten, Lernnotizen und Projektständen.</w:t>
+      </w:r>
+    </w:p>
+    <w:p>
+      <w:pPr>
+        <w:numPr>
+          <w:ilvl w:val="0"/>
+          <w:numId w:val="20"/>
         </w:numPr>
         <w:spacing w:after="80"/>
         <w:ind w:hanging="271"/>
       </w:pPr>
       <w:proofErr w:type="spellStart"/>
       <w:r>
-        <w:t>Kategorien</w:t>
+        <w:t>Modulbezogener</w:t>
       </w:r>
       <w:proofErr w:type="spellEnd"/>
       <w:r>
-        <w:t xml:space="preserve">, Tags und </w:t>
-      </w:r>
+        <w:t xml:space="preserve"> RAG-Chat.</w:t>
+      </w:r>
+    </w:p>
+    <w:p>
+      <w:pPr>
+        <w:numPr>
+          <w:ilvl w:val="0"/>
+          <w:numId w:val="20"/>
+        </w:numPr>
+        <w:spacing w:after="80"/>
+        <w:ind w:hanging="271"/>
+        <w:rPr>
+          <w:lang w:val="de-DE"/>
+        </w:rPr>
+      </w:pPr>
+      <w:r>
+        <w:rPr>
+          <w:lang w:val="de-DE"/>
+        </w:rPr>
+        <w:t>Fragen über freigegebene Wissens-, Studien- und Projektdaten.</w:t>
+      </w:r>
+    </w:p>
+    <w:p>
+      <w:pPr>
+        <w:numPr>
+          <w:ilvl w:val="0"/>
+          <w:numId w:val="20"/>
+        </w:numPr>
+        <w:spacing w:after="80"/>
+        <w:ind w:hanging="271"/>
+      </w:pPr>
       <w:proofErr w:type="spellStart"/>
       <w:r>
-        <w:t>Verknüpfungen</w:t>
+        <w:t>Vorschläge</w:t>
       </w:r>
       <w:proofErr w:type="spellEnd"/>
       <w:r>
+        <w:t xml:space="preserve"> für </w:t>
+      </w:r>
+      <w:proofErr w:type="spellStart"/>
+      <w:r>
+        <w:t>nächste</w:t>
+      </w:r>
+      <w:proofErr w:type="spellEnd"/>
+      <w:r>
+        <w:t xml:space="preserve"> </w:t>
+      </w:r>
+      <w:proofErr w:type="spellStart"/>
+      <w:r>
+        <w:t>Schritte</w:t>
+      </w:r>
+      <w:proofErr w:type="spellEnd"/>
+      <w:r>
         <w:t>.</w:t>
       </w:r>
     </w:p>
     <w:p>
       <w:pPr>
-        <w:numPr>
-          <w:ilvl w:val="0"/>
-          <w:numId w:val="19"/>
-        </w:numPr>
-        <w:spacing w:after="80"/>
-        <w:ind w:hanging="271"/>
+        <w:pStyle w:val="Heading3"/>
       </w:pPr>
       <w:proofErr w:type="spellStart"/>
       <w:r>
-        <w:t>Volltextsuche</w:t>
+        <w:rPr>
+          <w:rFonts w:ascii="Calibri" w:hAnsi="Calibri"/>
+        </w:rPr>
+        <w:t>Verbindliche</w:t>
       </w:r>
       <w:proofErr w:type="spellEnd"/>
       <w:r>
+        <w:rPr>
+          <w:rFonts w:ascii="Calibri" w:hAnsi="Calibri"/>
+        </w:rPr>
+        <w:t xml:space="preserve"> KI-</w:t>
+      </w:r>
+      <w:proofErr w:type="spellStart"/>
+      <w:r>
+        <w:rPr>
+          <w:rFonts w:ascii="Calibri" w:hAnsi="Calibri"/>
+        </w:rPr>
+        <w:t>Regeln</w:t>
+      </w:r>
+      <w:proofErr w:type="spellEnd"/>
+    </w:p>
+    <w:p>
+      <w:pPr>
+        <w:numPr>
+          <w:ilvl w:val="0"/>
+          <w:numId w:val="21"/>
+        </w:numPr>
+        <w:spacing w:after="80"/>
+        <w:ind w:hanging="271"/>
+        <w:rPr>
+          <w:lang w:val="de-DE"/>
+        </w:rPr>
+      </w:pPr>
+      <w:r>
+        <w:rPr>
+          <w:lang w:val="de-DE"/>
+        </w:rPr>
+        <w:t>Keine erfundenen Termine, Aufgaben, Arbeitszeiten, Beträge oder Quellen.</w:t>
+      </w:r>
+    </w:p>
+    <w:p>
+      <w:pPr>
+        <w:numPr>
+          <w:ilvl w:val="0"/>
+          <w:numId w:val="21"/>
+        </w:numPr>
+        <w:spacing w:after="80"/>
+        <w:ind w:hanging="271"/>
+        <w:rPr>
+          <w:lang w:val="de-DE"/>
+        </w:rPr>
+      </w:pPr>
+      <w:r>
+        <w:rPr>
+          <w:lang w:val="de-DE"/>
+        </w:rPr>
+        <w:t>Jede Empfehlung nennt die verwendeten Daten oder zeigt „keine ausreichenden Daten“.</w:t>
+      </w:r>
+    </w:p>
+    <w:p>
+      <w:pPr>
+        <w:numPr>
+          <w:ilvl w:val="0"/>
+          <w:numId w:val="21"/>
+        </w:numPr>
+        <w:spacing w:after="80"/>
+        <w:ind w:hanging="271"/>
+      </w:pPr>
+      <w:proofErr w:type="spellStart"/>
+      <w:r>
+        <w:t>Unsicherheit</w:t>
+      </w:r>
+      <w:proofErr w:type="spellEnd"/>
+      <w:r>
+        <w:t xml:space="preserve"> </w:t>
+      </w:r>
+      <w:proofErr w:type="spellStart"/>
+      <w:r>
+        <w:t>wird</w:t>
+      </w:r>
+      <w:proofErr w:type="spellEnd"/>
+      <w:r>
+        <w:t xml:space="preserve"> </w:t>
+      </w:r>
+      <w:proofErr w:type="spellStart"/>
+      <w:r>
+        <w:t>offen</w:t>
+      </w:r>
+      <w:proofErr w:type="spellEnd"/>
+      <w:r>
+        <w:t xml:space="preserve"> </w:t>
+      </w:r>
+      <w:proofErr w:type="spellStart"/>
+      <w:r>
+        <w:t>benannt</w:t>
+      </w:r>
+      <w:proofErr w:type="spellEnd"/>
+      <w:r>
         <w:t>.</w:t>
       </w:r>
     </w:p>
@@ -5177,476 +5745,66 @@
       <w:pPr>
         <w:numPr>
           <w:ilvl w:val="0"/>
-          <w:numId w:val="19"/>
-        </w:numPr>
-        <w:spacing w:after="80"/>
-        <w:ind w:hanging="271"/>
-        <w:rPr>
-          <w:lang w:val="de-DE"/>
-        </w:rPr>
-      </w:pPr>
-      <w:r>
-        <w:rPr>
-          <w:lang w:val="de-DE"/>
-        </w:rPr>
-        <w:t>Favoriten und zuletzt bearbeitete Inhalte.</w:t>
-      </w:r>
-    </w:p>
-    <w:p>
-      <w:pPr>
-        <w:numPr>
-          <w:ilvl w:val="0"/>
-          <w:numId w:val="19"/>
-        </w:numPr>
-        <w:spacing w:after="80"/>
-        <w:ind w:hanging="271"/>
-        <w:rPr>
-          <w:lang w:val="de-DE"/>
-        </w:rPr>
-      </w:pPr>
-      <w:r>
-        <w:rPr>
-          <w:lang w:val="de-DE"/>
-        </w:rPr>
-        <w:t>Quellenangaben und Versionierung wichtiger Notizen.</w:t>
-      </w:r>
-    </w:p>
-    <w:p>
-      <w:pPr>
-        <w:numPr>
-          <w:ilvl w:val="0"/>
-          <w:numId w:val="19"/>
-        </w:numPr>
-        <w:spacing w:after="80"/>
-        <w:ind w:hanging="271"/>
-        <w:rPr>
-          <w:lang w:val="de-DE"/>
-        </w:rPr>
-      </w:pPr>
-      <w:r>
-        <w:rPr>
-          <w:lang w:val="de-DE"/>
-        </w:rPr>
-        <w:t>KI-Zusammenfassung und Fragen zu freigegebenen Inhalten.</w:t>
+          <w:numId w:val="21"/>
+        </w:numPr>
+        <w:spacing w:after="80"/>
+        <w:ind w:hanging="271"/>
+        <w:rPr>
+          <w:lang w:val="de-DE"/>
+        </w:rPr>
+      </w:pPr>
+      <w:r>
+        <w:rPr>
+          <w:lang w:val="de-DE"/>
+        </w:rPr>
+        <w:t>Finanz-, Arbeits- und persönliche Daten werden nur mit expliziter Freigabe extern verarbeitet.</w:t>
+      </w:r>
+    </w:p>
+    <w:p>
+      <w:pPr>
+        <w:numPr>
+          <w:ilvl w:val="0"/>
+          <w:numId w:val="21"/>
+        </w:numPr>
+        <w:spacing w:after="80"/>
+        <w:ind w:hanging="271"/>
+        <w:rPr>
+          <w:lang w:val="de-DE"/>
+        </w:rPr>
+      </w:pPr>
+      <w:r>
+        <w:rPr>
+          <w:lang w:val="de-DE"/>
+        </w:rPr>
+        <w:t>Schreibende Aktionen benötigen eine Bestätigung.</w:t>
+      </w:r>
+    </w:p>
+    <w:p>
+      <w:pPr>
+        <w:numPr>
+          <w:ilvl w:val="0"/>
+          <w:numId w:val="21"/>
+        </w:numPr>
+        <w:spacing w:after="80"/>
+        <w:ind w:hanging="271"/>
+        <w:rPr>
+          <w:lang w:val="de-DE"/>
+        </w:rPr>
+      </w:pPr>
+      <w:r>
+        <w:rPr>
+          <w:lang w:val="de-DE"/>
+        </w:rPr>
+        <w:t>KI-Ausgaben werden als Vorschläge und nicht als verbindliche Entscheidungen gespeichert.</w:t>
       </w:r>
     </w:p>
     <w:p>
       <w:pPr>
         <w:pStyle w:val="Heading2"/>
-        <w:rPr>
-          <w:lang w:val="de-DE"/>
-        </w:rPr>
-      </w:pPr>
-      <w:r>
-        <w:rPr>
-          <w:rFonts w:ascii="Calibri" w:hAnsi="Calibri"/>
-          <w:lang w:val="de-DE"/>
-        </w:rPr>
-        <w:t>5.10 KI-Assistent</w:t>
-      </w:r>
-    </w:p>
-    <w:p>
-      <w:pPr>
-        <w:rPr>
-          <w:lang w:val="de-DE"/>
-        </w:rPr>
-      </w:pPr>
-      <w:r>
-        <w:rPr>
-          <w:lang w:val="de-DE"/>
-        </w:rPr>
-        <w:t>Der KI-Assistent ist eine Querschnittsfunktion und keine eigenständige Datenquelle.</w:t>
-      </w:r>
-    </w:p>
-    <w:p>
-      <w:pPr>
-        <w:pStyle w:val="Heading3"/>
-      </w:pPr>
-      <w:proofErr w:type="spellStart"/>
-      <w:r>
-        <w:rPr>
-          <w:rFonts w:ascii="Calibri" w:hAnsi="Calibri"/>
-        </w:rPr>
-        <w:t>Funktionen</w:t>
-      </w:r>
-      <w:proofErr w:type="spellEnd"/>
-    </w:p>
-    <w:p>
-      <w:pPr>
-        <w:numPr>
-          <w:ilvl w:val="0"/>
-          <w:numId w:val="20"/>
-        </w:numPr>
-        <w:spacing w:after="80"/>
-        <w:ind w:hanging="271"/>
-        <w:rPr>
-          <w:lang w:val="de-DE"/>
-        </w:rPr>
-      </w:pPr>
-      <w:r>
-        <w:rPr>
-          <w:lang w:val="de-DE"/>
-        </w:rPr>
-        <w:t>Tagesplanung aus vorhandenen Aufgaben, Terminen und Deadlines.</w:t>
-      </w:r>
-    </w:p>
-    <w:p>
-      <w:pPr>
-        <w:numPr>
-          <w:ilvl w:val="0"/>
-          <w:numId w:val="20"/>
-        </w:numPr>
-        <w:spacing w:after="80"/>
-        <w:ind w:hanging="271"/>
-      </w:pPr>
-      <w:proofErr w:type="spellStart"/>
-      <w:r>
-        <w:t>Wochenplanung</w:t>
-      </w:r>
-      <w:proofErr w:type="spellEnd"/>
-      <w:r>
-        <w:t xml:space="preserve"> </w:t>
-      </w:r>
-      <w:proofErr w:type="spellStart"/>
-      <w:r>
-        <w:t>mit</w:t>
-      </w:r>
-      <w:proofErr w:type="spellEnd"/>
-      <w:r>
-        <w:t xml:space="preserve"> </w:t>
-      </w:r>
-      <w:proofErr w:type="spellStart"/>
-      <w:r>
-        <w:t>verfügbaren</w:t>
-      </w:r>
-      <w:proofErr w:type="spellEnd"/>
-      <w:r>
-        <w:t xml:space="preserve"> </w:t>
-      </w:r>
-      <w:proofErr w:type="spellStart"/>
-      <w:r>
-        <w:t>Zeitblöcken</w:t>
-      </w:r>
-      <w:proofErr w:type="spellEnd"/>
-      <w:r>
-        <w:t>.</w:t>
-      </w:r>
-    </w:p>
-    <w:p>
-      <w:pPr>
-        <w:numPr>
-          <w:ilvl w:val="0"/>
-          <w:numId w:val="20"/>
-        </w:numPr>
-        <w:spacing w:after="80"/>
-        <w:ind w:hanging="271"/>
-      </w:pPr>
-      <w:proofErr w:type="spellStart"/>
-      <w:r>
-        <w:t>Priorisierung</w:t>
-      </w:r>
-      <w:proofErr w:type="spellEnd"/>
-      <w:r>
-        <w:t xml:space="preserve"> </w:t>
-      </w:r>
-      <w:proofErr w:type="spellStart"/>
-      <w:r>
-        <w:t>mit</w:t>
-      </w:r>
-      <w:proofErr w:type="spellEnd"/>
-      <w:r>
-        <w:t xml:space="preserve"> </w:t>
-      </w:r>
-      <w:proofErr w:type="spellStart"/>
-      <w:r>
-        <w:t>kurzer</w:t>
-      </w:r>
-      <w:proofErr w:type="spellEnd"/>
-      <w:r>
-        <w:t xml:space="preserve"> </w:t>
-      </w:r>
-      <w:proofErr w:type="spellStart"/>
-      <w:r>
-        <w:t>Begründung</w:t>
-      </w:r>
-      <w:proofErr w:type="spellEnd"/>
-      <w:r>
-        <w:t>.</w:t>
-      </w:r>
-    </w:p>
-    <w:p>
-      <w:pPr>
-        <w:numPr>
-          <w:ilvl w:val="0"/>
-          <w:numId w:val="20"/>
-        </w:numPr>
-        <w:spacing w:after="80"/>
-        <w:ind w:hanging="271"/>
-        <w:rPr>
-          <w:lang w:val="de-DE"/>
-        </w:rPr>
-      </w:pPr>
-      <w:r>
-        <w:rPr>
-          <w:lang w:val="de-DE"/>
-        </w:rPr>
-        <w:t>Zusammenfassungen von Tagesberichten, Lernnotizen und Projektständen.</w:t>
-      </w:r>
-    </w:p>
-    <w:p>
-      <w:pPr>
-        <w:numPr>
-          <w:ilvl w:val="0"/>
-          <w:numId w:val="20"/>
-        </w:numPr>
-        <w:spacing w:after="80"/>
-        <w:ind w:hanging="271"/>
-      </w:pPr>
-      <w:proofErr w:type="spellStart"/>
-      <w:r>
-        <w:t>Modulbezogener</w:t>
-      </w:r>
-      <w:proofErr w:type="spellEnd"/>
-      <w:r>
-        <w:t xml:space="preserve"> RAG-Chat.</w:t>
-      </w:r>
-    </w:p>
-    <w:p>
-      <w:pPr>
-        <w:numPr>
-          <w:ilvl w:val="0"/>
-          <w:numId w:val="20"/>
-        </w:numPr>
-        <w:spacing w:after="80"/>
-        <w:ind w:hanging="271"/>
-        <w:rPr>
-          <w:lang w:val="de-DE"/>
-        </w:rPr>
-      </w:pPr>
-      <w:r>
-        <w:rPr>
-          <w:lang w:val="de-DE"/>
-        </w:rPr>
-        <w:t>Fragen über freigegebene Wissens-, Studien- und Projektdaten.</w:t>
-      </w:r>
-    </w:p>
-    <w:p>
-      <w:pPr>
-        <w:numPr>
-          <w:ilvl w:val="0"/>
-          <w:numId w:val="20"/>
-        </w:numPr>
-        <w:spacing w:after="80"/>
-        <w:ind w:hanging="271"/>
-      </w:pPr>
-      <w:proofErr w:type="spellStart"/>
-      <w:r>
-        <w:t>Vorschläge</w:t>
-      </w:r>
-      <w:proofErr w:type="spellEnd"/>
-      <w:r>
-        <w:t xml:space="preserve"> für </w:t>
-      </w:r>
-      <w:proofErr w:type="spellStart"/>
-      <w:r>
-        <w:t>nächste</w:t>
-      </w:r>
-      <w:proofErr w:type="spellEnd"/>
-      <w:r>
-        <w:t xml:space="preserve"> </w:t>
-      </w:r>
-      <w:proofErr w:type="spellStart"/>
-      <w:r>
-        <w:t>Schritte</w:t>
-      </w:r>
-      <w:proofErr w:type="spellEnd"/>
-      <w:r>
-        <w:t>.</w:t>
-      </w:r>
-    </w:p>
-    <w:p>
-      <w:pPr>
-        <w:pStyle w:val="Heading3"/>
-      </w:pPr>
-      <w:proofErr w:type="spellStart"/>
-      <w:r>
-        <w:rPr>
-          <w:rFonts w:ascii="Calibri" w:hAnsi="Calibri"/>
-        </w:rPr>
-        <w:t>Verbindliche</w:t>
-      </w:r>
-      <w:proofErr w:type="spellEnd"/>
-      <w:r>
-        <w:rPr>
-          <w:rFonts w:ascii="Calibri" w:hAnsi="Calibri"/>
-        </w:rPr>
-        <w:t xml:space="preserve"> KI-</w:t>
-      </w:r>
-      <w:proofErr w:type="spellStart"/>
-      <w:r>
-        <w:rPr>
-          <w:rFonts w:ascii="Calibri" w:hAnsi="Calibri"/>
-        </w:rPr>
-        <w:t>Regeln</w:t>
-      </w:r>
-      <w:proofErr w:type="spellEnd"/>
-    </w:p>
-    <w:p>
-      <w:pPr>
-        <w:numPr>
-          <w:ilvl w:val="0"/>
-          <w:numId w:val="21"/>
-        </w:numPr>
-        <w:spacing w:after="80"/>
-        <w:ind w:hanging="271"/>
-        <w:rPr>
-          <w:lang w:val="de-DE"/>
-        </w:rPr>
-      </w:pPr>
-      <w:r>
-        <w:rPr>
-          <w:lang w:val="de-DE"/>
-        </w:rPr>
-        <w:t>Keine erfundenen Termine, Aufgaben, Arbeitszeiten, Beträge oder Quellen.</w:t>
-      </w:r>
-    </w:p>
-    <w:p>
-      <w:pPr>
-        <w:numPr>
-          <w:ilvl w:val="0"/>
-          <w:numId w:val="21"/>
-        </w:numPr>
-        <w:spacing w:after="80"/>
-        <w:ind w:hanging="271"/>
-        <w:rPr>
-          <w:lang w:val="de-DE"/>
-        </w:rPr>
-      </w:pPr>
-      <w:r>
-        <w:rPr>
-          <w:lang w:val="de-DE"/>
-        </w:rPr>
-        <w:t>Jede Empfehlung nennt die verwendeten Daten oder zeigt „keine ausreichenden Daten“.</w:t>
-      </w:r>
-    </w:p>
-    <w:p>
-      <w:pPr>
-        <w:numPr>
-          <w:ilvl w:val="0"/>
-          <w:numId w:val="21"/>
-        </w:numPr>
-        <w:spacing w:after="80"/>
-        <w:ind w:hanging="271"/>
-      </w:pPr>
-      <w:proofErr w:type="spellStart"/>
-      <w:r>
-        <w:t>Unsicherheit</w:t>
-      </w:r>
-      <w:proofErr w:type="spellEnd"/>
-      <w:r>
-        <w:t xml:space="preserve"> </w:t>
-      </w:r>
-      <w:proofErr w:type="spellStart"/>
-      <w:r>
-        <w:t>wird</w:t>
-      </w:r>
-      <w:proofErr w:type="spellEnd"/>
-      <w:r>
-        <w:t xml:space="preserve"> </w:t>
-      </w:r>
-      <w:proofErr w:type="spellStart"/>
-      <w:r>
-        <w:t>offen</w:t>
-      </w:r>
-      <w:proofErr w:type="spellEnd"/>
-      <w:r>
-        <w:t xml:space="preserve"> </w:t>
-      </w:r>
-      <w:proofErr w:type="spellStart"/>
-      <w:r>
-        <w:t>benannt</w:t>
-      </w:r>
-      <w:proofErr w:type="spellEnd"/>
-      <w:r>
-        <w:t>.</w:t>
-      </w:r>
-    </w:p>
-    <w:p>
-      <w:pPr>
-        <w:numPr>
-          <w:ilvl w:val="0"/>
-          <w:numId w:val="21"/>
-        </w:numPr>
-        <w:spacing w:after="80"/>
-        <w:ind w:hanging="271"/>
-        <w:rPr>
-          <w:lang w:val="de-DE"/>
-        </w:rPr>
-      </w:pPr>
-      <w:r>
-        <w:rPr>
-          <w:lang w:val="de-DE"/>
-        </w:rPr>
-        <w:t>Finanz-, Arbeits- und persönliche Daten werden nur mit expliziter Freigabe extern verarbeitet.</w:t>
-      </w:r>
-    </w:p>
-    <w:p>
-      <w:pPr>
-        <w:numPr>
-          <w:ilvl w:val="0"/>
-          <w:numId w:val="21"/>
-        </w:numPr>
-        <w:spacing w:after="80"/>
-        <w:ind w:hanging="271"/>
-        <w:rPr>
-          <w:lang w:val="de-DE"/>
-        </w:rPr>
-      </w:pPr>
-      <w:r>
-        <w:rPr>
-          <w:lang w:val="de-DE"/>
-        </w:rPr>
-        <w:t>Schreibende Aktionen benötigen eine Bestätigung.</w:t>
-      </w:r>
-    </w:p>
-    <w:p>
-      <w:pPr>
-        <w:numPr>
-          <w:ilvl w:val="0"/>
-          <w:numId w:val="21"/>
-        </w:numPr>
-        <w:spacing w:after="80"/>
-        <w:ind w:hanging="271"/>
-        <w:rPr>
-          <w:lang w:val="de-DE"/>
-        </w:rPr>
-      </w:pPr>
-      <w:r>
-        <w:rPr>
-          <w:lang w:val="de-DE"/>
-        </w:rPr>
-        <w:t>KI-Ausgaben werden als Vorschläge und nicht als verbindliche Entscheidungen gespeichert.</w:t>
-      </w:r>
-    </w:p>
-    <w:p>
-      <w:pPr>
-        <w:pStyle w:val="Heading2"/>
-      </w:pPr>
-      <w:r>
-        <w:rPr>
-          <w:rFonts w:ascii="Calibri" w:hAnsi="Calibri"/>
-        </w:rPr>
-        <w:lastRenderedPageBreak/>
-        <w:t xml:space="preserve">5.11 </w:t>
-      </w:r>
-      <w:proofErr w:type="spellStart"/>
-      <w:r>
-        <w:rPr>
-          <w:rFonts w:ascii="Calibri" w:hAnsi="Calibri"/>
-        </w:rPr>
-        <w:t>Einstellungen</w:t>
-      </w:r>
-      <w:proofErr w:type="spellEnd"/>
+      </w:pPr>
+      <w:r>
+        <w:t>5.12 Einstellungen</w:t>
+      </w:r>
     </w:p>
     <w:p>
       <w:pPr>
@@ -6702,6 +6860,94 @@
           <w:lang w:val="de-DE"/>
         </w:rPr>
         <w:t>Erst danach wird er gespeichert oder exportiert.</w:t>
+      </w:r>
+    </w:p>
+    <w:p>
+      <w:pPr>
+        <w:pStyle w:val="Heading2"/>
+      </w:pPr>
+      <w:r>
+        <w:t>6.6 Einkaufsliste per Sprache erfassen</w:t>
+      </w:r>
+    </w:p>
+    <w:p>
+      <w:pPr>
+        <w:numPr>
+          <w:ilvl w:val="0"/>
+          <w:numId w:val="51"/>
+        </w:numPr>
+        <w:spacing w:after="80"/>
+        <w:ind w:hanging="271"/>
+        <w:rPr>
+          <w:lang w:val="de-DE"/>
+        </w:rPr>
+      </w:pPr>
+      <w:r>
+        <w:t>Anton öffnet die aktive Einkaufsliste.</w:t>
+      </w:r>
+    </w:p>
+    <w:p>
+      <w:pPr>
+        <w:numPr>
+          <w:ilvl w:val="0"/>
+          <w:numId w:val="51"/>
+        </w:numPr>
+        <w:spacing w:after="80"/>
+        <w:ind w:hanging="271"/>
+        <w:rPr>
+          <w:lang w:val="de-DE"/>
+        </w:rPr>
+      </w:pPr>
+      <w:r>
+        <w:t>Er spricht oder schreibt zum Beispiel zwei Liter Milch, Käse, Hähnchenbrust, Chips und sechs Äpfel.</w:t>
+      </w:r>
+    </w:p>
+    <w:p>
+      <w:pPr>
+        <w:numPr>
+          <w:ilvl w:val="0"/>
+          <w:numId w:val="51"/>
+        </w:numPr>
+        <w:spacing w:after="80"/>
+        <w:ind w:hanging="271"/>
+        <w:rPr>
+          <w:lang w:val="de-DE"/>
+        </w:rPr>
+      </w:pPr>
+      <w:r>
+        <w:t>Das System zeigt einzelne Positionen mit Menge und vorgeschlagener Kategorie als bearbeitbare Vorschau.</w:t>
+      </w:r>
+    </w:p>
+    <w:p>
+      <w:pPr>
+        <w:numPr>
+          <w:ilvl w:val="0"/>
+          <w:numId w:val="51"/>
+        </w:numPr>
+        <w:spacing w:after="80"/>
+        <w:ind w:hanging="271"/>
+        <w:rPr>
+          <w:lang w:val="de-DE"/>
+        </w:rPr>
+      </w:pPr>
+      <w:r>
+        <w:t>Anton korrigiert bei Bedarf Bezeichnung, Menge oder Kategorie.</w:t>
+      </w:r>
+    </w:p>
+    <w:p>
+      <w:pPr>
+        <w:numPr>
+          <w:ilvl w:val="0"/>
+          <w:numId w:val="51"/>
+        </w:numPr>
+        <w:spacing w:after="80"/>
+        <w:ind w:hanging="271"/>
+        <w:rPr>
+          <w:lang w:val="de-DE"/>
+        </w:rPr>
+      </w:pPr>
+      <w:r>
+        <w:t>Erst nach seiner Bestätigung werden alle gültigen Positionen gemeinsam gespeichert und nach Kategorien gruppiert.</w:t>
       </w:r>
     </w:p>
     <w:p>
@@ -9782,6 +10028,94 @@
           </w:p>
         </w:tc>
       </w:tr>
+      <w:tr>
+        <w:tc>
+          <w:tcPr>
+            <w:tcW w:w="2200" w:type="dxa"/>
+          </w:tcPr>
+          <w:p>
+            <w:r>
+              <w:t>Einkaufsliste</w:t>
+            </w:r>
+          </w:p>
+        </w:tc>
+        <w:tc>
+          <w:tcPr>
+            <w:tcW w:w="7160" w:type="dxa"/>
+          </w:tcPr>
+          <w:p>
+            <w:r>
+              <w:t>id, nutzer_id, titel, status, archiviert_am, erstellt_am, aktualisiert_am</w:t>
+            </w:r>
+          </w:p>
+        </w:tc>
+      </w:tr>
+      <w:tr>
+        <w:tc>
+          <w:tcPr>
+            <w:tcW w:w="2200" w:type="dxa"/>
+          </w:tcPr>
+          <w:p>
+            <w:r>
+              <w:t>Einkaufsposition</w:t>
+            </w:r>
+          </w:p>
+        </w:tc>
+        <w:tc>
+          <w:tcPr>
+            <w:tcW w:w="7160" w:type="dxa"/>
+          </w:tcPr>
+          <w:p>
+            <w:r>
+              <w:t>id, einkaufsliste_id, nutzer_id, bezeichnung, menge, einheit, kategorie_id, status, quelle, sortierung</w:t>
+            </w:r>
+          </w:p>
+        </w:tc>
+      </w:tr>
+      <w:tr>
+        <w:tc>
+          <w:tcPr>
+            <w:tcW w:w="2200" w:type="dxa"/>
+          </w:tcPr>
+          <w:p>
+            <w:r>
+              <w:t>Einkaufskategorie</w:t>
+            </w:r>
+          </w:p>
+        </w:tc>
+        <w:tc>
+          <w:tcPr>
+            <w:tcW w:w="7160" w:type="dxa"/>
+          </w:tcPr>
+          <w:p>
+            <w:r>
+              <w:t>id, nutzer_id, name, sortierung, farbe, aktiv</w:t>
+            </w:r>
+          </w:p>
+        </w:tc>
+      </w:tr>
+      <w:tr>
+        <w:tc>
+          <w:tcPr>
+            <w:tcW w:w="2200" w:type="dxa"/>
+          </w:tcPr>
+          <w:p>
+            <w:r>
+              <w:t>Kategorisierungsregel</w:t>
+            </w:r>
+          </w:p>
+        </w:tc>
+        <w:tc>
+          <w:tcPr>
+            <w:tcW w:w="7160" w:type="dxa"/>
+          </w:tcPr>
+          <w:p>
+            <w:r>
+              <w:t>id, nutzer_id, normalisierter_begriff, kategorie_id, ursprung</w:t>
+            </w:r>
+          </w:p>
+        </w:tc>
+      </w:tr>
     </w:tbl>
     <w:p>
       <w:pPr>
@@ -9968,6 +10302,32 @@
           <w:lang w:val="de-DE"/>
         </w:rPr>
         <w:t>KI-Anfragen speichern Quellenverweise, aber keine unkontrollierten Schattenkopien sensibler Daten.</w:t>
+      </w:r>
+    </w:p>
+    <w:p>
+      <w:pPr>
+        <w:numPr>
+          <w:ilvl w:val="0"/>
+          <w:numId w:val="18"/>
+        </w:numPr>
+        <w:spacing w:after="80"/>
+        <w:ind w:hanging="271"/>
+      </w:pPr>
+      <w:r>
+        <w:t>Eine Einkaufsliste besitzt viele Einkaufspositionen; jede Position gehört genau einer Kategorie und demselben Besitzer wie die Liste.</w:t>
+      </w:r>
+    </w:p>
+    <w:p>
+      <w:pPr>
+        <w:numPr>
+          <w:ilvl w:val="0"/>
+          <w:numId w:val="18"/>
+        </w:numPr>
+        <w:spacing w:after="80"/>
+        <w:ind w:hanging="271"/>
+      </w:pPr>
+      <w:r>
+        <w:t>Persönliche Kategorisierungsregeln entstehen nur aus ausdrücklich bestätigten Korrekturen und verändern andere Module nicht automatisch.</w:t>
       </w:r>
     </w:p>
     <w:p>
@@ -11941,10 +12301,7 @@
         </w:rPr>
       </w:pPr>
       <w:r>
-        <w:rPr>
-          <w:lang w:val="de-DE"/>
-        </w:rPr>
-        <w:t>Sprachsteuerung und mobile native Apps.</w:t>
+        <w:t>Allgemeine Sprachsteuerung und mobile native Apps. Die geplante, eng begrenzte Spracheingabe für die Einkaufsliste ist eine spätere Erweiterung und keine allgemeine Sprachsteuerung.</w:t>
       </w:r>
     </w:p>
     <w:p>
@@ -12619,6 +12976,38 @@
           </w:p>
         </w:tc>
       </w:tr>
+      <w:tr>
+        <w:tc>
+          <w:tcPr>
+            <w:tcW w:w="2100" w:type="dxa"/>
+          </w:tcPr>
+          <w:p>
+            <w:r>
+              <w:t>1.1</w:t>
+            </w:r>
+          </w:p>
+        </w:tc>
+        <w:tc>
+          <w:tcPr>
+            <w:tcW w:w="2500" w:type="dxa"/>
+          </w:tcPr>
+          <w:p>
+            <w:r>
+              <w:t>Einkaufsliste und Spracheingabe</w:t>
+            </w:r>
+          </w:p>
+        </w:tc>
+        <w:tc>
+          <w:tcPr>
+            <w:tcW w:w="4760" w:type="dxa"/>
+          </w:tcPr>
+          <w:p>
+            <w:r>
+              <w:t>Bestätigte lokale Erfassung, Kategorisierung und optional nachgewiesene Mikrofoneingabe</w:t>
+            </w:r>
+          </w:p>
+        </w:tc>
+      </w:tr>
     </w:tbl>
     <w:p>
       <w:pPr>
@@ -13566,6 +13955,79 @@
         <w:pStyle w:val="Heading2"/>
       </w:pPr>
       <w:r>
+        <w:t>Einkaufsliste und Spracheingabe</w:t>
+      </w:r>
+    </w:p>
+    <w:p>
+      <w:pPr>
+        <w:numPr>
+          <w:ilvl w:val="0"/>
+          <w:numId w:val="18"/>
+        </w:numPr>
+        <w:spacing w:after="80"/>
+        <w:ind w:hanging="271"/>
+      </w:pPr>
+      <w:r>
+        <w:t>Mehrere geschriebene oder diktierte Lebensmittel erscheinen vor dem Speichern als einzelne bearbeitbare Vorschaupositionen.</w:t>
+      </w:r>
+    </w:p>
+    <w:p>
+      <w:pPr>
+        <w:numPr>
+          <w:ilvl w:val="0"/>
+          <w:numId w:val="18"/>
+        </w:numPr>
+        <w:spacing w:after="80"/>
+        <w:ind w:hanging="271"/>
+      </w:pPr>
+      <w:r>
+        <w:t>Käse wird nachvollziehbar Milchprodukte und Eiern, Chips werden Snacks und Süßem zugeordnet; unbekannte Begriffe bleiben sichtbar unter Sonstiges.</w:t>
+      </w:r>
+    </w:p>
+    <w:p>
+      <w:pPr>
+        <w:numPr>
+          <w:ilvl w:val="0"/>
+          <w:numId w:val="18"/>
+        </w:numPr>
+        <w:spacing w:after="80"/>
+        <w:ind w:hanging="271"/>
+      </w:pPr>
+      <w:r>
+        <w:t>Ohne ausdrückliche Bestätigung entsteht kein Einkaufsdatensatz; eine Bestätigung schreibt entweder alle gültigen Positionen oder keine.</w:t>
+      </w:r>
+    </w:p>
+    <w:p>
+      <w:pPr>
+        <w:numPr>
+          <w:ilvl w:val="0"/>
+          <w:numId w:val="18"/>
+        </w:numPr>
+        <w:spacing w:after="80"/>
+        <w:ind w:hanging="271"/>
+      </w:pPr>
+      <w:r>
+        <w:t>Der vollständige Textweg funktioniert auch bei verweigertem Mikrofonzugriff oder fehlender lokaler Spracherkennung.</w:t>
+      </w:r>
+    </w:p>
+    <w:p>
+      <w:pPr>
+        <w:numPr>
+          <w:ilvl w:val="0"/>
+          <w:numId w:val="18"/>
+        </w:numPr>
+        <w:spacing w:after="80"/>
+        <w:ind w:hanging="271"/>
+      </w:pPr>
+      <w:r>
+        <w:t>Audio wird weder gespeichert noch protokolliert oder an die LifeOS-API übertragen; ein eigener Mikrofonmodus besitzt keinen stillen Cloud-Rückfall.</w:t>
+      </w:r>
+    </w:p>
+    <w:p>
+      <w:pPr>
+        <w:pStyle w:val="Heading2"/>
+      </w:pPr>
+      <w:r>
         <w:rPr>
           <w:rFonts w:ascii="Calibri" w:hAnsi="Calibri"/>
         </w:rPr>
@@ -13993,6 +14455,32 @@
     </w:p>
     <w:p>
       <w:pPr>
+        <w:numPr>
+          <w:ilvl w:val="0"/>
+          <w:numId w:val="18"/>
+        </w:numPr>
+        <w:spacing w:after="80"/>
+        <w:ind w:hanging="271"/>
+      </w:pPr>
+      <w:r>
+        <w:t>Soll die erste Einkaufslisten-Version genau eine aktive Liste oder mehrere parallele aktive Listen unterstützen?</w:t>
+      </w:r>
+    </w:p>
+    <w:p>
+      <w:pPr>
+        <w:numPr>
+          <w:ilvl w:val="0"/>
+          <w:numId w:val="18"/>
+        </w:numPr>
+        <w:spacing w:after="80"/>
+        <w:ind w:hanging="271"/>
+      </w:pPr>
+      <w:r>
+        <w:t>Soll ein eigener Mikrofonmodus zuerst ausschließlich in der Mac-App angeboten werden, wenn dort lokale deutsche Erkennung zuverlässig nachgewiesen ist?</w:t>
+      </w:r>
+    </w:p>
+    <w:p>
+      <w:pPr>
         <w:rPr>
           <w:lang w:val="de-DE"/>
         </w:rPr>
@@ -14196,6 +14684,12 @@
     <w:p>
       <w:r>
         <w:t>Änderungsstand 07.09.2026: Der lokal erfolgreiche M6-Nachweis und der vollständige Sicherheits-, Integritäts- und Stabilitätsreview wurden ergänzt. Dazu gehören stärkere Passwortableitung, Sitzungs- und Login-Härtung, externe Netzwerk- und Backup-Grenzen, Dokumentintegrität, Browser-CSP, Sidecar-Isolation und Einzelinstanzschutz. Die öffentliche Produktfreigabe und ihre externen Apple- und Geräte-Gates bleiben ausdrücklich aufgeschoben.</w:t>
+      </w:r>
+    </w:p>
+    <w:p>
+      <w:pPr/>
+      <w:r>
+        <w:t>Änderungsstand 21.09.2026: Die geplante Einkaufsliste mit bestätigter regelbasierter Kategorisierung, Text- und Systemdiktat-Basispfad sowie einer nur nach lokalem Nachweis zulässigen Mikrofonoption wurde ergänzt. Die Erweiterung ist geplant, noch nicht implementiert und keine allgemeine Sprachsteuerung.</w:t>
       </w:r>
     </w:p>
     <w:p>
@@ -14931,6 +15425,12 @@
     </w:lvlOverride>
   </w:num>
   <w:num w:numId="50" w16cid:durableId="40248940">
+    <w:abstractNumId w:val="9"/>
+    <w:lvlOverride w:ilvl="0">
+      <w:startOverride w:val="1"/>
+    </w:lvlOverride>
+  </w:num>
+  <w:num w:numId="51" w16cid:durableId="310720333">
     <w:abstractNumId w:val="9"/>
     <w:lvlOverride w:ilvl="0">
       <w:startOverride w:val="1"/>

</xml_diff>

<commit_message>
docs(grocery): plan voice-assisted shopping lists (#111)
</commit_message>
<xml_diff>
--- a/LifeOS Leitfaden.docx
+++ b/LifeOS Leitfaden.docx
@@ -72,7 +72,7 @@
         </w:rPr>
       </w:pPr>
       <w:r>
-        <w:t>Stand: 07.09.2026</w:t>
+        <w:t>Stand: 21.09.2026</w:t>
       </w:r>
     </w:p>
     <w:p>
@@ -174,7 +174,7 @@
         </w:rPr>
       </w:pPr>
       <w:r>
-        <w:t>Stand: 07.09.2026</w:t>
+        <w:t>Stand: 21.09.2026</w:t>
       </w:r>
     </w:p>
     <w:p>
@@ -908,6 +908,19 @@
       </w:pPr>
       <w:r>
         <w:t>Fitness</w:t>
+      </w:r>
+    </w:p>
+    <w:p>
+      <w:pPr>
+        <w:numPr>
+          <w:ilvl w:val="0"/>
+          <w:numId w:val="1"/>
+        </w:numPr>
+        <w:spacing w:after="80"/>
+        <w:ind w:hanging="271"/>
+      </w:pPr>
+      <w:r>
+        <w:t>Einkauf</w:t>
       </w:r>
     </w:p>
     <w:p>
@@ -1602,6 +1615,38 @@
             <w:tcW w:w="2100" w:type="dxa"/>
           </w:tcPr>
           <w:p>
+            <w:r>
+              <w:t>Einkauf</w:t>
+            </w:r>
+          </w:p>
+        </w:tc>
+        <w:tc>
+          <w:tcPr>
+            <w:tcW w:w="2500" w:type="dxa"/>
+          </w:tcPr>
+          <w:p>
+            <w:r>
+              <w:t>Lebensmittel schnell erfassen und nach Kategorien einkaufen</w:t>
+            </w:r>
+          </w:p>
+        </w:tc>
+        <w:tc>
+          <w:tcPr>
+            <w:tcW w:w="4760" w:type="dxa"/>
+          </w:tcPr>
+          <w:p>
+            <w:r>
+              <w:t>Einstellungen, lokale Spracheingabe</w:t>
+            </w:r>
+          </w:p>
+        </w:tc>
+      </w:tr>
+      <w:tr>
+        <w:tc>
+          <w:tcPr>
+            <w:tcW w:w="2100" w:type="dxa"/>
+          </w:tcPr>
+          <w:p>
             <w:pPr>
               <w:spacing w:after="0"/>
             </w:pPr>
@@ -5030,30 +5075,357 @@
     <w:p>
       <w:pPr>
         <w:pStyle w:val="Heading2"/>
-        <w:rPr>
-          <w:lang w:val="de-DE"/>
-        </w:rPr>
-      </w:pPr>
+      </w:pPr>
+      <w:r>
+        <w:t>5.9 Einkaufsliste und Spracheingabe</w:t>
+      </w:r>
+    </w:p>
+    <w:p>
+      <w:pPr/>
+      <w:r>
+        <w:t>Die Einkaufsliste erfasst Lebensmittel lokal und gruppiert sie nach nachvollziehbaren Kategorien. Sprache ist eine zusätzliche Eingabemethode und keine allgemeine Sprachsteuerung.</w:t>
+      </w:r>
+    </w:p>
+    <w:p>
+      <w:pPr>
+        <w:pStyle w:val="Heading3"/>
+      </w:pPr>
+      <w:r>
+        <w:t>Funktionen</w:t>
+      </w:r>
+    </w:p>
+    <w:p>
+      <w:pPr>
+        <w:numPr>
+          <w:ilvl w:val="0"/>
+          <w:numId w:val="18"/>
+        </w:numPr>
+        <w:spacing w:after="80"/>
+        <w:ind w:hanging="271"/>
+      </w:pPr>
+      <w:r>
+        <w:t>Mehrere Lebensmittel als Text oder Diktat in einem Eingabefeld erfassen.</w:t>
+      </w:r>
+    </w:p>
+    <w:p>
+      <w:pPr>
+        <w:numPr>
+          <w:ilvl w:val="0"/>
+          <w:numId w:val="18"/>
+        </w:numPr>
+        <w:spacing w:after="80"/>
+        <w:ind w:hanging="271"/>
+      </w:pPr>
+      <w:r>
+        <w:t>Einträge in einer bearbeitbaren Vorschau trennen und Mengen sowie Einheiten soweit eindeutig erkennen.</w:t>
+      </w:r>
+    </w:p>
+    <w:p>
+      <w:pPr>
+        <w:numPr>
+          <w:ilvl w:val="0"/>
+          <w:numId w:val="18"/>
+        </w:numPr>
+        <w:spacing w:after="80"/>
+        <w:ind w:hanging="271"/>
+      </w:pPr>
+      <w:r>
+        <w:t>Produkte über lokale, versionierte Regeln Kategorien wie Obst und Gemüse, Milchprodukte und Eier, Fleisch und Fisch, Getränke, Snacks und Sonstiges zuordnen.</w:t>
+      </w:r>
+    </w:p>
+    <w:p>
+      <w:pPr>
+        <w:numPr>
+          <w:ilvl w:val="0"/>
+          <w:numId w:val="18"/>
+        </w:numPr>
+        <w:spacing w:after="80"/>
+        <w:ind w:hanging="271"/>
+      </w:pPr>
+      <w:r>
+        <w:t>Unbekannte oder mehrdeutige Begriffe sichtbar unter Sonstiges einordnen und manuell korrigierbar halten.</w:t>
+      </w:r>
+    </w:p>
+    <w:p>
+      <w:pPr>
+        <w:numPr>
+          <w:ilvl w:val="0"/>
+          <w:numId w:val="18"/>
+        </w:numPr>
+        <w:spacing w:after="80"/>
+        <w:ind w:hanging="271"/>
+      </w:pPr>
+      <w:r>
+        <w:t>Erst nach ausdrücklicher Bestätigung alle Positionen atomar in die aktive Einkaufsliste übernehmen.</w:t>
+      </w:r>
+    </w:p>
+    <w:p>
+      <w:pPr>
+        <w:numPr>
+          <w:ilvl w:val="0"/>
+          <w:numId w:val="18"/>
+        </w:numPr>
+        <w:spacing w:after="80"/>
+        <w:ind w:hanging="271"/>
+      </w:pPr>
+      <w:r>
+        <w:t>Offene und erledigte Positionen untereinander nach Kategorie gruppieren, bearbeiten, abhaken, wieder öffnen und archivieren.</w:t>
+      </w:r>
+    </w:p>
+    <w:p>
+      <w:pPr>
+        <w:pStyle w:val="Heading3"/>
+      </w:pPr>
+      <w:r>
+        <w:t>Regeln</w:t>
+      </w:r>
+    </w:p>
+    <w:p>
+      <w:pPr>
+        <w:numPr>
+          <w:ilvl w:val="0"/>
+          <w:numId w:val="18"/>
+        </w:numPr>
+        <w:spacing w:after="80"/>
+        <w:ind w:hanging="271"/>
+      </w:pPr>
+      <w:r>
+        <w:t>LifeOS speichert und protokolliert kein Audio. Ein eigener Mikrofonmodus ist nur zulässig, wenn die konkrete Plattform lokale deutsche Spracherkennung erzwingen kann; andernfalls bleiben Text und Systemdiktat verfügbar.</w:t>
+      </w:r>
+    </w:p>
+    <w:p>
+      <w:pPr>
+        <w:numPr>
+          <w:ilvl w:val="0"/>
+          <w:numId w:val="18"/>
+        </w:numPr>
+        <w:spacing w:after="80"/>
+        <w:ind w:hanging="271"/>
+      </w:pPr>
+      <w:r>
+        <w:t>Die Funktion erstellt keine Ernährungs-, Gesundheits- oder Kaufempfehlung und verändert keine Fitness-, Finanz-, Aufgaben- oder Kalenderdaten automatisch.</w:t>
+      </w:r>
+    </w:p>
+    <w:p>
+      <w:pPr>
+        <w:pStyle w:val="Heading2"/>
+        <w:rPr>
+          <w:lang w:val="de-DE"/>
+        </w:rPr>
+      </w:pPr>
+      <w:r>
+        <w:t>5.10 Wissen</w:t>
+      </w:r>
+    </w:p>
+    <w:p>
+      <w:pPr>
+        <w:rPr>
+          <w:lang w:val="de-DE"/>
+        </w:rPr>
+      </w:pPr>
+      <w:r>
+        <w:rPr>
+          <w:lang w:val="de-DE"/>
+        </w:rPr>
+        <w:t>Das Wissensmodul ist eine persönliche, durchsuchbare Ablage für Notizen und Dokumente.</w:t>
+      </w:r>
+    </w:p>
+    <w:p>
+      <w:pPr>
+        <w:pStyle w:val="Heading3"/>
+      </w:pPr>
+      <w:proofErr w:type="spellStart"/>
       <w:r>
         <w:rPr>
           <w:rFonts w:ascii="Calibri" w:hAnsi="Calibri"/>
-          <w:lang w:val="de-DE"/>
-        </w:rPr>
-        <w:lastRenderedPageBreak/>
-        <w:t>5.9 Wissen</w:t>
-      </w:r>
-    </w:p>
-    <w:p>
-      <w:pPr>
-        <w:rPr>
-          <w:lang w:val="de-DE"/>
-        </w:rPr>
-      </w:pPr>
-      <w:r>
-        <w:rPr>
-          <w:lang w:val="de-DE"/>
-        </w:rPr>
-        <w:t>Das Wissensmodul ist eine persönliche, durchsuchbare Ablage für Notizen und Dokumente.</w:t>
+        </w:rPr>
+        <w:t>Funktionen</w:t>
+      </w:r>
+      <w:proofErr w:type="spellEnd"/>
+    </w:p>
+    <w:p>
+      <w:pPr>
+        <w:numPr>
+          <w:ilvl w:val="0"/>
+          <w:numId w:val="19"/>
+        </w:numPr>
+        <w:spacing w:after="80"/>
+        <w:ind w:hanging="271"/>
+      </w:pPr>
+      <w:proofErr w:type="spellStart"/>
+      <w:r>
+        <w:t>Notizen</w:t>
+      </w:r>
+      <w:proofErr w:type="spellEnd"/>
+      <w:r>
+        <w:t xml:space="preserve"> </w:t>
+      </w:r>
+      <w:proofErr w:type="spellStart"/>
+      <w:r>
+        <w:t>mit</w:t>
+      </w:r>
+      <w:proofErr w:type="spellEnd"/>
+      <w:r>
+        <w:t xml:space="preserve"> Markdown </w:t>
+      </w:r>
+      <w:proofErr w:type="spellStart"/>
+      <w:r>
+        <w:t>oder</w:t>
+      </w:r>
+      <w:proofErr w:type="spellEnd"/>
+      <w:r>
+        <w:t xml:space="preserve"> Rich Text.</w:t>
+      </w:r>
+    </w:p>
+    <w:p>
+      <w:pPr>
+        <w:numPr>
+          <w:ilvl w:val="0"/>
+          <w:numId w:val="19"/>
+        </w:numPr>
+        <w:spacing w:after="80"/>
+        <w:ind w:hanging="271"/>
+      </w:pPr>
+      <w:proofErr w:type="spellStart"/>
+      <w:r>
+        <w:t>Dokumente</w:t>
+      </w:r>
+      <w:proofErr w:type="spellEnd"/>
+      <w:r>
+        <w:t xml:space="preserve"> und </w:t>
+      </w:r>
+      <w:proofErr w:type="spellStart"/>
+      <w:r>
+        <w:t>Anhänge</w:t>
+      </w:r>
+      <w:proofErr w:type="spellEnd"/>
+      <w:r>
+        <w:t>.</w:t>
+      </w:r>
+    </w:p>
+    <w:p>
+      <w:pPr>
+        <w:numPr>
+          <w:ilvl w:val="0"/>
+          <w:numId w:val="19"/>
+        </w:numPr>
+        <w:spacing w:after="80"/>
+        <w:ind w:hanging="271"/>
+      </w:pPr>
+      <w:proofErr w:type="spellStart"/>
+      <w:r>
+        <w:t>Kategorien</w:t>
+      </w:r>
+      <w:proofErr w:type="spellEnd"/>
+      <w:r>
+        <w:t xml:space="preserve">, Tags und </w:t>
+      </w:r>
+      <w:proofErr w:type="spellStart"/>
+      <w:r>
+        <w:t>Verknüpfungen</w:t>
+      </w:r>
+      <w:proofErr w:type="spellEnd"/>
+      <w:r>
+        <w:t>.</w:t>
+      </w:r>
+    </w:p>
+    <w:p>
+      <w:pPr>
+        <w:numPr>
+          <w:ilvl w:val="0"/>
+          <w:numId w:val="19"/>
+        </w:numPr>
+        <w:spacing w:after="80"/>
+        <w:ind w:hanging="271"/>
+      </w:pPr>
+      <w:proofErr w:type="spellStart"/>
+      <w:r>
+        <w:t>Volltextsuche</w:t>
+      </w:r>
+      <w:proofErr w:type="spellEnd"/>
+      <w:r>
+        <w:t>.</w:t>
+      </w:r>
+    </w:p>
+    <w:p>
+      <w:pPr>
+        <w:numPr>
+          <w:ilvl w:val="0"/>
+          <w:numId w:val="19"/>
+        </w:numPr>
+        <w:spacing w:after="80"/>
+        <w:ind w:hanging="271"/>
+        <w:rPr>
+          <w:lang w:val="de-DE"/>
+        </w:rPr>
+      </w:pPr>
+      <w:r>
+        <w:rPr>
+          <w:lang w:val="de-DE"/>
+        </w:rPr>
+        <w:t>Favoriten und zuletzt bearbeitete Inhalte.</w:t>
+      </w:r>
+    </w:p>
+    <w:p>
+      <w:pPr>
+        <w:numPr>
+          <w:ilvl w:val="0"/>
+          <w:numId w:val="19"/>
+        </w:numPr>
+        <w:spacing w:after="80"/>
+        <w:ind w:hanging="271"/>
+        <w:rPr>
+          <w:lang w:val="de-DE"/>
+        </w:rPr>
+      </w:pPr>
+      <w:r>
+        <w:rPr>
+          <w:lang w:val="de-DE"/>
+        </w:rPr>
+        <w:t>Quellenangaben und Versionierung wichtiger Notizen.</w:t>
+      </w:r>
+    </w:p>
+    <w:p>
+      <w:pPr>
+        <w:numPr>
+          <w:ilvl w:val="0"/>
+          <w:numId w:val="19"/>
+        </w:numPr>
+        <w:spacing w:after="80"/>
+        <w:ind w:hanging="271"/>
+        <w:rPr>
+          <w:lang w:val="de-DE"/>
+        </w:rPr>
+      </w:pPr>
+      <w:r>
+        <w:rPr>
+          <w:lang w:val="de-DE"/>
+        </w:rPr>
+        <w:t>KI-Zusammenfassung und Fragen zu freigegebenen Inhalten.</w:t>
+      </w:r>
+    </w:p>
+    <w:p>
+      <w:pPr>
+        <w:pStyle w:val="Heading2"/>
+        <w:rPr>
+          <w:lang w:val="de-DE"/>
+        </w:rPr>
+      </w:pPr>
+      <w:r>
+        <w:t>5.11 KI-Assistent</w:t>
+      </w:r>
+    </w:p>
+    <w:p>
+      <w:pPr>
+        <w:rPr>
+          <w:lang w:val="de-DE"/>
+        </w:rPr>
+      </w:pPr>
+      <w:r>
+        <w:rPr>
+          <w:lang w:val="de-DE"/>
+        </w:rPr>
+        <w:t>Der KI-Assistent ist eine Querschnittsfunktion und keine eigenständige Datenquelle.</w:t>
       </w:r>
     </w:p>
     <w:p>
@@ -5073,14 +5445,33 @@
       <w:pPr>
         <w:numPr>
           <w:ilvl w:val="0"/>
-          <w:numId w:val="19"/>
+          <w:numId w:val="20"/>
+        </w:numPr>
+        <w:spacing w:after="80"/>
+        <w:ind w:hanging="271"/>
+        <w:rPr>
+          <w:lang w:val="de-DE"/>
+        </w:rPr>
+      </w:pPr>
+      <w:r>
+        <w:rPr>
+          <w:lang w:val="de-DE"/>
+        </w:rPr>
+        <w:t>Tagesplanung aus vorhandenen Aufgaben, Terminen und Deadlines.</w:t>
+      </w:r>
+    </w:p>
+    <w:p>
+      <w:pPr>
+        <w:numPr>
+          <w:ilvl w:val="0"/>
+          <w:numId w:val="20"/>
         </w:numPr>
         <w:spacing w:after="80"/>
         <w:ind w:hanging="271"/>
       </w:pPr>
       <w:proofErr w:type="spellStart"/>
       <w:r>
-        <w:t>Notizen</w:t>
+        <w:t>Wochenplanung</w:t>
       </w:r>
       <w:proofErr w:type="spellEnd"/>
       <w:r>
@@ -5092,40 +5483,64 @@
       </w:r>
       <w:proofErr w:type="spellEnd"/>
       <w:r>
-        <w:t xml:space="preserve"> Markdown </w:t>
+        <w:t xml:space="preserve"> </w:t>
       </w:r>
       <w:proofErr w:type="spellStart"/>
       <w:r>
-        <w:t>oder</w:t>
+        <w:t>verfügbaren</w:t>
       </w:r>
       <w:proofErr w:type="spellEnd"/>
       <w:r>
-        <w:t xml:space="preserve"> Rich Text.</w:t>
-      </w:r>
-    </w:p>
-    <w:p>
-      <w:pPr>
-        <w:numPr>
-          <w:ilvl w:val="0"/>
-          <w:numId w:val="19"/>
-        </w:numPr>
-        <w:spacing w:after="80"/>
-        <w:ind w:hanging="271"/>
-      </w:pPr>
+        <w:t xml:space="preserve"> </w:t>
+      </w:r>
       <w:proofErr w:type="spellStart"/>
       <w:r>
-        <w:t>Dokumente</w:t>
+        <w:t>Zeitblöcken</w:t>
       </w:r>
       <w:proofErr w:type="spellEnd"/>
       <w:r>
-        <w:t xml:space="preserve"> und </w:t>
-      </w:r>
+        <w:t>.</w:t>
+      </w:r>
+    </w:p>
+    <w:p>
+      <w:pPr>
+        <w:numPr>
+          <w:ilvl w:val="0"/>
+          <w:numId w:val="20"/>
+        </w:numPr>
+        <w:spacing w:after="80"/>
+        <w:ind w:hanging="271"/>
+      </w:pPr>
       <w:proofErr w:type="spellStart"/>
       <w:r>
-        <w:t>Anhänge</w:t>
+        <w:t>Priorisierung</w:t>
       </w:r>
       <w:proofErr w:type="spellEnd"/>
       <w:r>
+        <w:t xml:space="preserve"> </w:t>
+      </w:r>
+      <w:proofErr w:type="spellStart"/>
+      <w:r>
+        <w:t>mit</w:t>
+      </w:r>
+      <w:proofErr w:type="spellEnd"/>
+      <w:r>
+        <w:t xml:space="preserve"> </w:t>
+      </w:r>
+      <w:proofErr w:type="spellStart"/>
+      <w:r>
+        <w:t>kurzer</w:t>
+      </w:r>
+      <w:proofErr w:type="spellEnd"/>
+      <w:r>
+        <w:t xml:space="preserve"> </w:t>
+      </w:r>
+      <w:proofErr w:type="spellStart"/>
+      <w:r>
+        <w:t>Begründung</w:t>
+      </w:r>
+      <w:proofErr w:type="spellEnd"/>
+      <w:r>
         <w:t>.</w:t>
       </w:r>
     </w:p>
@@ -5133,43 +5548,196 @@
       <w:pPr>
         <w:numPr>
           <w:ilvl w:val="0"/>
-          <w:numId w:val="19"/>
+          <w:numId w:val="20"/>
+        </w:numPr>
+        <w:spacing w:after="80"/>
+        <w:ind w:hanging="271"/>
+        <w:rPr>
+          <w:lang w:val="de-DE"/>
+        </w:rPr>
+      </w:pPr>
+      <w:r>
+        <w:rPr>
+          <w:lang w:val="de-DE"/>
+        </w:rPr>
+        <w:t>Zusammenfassungen von Tagesberichten, Lernnotizen und Projektständen.</w:t>
+      </w:r>
+    </w:p>
+    <w:p>
+      <w:pPr>
+        <w:numPr>
+          <w:ilvl w:val="0"/>
+          <w:numId w:val="20"/>
         </w:numPr>
         <w:spacing w:after="80"/>
         <w:ind w:hanging="271"/>
       </w:pPr>
       <w:proofErr w:type="spellStart"/>
       <w:r>
-        <w:t>Kategorien</w:t>
+        <w:t>Modulbezogener</w:t>
       </w:r>
       <w:proofErr w:type="spellEnd"/>
       <w:r>
-        <w:t xml:space="preserve">, Tags und </w:t>
-      </w:r>
+        <w:t xml:space="preserve"> RAG-Chat.</w:t>
+      </w:r>
+    </w:p>
+    <w:p>
+      <w:pPr>
+        <w:numPr>
+          <w:ilvl w:val="0"/>
+          <w:numId w:val="20"/>
+        </w:numPr>
+        <w:spacing w:after="80"/>
+        <w:ind w:hanging="271"/>
+        <w:rPr>
+          <w:lang w:val="de-DE"/>
+        </w:rPr>
+      </w:pPr>
+      <w:r>
+        <w:rPr>
+          <w:lang w:val="de-DE"/>
+        </w:rPr>
+        <w:t>Fragen über freigegebene Wissens-, Studien- und Projektdaten.</w:t>
+      </w:r>
+    </w:p>
+    <w:p>
+      <w:pPr>
+        <w:numPr>
+          <w:ilvl w:val="0"/>
+          <w:numId w:val="20"/>
+        </w:numPr>
+        <w:spacing w:after="80"/>
+        <w:ind w:hanging="271"/>
+      </w:pPr>
       <w:proofErr w:type="spellStart"/>
       <w:r>
-        <w:t>Verknüpfungen</w:t>
+        <w:t>Vorschläge</w:t>
       </w:r>
       <w:proofErr w:type="spellEnd"/>
       <w:r>
+        <w:t xml:space="preserve"> für </w:t>
+      </w:r>
+      <w:proofErr w:type="spellStart"/>
+      <w:r>
+        <w:t>nächste</w:t>
+      </w:r>
+      <w:proofErr w:type="spellEnd"/>
+      <w:r>
+        <w:t xml:space="preserve"> </w:t>
+      </w:r>
+      <w:proofErr w:type="spellStart"/>
+      <w:r>
+        <w:t>Schritte</w:t>
+      </w:r>
+      <w:proofErr w:type="spellEnd"/>
+      <w:r>
         <w:t>.</w:t>
       </w:r>
     </w:p>
     <w:p>
       <w:pPr>
-        <w:numPr>
-          <w:ilvl w:val="0"/>
-          <w:numId w:val="19"/>
-        </w:numPr>
-        <w:spacing w:after="80"/>
-        <w:ind w:hanging="271"/>
+        <w:pStyle w:val="Heading3"/>
       </w:pPr>
       <w:proofErr w:type="spellStart"/>
       <w:r>
-        <w:t>Volltextsuche</w:t>
+        <w:rPr>
+          <w:rFonts w:ascii="Calibri" w:hAnsi="Calibri"/>
+        </w:rPr>
+        <w:t>Verbindliche</w:t>
       </w:r>
       <w:proofErr w:type="spellEnd"/>
       <w:r>
+        <w:rPr>
+          <w:rFonts w:ascii="Calibri" w:hAnsi="Calibri"/>
+        </w:rPr>
+        <w:t xml:space="preserve"> KI-</w:t>
+      </w:r>
+      <w:proofErr w:type="spellStart"/>
+      <w:r>
+        <w:rPr>
+          <w:rFonts w:ascii="Calibri" w:hAnsi="Calibri"/>
+        </w:rPr>
+        <w:t>Regeln</w:t>
+      </w:r>
+      <w:proofErr w:type="spellEnd"/>
+    </w:p>
+    <w:p>
+      <w:pPr>
+        <w:numPr>
+          <w:ilvl w:val="0"/>
+          <w:numId w:val="21"/>
+        </w:numPr>
+        <w:spacing w:after="80"/>
+        <w:ind w:hanging="271"/>
+        <w:rPr>
+          <w:lang w:val="de-DE"/>
+        </w:rPr>
+      </w:pPr>
+      <w:r>
+        <w:rPr>
+          <w:lang w:val="de-DE"/>
+        </w:rPr>
+        <w:t>Keine erfundenen Termine, Aufgaben, Arbeitszeiten, Beträge oder Quellen.</w:t>
+      </w:r>
+    </w:p>
+    <w:p>
+      <w:pPr>
+        <w:numPr>
+          <w:ilvl w:val="0"/>
+          <w:numId w:val="21"/>
+        </w:numPr>
+        <w:spacing w:after="80"/>
+        <w:ind w:hanging="271"/>
+        <w:rPr>
+          <w:lang w:val="de-DE"/>
+        </w:rPr>
+      </w:pPr>
+      <w:r>
+        <w:rPr>
+          <w:lang w:val="de-DE"/>
+        </w:rPr>
+        <w:t>Jede Empfehlung nennt die verwendeten Daten oder zeigt „keine ausreichenden Daten“.</w:t>
+      </w:r>
+    </w:p>
+    <w:p>
+      <w:pPr>
+        <w:numPr>
+          <w:ilvl w:val="0"/>
+          <w:numId w:val="21"/>
+        </w:numPr>
+        <w:spacing w:after="80"/>
+        <w:ind w:hanging="271"/>
+      </w:pPr>
+      <w:proofErr w:type="spellStart"/>
+      <w:r>
+        <w:t>Unsicherheit</w:t>
+      </w:r>
+      <w:proofErr w:type="spellEnd"/>
+      <w:r>
+        <w:t xml:space="preserve"> </w:t>
+      </w:r>
+      <w:proofErr w:type="spellStart"/>
+      <w:r>
+        <w:t>wird</w:t>
+      </w:r>
+      <w:proofErr w:type="spellEnd"/>
+      <w:r>
+        <w:t xml:space="preserve"> </w:t>
+      </w:r>
+      <w:proofErr w:type="spellStart"/>
+      <w:r>
+        <w:t>offen</w:t>
+      </w:r>
+      <w:proofErr w:type="spellEnd"/>
+      <w:r>
+        <w:t xml:space="preserve"> </w:t>
+      </w:r>
+      <w:proofErr w:type="spellStart"/>
+      <w:r>
+        <w:t>benannt</w:t>
+      </w:r>
+      <w:proofErr w:type="spellEnd"/>
+      <w:r>
         <w:t>.</w:t>
       </w:r>
     </w:p>
@@ -5177,476 +5745,66 @@
       <w:pPr>
         <w:numPr>
           <w:ilvl w:val="0"/>
-          <w:numId w:val="19"/>
-        </w:numPr>
-        <w:spacing w:after="80"/>
-        <w:ind w:hanging="271"/>
-        <w:rPr>
-          <w:lang w:val="de-DE"/>
-        </w:rPr>
-      </w:pPr>
-      <w:r>
-        <w:rPr>
-          <w:lang w:val="de-DE"/>
-        </w:rPr>
-        <w:t>Favoriten und zuletzt bearbeitete Inhalte.</w:t>
-      </w:r>
-    </w:p>
-    <w:p>
-      <w:pPr>
-        <w:numPr>
-          <w:ilvl w:val="0"/>
-          <w:numId w:val="19"/>
-        </w:numPr>
-        <w:spacing w:after="80"/>
-        <w:ind w:hanging="271"/>
-        <w:rPr>
-          <w:lang w:val="de-DE"/>
-        </w:rPr>
-      </w:pPr>
-      <w:r>
-        <w:rPr>
-          <w:lang w:val="de-DE"/>
-        </w:rPr>
-        <w:t>Quellenangaben und Versionierung wichtiger Notizen.</w:t>
-      </w:r>
-    </w:p>
-    <w:p>
-      <w:pPr>
-        <w:numPr>
-          <w:ilvl w:val="0"/>
-          <w:numId w:val="19"/>
-        </w:numPr>
-        <w:spacing w:after="80"/>
-        <w:ind w:hanging="271"/>
-        <w:rPr>
-          <w:lang w:val="de-DE"/>
-        </w:rPr>
-      </w:pPr>
-      <w:r>
-        <w:rPr>
-          <w:lang w:val="de-DE"/>
-        </w:rPr>
-        <w:t>KI-Zusammenfassung und Fragen zu freigegebenen Inhalten.</w:t>
+          <w:numId w:val="21"/>
+        </w:numPr>
+        <w:spacing w:after="80"/>
+        <w:ind w:hanging="271"/>
+        <w:rPr>
+          <w:lang w:val="de-DE"/>
+        </w:rPr>
+      </w:pPr>
+      <w:r>
+        <w:rPr>
+          <w:lang w:val="de-DE"/>
+        </w:rPr>
+        <w:t>Finanz-, Arbeits- und persönliche Daten werden nur mit expliziter Freigabe extern verarbeitet.</w:t>
+      </w:r>
+    </w:p>
+    <w:p>
+      <w:pPr>
+        <w:numPr>
+          <w:ilvl w:val="0"/>
+          <w:numId w:val="21"/>
+        </w:numPr>
+        <w:spacing w:after="80"/>
+        <w:ind w:hanging="271"/>
+        <w:rPr>
+          <w:lang w:val="de-DE"/>
+        </w:rPr>
+      </w:pPr>
+      <w:r>
+        <w:rPr>
+          <w:lang w:val="de-DE"/>
+        </w:rPr>
+        <w:t>Schreibende Aktionen benötigen eine Bestätigung.</w:t>
+      </w:r>
+    </w:p>
+    <w:p>
+      <w:pPr>
+        <w:numPr>
+          <w:ilvl w:val="0"/>
+          <w:numId w:val="21"/>
+        </w:numPr>
+        <w:spacing w:after="80"/>
+        <w:ind w:hanging="271"/>
+        <w:rPr>
+          <w:lang w:val="de-DE"/>
+        </w:rPr>
+      </w:pPr>
+      <w:r>
+        <w:rPr>
+          <w:lang w:val="de-DE"/>
+        </w:rPr>
+        <w:t>KI-Ausgaben werden als Vorschläge und nicht als verbindliche Entscheidungen gespeichert.</w:t>
       </w:r>
     </w:p>
     <w:p>
       <w:pPr>
         <w:pStyle w:val="Heading2"/>
-        <w:rPr>
-          <w:lang w:val="de-DE"/>
-        </w:rPr>
-      </w:pPr>
-      <w:r>
-        <w:rPr>
-          <w:rFonts w:ascii="Calibri" w:hAnsi="Calibri"/>
-          <w:lang w:val="de-DE"/>
-        </w:rPr>
-        <w:t>5.10 KI-Assistent</w:t>
-      </w:r>
-    </w:p>
-    <w:p>
-      <w:pPr>
-        <w:rPr>
-          <w:lang w:val="de-DE"/>
-        </w:rPr>
-      </w:pPr>
-      <w:r>
-        <w:rPr>
-          <w:lang w:val="de-DE"/>
-        </w:rPr>
-        <w:t>Der KI-Assistent ist eine Querschnittsfunktion und keine eigenständige Datenquelle.</w:t>
-      </w:r>
-    </w:p>
-    <w:p>
-      <w:pPr>
-        <w:pStyle w:val="Heading3"/>
-      </w:pPr>
-      <w:proofErr w:type="spellStart"/>
-      <w:r>
-        <w:rPr>
-          <w:rFonts w:ascii="Calibri" w:hAnsi="Calibri"/>
-        </w:rPr>
-        <w:t>Funktionen</w:t>
-      </w:r>
-      <w:proofErr w:type="spellEnd"/>
-    </w:p>
-    <w:p>
-      <w:pPr>
-        <w:numPr>
-          <w:ilvl w:val="0"/>
-          <w:numId w:val="20"/>
-        </w:numPr>
-        <w:spacing w:after="80"/>
-        <w:ind w:hanging="271"/>
-        <w:rPr>
-          <w:lang w:val="de-DE"/>
-        </w:rPr>
-      </w:pPr>
-      <w:r>
-        <w:rPr>
-          <w:lang w:val="de-DE"/>
-        </w:rPr>
-        <w:t>Tagesplanung aus vorhandenen Aufgaben, Terminen und Deadlines.</w:t>
-      </w:r>
-    </w:p>
-    <w:p>
-      <w:pPr>
-        <w:numPr>
-          <w:ilvl w:val="0"/>
-          <w:numId w:val="20"/>
-        </w:numPr>
-        <w:spacing w:after="80"/>
-        <w:ind w:hanging="271"/>
-      </w:pPr>
-      <w:proofErr w:type="spellStart"/>
-      <w:r>
-        <w:t>Wochenplanung</w:t>
-      </w:r>
-      <w:proofErr w:type="spellEnd"/>
-      <w:r>
-        <w:t xml:space="preserve"> </w:t>
-      </w:r>
-      <w:proofErr w:type="spellStart"/>
-      <w:r>
-        <w:t>mit</w:t>
-      </w:r>
-      <w:proofErr w:type="spellEnd"/>
-      <w:r>
-        <w:t xml:space="preserve"> </w:t>
-      </w:r>
-      <w:proofErr w:type="spellStart"/>
-      <w:r>
-        <w:t>verfügbaren</w:t>
-      </w:r>
-      <w:proofErr w:type="spellEnd"/>
-      <w:r>
-        <w:t xml:space="preserve"> </w:t>
-      </w:r>
-      <w:proofErr w:type="spellStart"/>
-      <w:r>
-        <w:t>Zeitblöcken</w:t>
-      </w:r>
-      <w:proofErr w:type="spellEnd"/>
-      <w:r>
-        <w:t>.</w:t>
-      </w:r>
-    </w:p>
-    <w:p>
-      <w:pPr>
-        <w:numPr>
-          <w:ilvl w:val="0"/>
-          <w:numId w:val="20"/>
-        </w:numPr>
-        <w:spacing w:after="80"/>
-        <w:ind w:hanging="271"/>
-      </w:pPr>
-      <w:proofErr w:type="spellStart"/>
-      <w:r>
-        <w:t>Priorisierung</w:t>
-      </w:r>
-      <w:proofErr w:type="spellEnd"/>
-      <w:r>
-        <w:t xml:space="preserve"> </w:t>
-      </w:r>
-      <w:proofErr w:type="spellStart"/>
-      <w:r>
-        <w:t>mit</w:t>
-      </w:r>
-      <w:proofErr w:type="spellEnd"/>
-      <w:r>
-        <w:t xml:space="preserve"> </w:t>
-      </w:r>
-      <w:proofErr w:type="spellStart"/>
-      <w:r>
-        <w:t>kurzer</w:t>
-      </w:r>
-      <w:proofErr w:type="spellEnd"/>
-      <w:r>
-        <w:t xml:space="preserve"> </w:t>
-      </w:r>
-      <w:proofErr w:type="spellStart"/>
-      <w:r>
-        <w:t>Begründung</w:t>
-      </w:r>
-      <w:proofErr w:type="spellEnd"/>
-      <w:r>
-        <w:t>.</w:t>
-      </w:r>
-    </w:p>
-    <w:p>
-      <w:pPr>
-        <w:numPr>
-          <w:ilvl w:val="0"/>
-          <w:numId w:val="20"/>
-        </w:numPr>
-        <w:spacing w:after="80"/>
-        <w:ind w:hanging="271"/>
-        <w:rPr>
-          <w:lang w:val="de-DE"/>
-        </w:rPr>
-      </w:pPr>
-      <w:r>
-        <w:rPr>
-          <w:lang w:val="de-DE"/>
-        </w:rPr>
-        <w:t>Zusammenfassungen von Tagesberichten, Lernnotizen und Projektständen.</w:t>
-      </w:r>
-    </w:p>
-    <w:p>
-      <w:pPr>
-        <w:numPr>
-          <w:ilvl w:val="0"/>
-          <w:numId w:val="20"/>
-        </w:numPr>
-        <w:spacing w:after="80"/>
-        <w:ind w:hanging="271"/>
-      </w:pPr>
-      <w:proofErr w:type="spellStart"/>
-      <w:r>
-        <w:t>Modulbezogener</w:t>
-      </w:r>
-      <w:proofErr w:type="spellEnd"/>
-      <w:r>
-        <w:t xml:space="preserve"> RAG-Chat.</w:t>
-      </w:r>
-    </w:p>
-    <w:p>
-      <w:pPr>
-        <w:numPr>
-          <w:ilvl w:val="0"/>
-          <w:numId w:val="20"/>
-        </w:numPr>
-        <w:spacing w:after="80"/>
-        <w:ind w:hanging="271"/>
-        <w:rPr>
-          <w:lang w:val="de-DE"/>
-        </w:rPr>
-      </w:pPr>
-      <w:r>
-        <w:rPr>
-          <w:lang w:val="de-DE"/>
-        </w:rPr>
-        <w:t>Fragen über freigegebene Wissens-, Studien- und Projektdaten.</w:t>
-      </w:r>
-    </w:p>
-    <w:p>
-      <w:pPr>
-        <w:numPr>
-          <w:ilvl w:val="0"/>
-          <w:numId w:val="20"/>
-        </w:numPr>
-        <w:spacing w:after="80"/>
-        <w:ind w:hanging="271"/>
-      </w:pPr>
-      <w:proofErr w:type="spellStart"/>
-      <w:r>
-        <w:t>Vorschläge</w:t>
-      </w:r>
-      <w:proofErr w:type="spellEnd"/>
-      <w:r>
-        <w:t xml:space="preserve"> für </w:t>
-      </w:r>
-      <w:proofErr w:type="spellStart"/>
-      <w:r>
-        <w:t>nächste</w:t>
-      </w:r>
-      <w:proofErr w:type="spellEnd"/>
-      <w:r>
-        <w:t xml:space="preserve"> </w:t>
-      </w:r>
-      <w:proofErr w:type="spellStart"/>
-      <w:r>
-        <w:t>Schritte</w:t>
-      </w:r>
-      <w:proofErr w:type="spellEnd"/>
-      <w:r>
-        <w:t>.</w:t>
-      </w:r>
-    </w:p>
-    <w:p>
-      <w:pPr>
-        <w:pStyle w:val="Heading3"/>
-      </w:pPr>
-      <w:proofErr w:type="spellStart"/>
-      <w:r>
-        <w:rPr>
-          <w:rFonts w:ascii="Calibri" w:hAnsi="Calibri"/>
-        </w:rPr>
-        <w:t>Verbindliche</w:t>
-      </w:r>
-      <w:proofErr w:type="spellEnd"/>
-      <w:r>
-        <w:rPr>
-          <w:rFonts w:ascii="Calibri" w:hAnsi="Calibri"/>
-        </w:rPr>
-        <w:t xml:space="preserve"> KI-</w:t>
-      </w:r>
-      <w:proofErr w:type="spellStart"/>
-      <w:r>
-        <w:rPr>
-          <w:rFonts w:ascii="Calibri" w:hAnsi="Calibri"/>
-        </w:rPr>
-        <w:t>Regeln</w:t>
-      </w:r>
-      <w:proofErr w:type="spellEnd"/>
-    </w:p>
-    <w:p>
-      <w:pPr>
-        <w:numPr>
-          <w:ilvl w:val="0"/>
-          <w:numId w:val="21"/>
-        </w:numPr>
-        <w:spacing w:after="80"/>
-        <w:ind w:hanging="271"/>
-        <w:rPr>
-          <w:lang w:val="de-DE"/>
-        </w:rPr>
-      </w:pPr>
-      <w:r>
-        <w:rPr>
-          <w:lang w:val="de-DE"/>
-        </w:rPr>
-        <w:t>Keine erfundenen Termine, Aufgaben, Arbeitszeiten, Beträge oder Quellen.</w:t>
-      </w:r>
-    </w:p>
-    <w:p>
-      <w:pPr>
-        <w:numPr>
-          <w:ilvl w:val="0"/>
-          <w:numId w:val="21"/>
-        </w:numPr>
-        <w:spacing w:after="80"/>
-        <w:ind w:hanging="271"/>
-        <w:rPr>
-          <w:lang w:val="de-DE"/>
-        </w:rPr>
-      </w:pPr>
-      <w:r>
-        <w:rPr>
-          <w:lang w:val="de-DE"/>
-        </w:rPr>
-        <w:t>Jede Empfehlung nennt die verwendeten Daten oder zeigt „keine ausreichenden Daten“.</w:t>
-      </w:r>
-    </w:p>
-    <w:p>
-      <w:pPr>
-        <w:numPr>
-          <w:ilvl w:val="0"/>
-          <w:numId w:val="21"/>
-        </w:numPr>
-        <w:spacing w:after="80"/>
-        <w:ind w:hanging="271"/>
-      </w:pPr>
-      <w:proofErr w:type="spellStart"/>
-      <w:r>
-        <w:t>Unsicherheit</w:t>
-      </w:r>
-      <w:proofErr w:type="spellEnd"/>
-      <w:r>
-        <w:t xml:space="preserve"> </w:t>
-      </w:r>
-      <w:proofErr w:type="spellStart"/>
-      <w:r>
-        <w:t>wird</w:t>
-      </w:r>
-      <w:proofErr w:type="spellEnd"/>
-      <w:r>
-        <w:t xml:space="preserve"> </w:t>
-      </w:r>
-      <w:proofErr w:type="spellStart"/>
-      <w:r>
-        <w:t>offen</w:t>
-      </w:r>
-      <w:proofErr w:type="spellEnd"/>
-      <w:r>
-        <w:t xml:space="preserve"> </w:t>
-      </w:r>
-      <w:proofErr w:type="spellStart"/>
-      <w:r>
-        <w:t>benannt</w:t>
-      </w:r>
-      <w:proofErr w:type="spellEnd"/>
-      <w:r>
-        <w:t>.</w:t>
-      </w:r>
-    </w:p>
-    <w:p>
-      <w:pPr>
-        <w:numPr>
-          <w:ilvl w:val="0"/>
-          <w:numId w:val="21"/>
-        </w:numPr>
-        <w:spacing w:after="80"/>
-        <w:ind w:hanging="271"/>
-        <w:rPr>
-          <w:lang w:val="de-DE"/>
-        </w:rPr>
-      </w:pPr>
-      <w:r>
-        <w:rPr>
-          <w:lang w:val="de-DE"/>
-        </w:rPr>
-        <w:t>Finanz-, Arbeits- und persönliche Daten werden nur mit expliziter Freigabe extern verarbeitet.</w:t>
-      </w:r>
-    </w:p>
-    <w:p>
-      <w:pPr>
-        <w:numPr>
-          <w:ilvl w:val="0"/>
-          <w:numId w:val="21"/>
-        </w:numPr>
-        <w:spacing w:after="80"/>
-        <w:ind w:hanging="271"/>
-        <w:rPr>
-          <w:lang w:val="de-DE"/>
-        </w:rPr>
-      </w:pPr>
-      <w:r>
-        <w:rPr>
-          <w:lang w:val="de-DE"/>
-        </w:rPr>
-        <w:t>Schreibende Aktionen benötigen eine Bestätigung.</w:t>
-      </w:r>
-    </w:p>
-    <w:p>
-      <w:pPr>
-        <w:numPr>
-          <w:ilvl w:val="0"/>
-          <w:numId w:val="21"/>
-        </w:numPr>
-        <w:spacing w:after="80"/>
-        <w:ind w:hanging="271"/>
-        <w:rPr>
-          <w:lang w:val="de-DE"/>
-        </w:rPr>
-      </w:pPr>
-      <w:r>
-        <w:rPr>
-          <w:lang w:val="de-DE"/>
-        </w:rPr>
-        <w:t>KI-Ausgaben werden als Vorschläge und nicht als verbindliche Entscheidungen gespeichert.</w:t>
-      </w:r>
-    </w:p>
-    <w:p>
-      <w:pPr>
-        <w:pStyle w:val="Heading2"/>
-      </w:pPr>
-      <w:r>
-        <w:rPr>
-          <w:rFonts w:ascii="Calibri" w:hAnsi="Calibri"/>
-        </w:rPr>
-        <w:lastRenderedPageBreak/>
-        <w:t xml:space="preserve">5.11 </w:t>
-      </w:r>
-      <w:proofErr w:type="spellStart"/>
-      <w:r>
-        <w:rPr>
-          <w:rFonts w:ascii="Calibri" w:hAnsi="Calibri"/>
-        </w:rPr>
-        <w:t>Einstellungen</w:t>
-      </w:r>
-      <w:proofErr w:type="spellEnd"/>
+      </w:pPr>
+      <w:r>
+        <w:t>5.12 Einstellungen</w:t>
+      </w:r>
     </w:p>
     <w:p>
       <w:pPr>
@@ -6702,6 +6860,94 @@
           <w:lang w:val="de-DE"/>
         </w:rPr>
         <w:t>Erst danach wird er gespeichert oder exportiert.</w:t>
+      </w:r>
+    </w:p>
+    <w:p>
+      <w:pPr>
+        <w:pStyle w:val="Heading2"/>
+      </w:pPr>
+      <w:r>
+        <w:t>6.6 Einkaufsliste per Sprache erfassen</w:t>
+      </w:r>
+    </w:p>
+    <w:p>
+      <w:pPr>
+        <w:numPr>
+          <w:ilvl w:val="0"/>
+          <w:numId w:val="51"/>
+        </w:numPr>
+        <w:spacing w:after="80"/>
+        <w:ind w:hanging="271"/>
+        <w:rPr>
+          <w:lang w:val="de-DE"/>
+        </w:rPr>
+      </w:pPr>
+      <w:r>
+        <w:t>Anton öffnet die aktive Einkaufsliste.</w:t>
+      </w:r>
+    </w:p>
+    <w:p>
+      <w:pPr>
+        <w:numPr>
+          <w:ilvl w:val="0"/>
+          <w:numId w:val="51"/>
+        </w:numPr>
+        <w:spacing w:after="80"/>
+        <w:ind w:hanging="271"/>
+        <w:rPr>
+          <w:lang w:val="de-DE"/>
+        </w:rPr>
+      </w:pPr>
+      <w:r>
+        <w:t>Er spricht oder schreibt zum Beispiel zwei Liter Milch, Käse, Hähnchenbrust, Chips und sechs Äpfel.</w:t>
+      </w:r>
+    </w:p>
+    <w:p>
+      <w:pPr>
+        <w:numPr>
+          <w:ilvl w:val="0"/>
+          <w:numId w:val="51"/>
+        </w:numPr>
+        <w:spacing w:after="80"/>
+        <w:ind w:hanging="271"/>
+        <w:rPr>
+          <w:lang w:val="de-DE"/>
+        </w:rPr>
+      </w:pPr>
+      <w:r>
+        <w:t>Das System zeigt einzelne Positionen mit Menge und vorgeschlagener Kategorie als bearbeitbare Vorschau.</w:t>
+      </w:r>
+    </w:p>
+    <w:p>
+      <w:pPr>
+        <w:numPr>
+          <w:ilvl w:val="0"/>
+          <w:numId w:val="51"/>
+        </w:numPr>
+        <w:spacing w:after="80"/>
+        <w:ind w:hanging="271"/>
+        <w:rPr>
+          <w:lang w:val="de-DE"/>
+        </w:rPr>
+      </w:pPr>
+      <w:r>
+        <w:t>Anton korrigiert bei Bedarf Bezeichnung, Menge oder Kategorie.</w:t>
+      </w:r>
+    </w:p>
+    <w:p>
+      <w:pPr>
+        <w:numPr>
+          <w:ilvl w:val="0"/>
+          <w:numId w:val="51"/>
+        </w:numPr>
+        <w:spacing w:after="80"/>
+        <w:ind w:hanging="271"/>
+        <w:rPr>
+          <w:lang w:val="de-DE"/>
+        </w:rPr>
+      </w:pPr>
+      <w:r>
+        <w:t>Erst nach seiner Bestätigung werden alle gültigen Positionen gemeinsam gespeichert und nach Kategorien gruppiert.</w:t>
       </w:r>
     </w:p>
     <w:p>
@@ -9782,6 +10028,94 @@
           </w:p>
         </w:tc>
       </w:tr>
+      <w:tr>
+        <w:tc>
+          <w:tcPr>
+            <w:tcW w:w="2200" w:type="dxa"/>
+          </w:tcPr>
+          <w:p>
+            <w:r>
+              <w:t>Einkaufsliste</w:t>
+            </w:r>
+          </w:p>
+        </w:tc>
+        <w:tc>
+          <w:tcPr>
+            <w:tcW w:w="7160" w:type="dxa"/>
+          </w:tcPr>
+          <w:p>
+            <w:r>
+              <w:t>id, nutzer_id, titel, status, archiviert_am, erstellt_am, aktualisiert_am</w:t>
+            </w:r>
+          </w:p>
+        </w:tc>
+      </w:tr>
+      <w:tr>
+        <w:tc>
+          <w:tcPr>
+            <w:tcW w:w="2200" w:type="dxa"/>
+          </w:tcPr>
+          <w:p>
+            <w:r>
+              <w:t>Einkaufsposition</w:t>
+            </w:r>
+          </w:p>
+        </w:tc>
+        <w:tc>
+          <w:tcPr>
+            <w:tcW w:w="7160" w:type="dxa"/>
+          </w:tcPr>
+          <w:p>
+            <w:r>
+              <w:t>id, einkaufsliste_id, nutzer_id, bezeichnung, menge, einheit, kategorie_id, status, quelle, sortierung</w:t>
+            </w:r>
+          </w:p>
+        </w:tc>
+      </w:tr>
+      <w:tr>
+        <w:tc>
+          <w:tcPr>
+            <w:tcW w:w="2200" w:type="dxa"/>
+          </w:tcPr>
+          <w:p>
+            <w:r>
+              <w:t>Einkaufskategorie</w:t>
+            </w:r>
+          </w:p>
+        </w:tc>
+        <w:tc>
+          <w:tcPr>
+            <w:tcW w:w="7160" w:type="dxa"/>
+          </w:tcPr>
+          <w:p>
+            <w:r>
+              <w:t>id, nutzer_id, name, sortierung, farbe, aktiv</w:t>
+            </w:r>
+          </w:p>
+        </w:tc>
+      </w:tr>
+      <w:tr>
+        <w:tc>
+          <w:tcPr>
+            <w:tcW w:w="2200" w:type="dxa"/>
+          </w:tcPr>
+          <w:p>
+            <w:r>
+              <w:t>Kategorisierungsregel</w:t>
+            </w:r>
+          </w:p>
+        </w:tc>
+        <w:tc>
+          <w:tcPr>
+            <w:tcW w:w="7160" w:type="dxa"/>
+          </w:tcPr>
+          <w:p>
+            <w:r>
+              <w:t>id, nutzer_id, normalisierter_begriff, kategorie_id, ursprung</w:t>
+            </w:r>
+          </w:p>
+        </w:tc>
+      </w:tr>
     </w:tbl>
     <w:p>
       <w:pPr>
@@ -9968,6 +10302,32 @@
           <w:lang w:val="de-DE"/>
         </w:rPr>
         <w:t>KI-Anfragen speichern Quellenverweise, aber keine unkontrollierten Schattenkopien sensibler Daten.</w:t>
+      </w:r>
+    </w:p>
+    <w:p>
+      <w:pPr>
+        <w:numPr>
+          <w:ilvl w:val="0"/>
+          <w:numId w:val="18"/>
+        </w:numPr>
+        <w:spacing w:after="80"/>
+        <w:ind w:hanging="271"/>
+      </w:pPr>
+      <w:r>
+        <w:t>Eine Einkaufsliste besitzt viele Einkaufspositionen; jede Position gehört genau einer Kategorie und demselben Besitzer wie die Liste.</w:t>
+      </w:r>
+    </w:p>
+    <w:p>
+      <w:pPr>
+        <w:numPr>
+          <w:ilvl w:val="0"/>
+          <w:numId w:val="18"/>
+        </w:numPr>
+        <w:spacing w:after="80"/>
+        <w:ind w:hanging="271"/>
+      </w:pPr>
+      <w:r>
+        <w:t>Persönliche Kategorisierungsregeln entstehen nur aus ausdrücklich bestätigten Korrekturen und verändern andere Module nicht automatisch.</w:t>
       </w:r>
     </w:p>
     <w:p>
@@ -11941,10 +12301,7 @@
         </w:rPr>
       </w:pPr>
       <w:r>
-        <w:rPr>
-          <w:lang w:val="de-DE"/>
-        </w:rPr>
-        <w:t>Sprachsteuerung und mobile native Apps.</w:t>
+        <w:t>Allgemeine Sprachsteuerung und mobile native Apps. Die geplante, eng begrenzte Spracheingabe für die Einkaufsliste ist eine spätere Erweiterung und keine allgemeine Sprachsteuerung.</w:t>
       </w:r>
     </w:p>
     <w:p>
@@ -12619,6 +12976,38 @@
           </w:p>
         </w:tc>
       </w:tr>
+      <w:tr>
+        <w:tc>
+          <w:tcPr>
+            <w:tcW w:w="2100" w:type="dxa"/>
+          </w:tcPr>
+          <w:p>
+            <w:r>
+              <w:t>1.1</w:t>
+            </w:r>
+          </w:p>
+        </w:tc>
+        <w:tc>
+          <w:tcPr>
+            <w:tcW w:w="2500" w:type="dxa"/>
+          </w:tcPr>
+          <w:p>
+            <w:r>
+              <w:t>Einkaufsliste und Spracheingabe</w:t>
+            </w:r>
+          </w:p>
+        </w:tc>
+        <w:tc>
+          <w:tcPr>
+            <w:tcW w:w="4760" w:type="dxa"/>
+          </w:tcPr>
+          <w:p>
+            <w:r>
+              <w:t>Bestätigte lokale Erfassung, Kategorisierung und optional nachgewiesene Mikrofoneingabe</w:t>
+            </w:r>
+          </w:p>
+        </w:tc>
+      </w:tr>
     </w:tbl>
     <w:p>
       <w:pPr>
@@ -13566,6 +13955,79 @@
         <w:pStyle w:val="Heading2"/>
       </w:pPr>
       <w:r>
+        <w:t>Einkaufsliste und Spracheingabe</w:t>
+      </w:r>
+    </w:p>
+    <w:p>
+      <w:pPr>
+        <w:numPr>
+          <w:ilvl w:val="0"/>
+          <w:numId w:val="18"/>
+        </w:numPr>
+        <w:spacing w:after="80"/>
+        <w:ind w:hanging="271"/>
+      </w:pPr>
+      <w:r>
+        <w:t>Mehrere geschriebene oder diktierte Lebensmittel erscheinen vor dem Speichern als einzelne bearbeitbare Vorschaupositionen.</w:t>
+      </w:r>
+    </w:p>
+    <w:p>
+      <w:pPr>
+        <w:numPr>
+          <w:ilvl w:val="0"/>
+          <w:numId w:val="18"/>
+        </w:numPr>
+        <w:spacing w:after="80"/>
+        <w:ind w:hanging="271"/>
+      </w:pPr>
+      <w:r>
+        <w:t>Käse wird nachvollziehbar Milchprodukte und Eiern, Chips werden Snacks und Süßem zugeordnet; unbekannte Begriffe bleiben sichtbar unter Sonstiges.</w:t>
+      </w:r>
+    </w:p>
+    <w:p>
+      <w:pPr>
+        <w:numPr>
+          <w:ilvl w:val="0"/>
+          <w:numId w:val="18"/>
+        </w:numPr>
+        <w:spacing w:after="80"/>
+        <w:ind w:hanging="271"/>
+      </w:pPr>
+      <w:r>
+        <w:t>Ohne ausdrückliche Bestätigung entsteht kein Einkaufsdatensatz; eine Bestätigung schreibt entweder alle gültigen Positionen oder keine.</w:t>
+      </w:r>
+    </w:p>
+    <w:p>
+      <w:pPr>
+        <w:numPr>
+          <w:ilvl w:val="0"/>
+          <w:numId w:val="18"/>
+        </w:numPr>
+        <w:spacing w:after="80"/>
+        <w:ind w:hanging="271"/>
+      </w:pPr>
+      <w:r>
+        <w:t>Der vollständige Textweg funktioniert auch bei verweigertem Mikrofonzugriff oder fehlender lokaler Spracherkennung.</w:t>
+      </w:r>
+    </w:p>
+    <w:p>
+      <w:pPr>
+        <w:numPr>
+          <w:ilvl w:val="0"/>
+          <w:numId w:val="18"/>
+        </w:numPr>
+        <w:spacing w:after="80"/>
+        <w:ind w:hanging="271"/>
+      </w:pPr>
+      <w:r>
+        <w:t>Audio wird weder gespeichert noch protokolliert oder an die LifeOS-API übertragen; ein eigener Mikrofonmodus besitzt keinen stillen Cloud-Rückfall.</w:t>
+      </w:r>
+    </w:p>
+    <w:p>
+      <w:pPr>
+        <w:pStyle w:val="Heading2"/>
+      </w:pPr>
+      <w:r>
         <w:rPr>
           <w:rFonts w:ascii="Calibri" w:hAnsi="Calibri"/>
         </w:rPr>
@@ -13993,6 +14455,32 @@
     </w:p>
     <w:p>
       <w:pPr>
+        <w:numPr>
+          <w:ilvl w:val="0"/>
+          <w:numId w:val="18"/>
+        </w:numPr>
+        <w:spacing w:after="80"/>
+        <w:ind w:hanging="271"/>
+      </w:pPr>
+      <w:r>
+        <w:t>Soll die erste Einkaufslisten-Version genau eine aktive Liste oder mehrere parallele aktive Listen unterstützen?</w:t>
+      </w:r>
+    </w:p>
+    <w:p>
+      <w:pPr>
+        <w:numPr>
+          <w:ilvl w:val="0"/>
+          <w:numId w:val="18"/>
+        </w:numPr>
+        <w:spacing w:after="80"/>
+        <w:ind w:hanging="271"/>
+      </w:pPr>
+      <w:r>
+        <w:t>Soll ein eigener Mikrofonmodus zuerst ausschließlich in der Mac-App angeboten werden, wenn dort lokale deutsche Erkennung zuverlässig nachgewiesen ist?</w:t>
+      </w:r>
+    </w:p>
+    <w:p>
+      <w:pPr>
         <w:rPr>
           <w:lang w:val="de-DE"/>
         </w:rPr>
@@ -14196,6 +14684,12 @@
     <w:p>
       <w:r>
         <w:t>Änderungsstand 07.09.2026: Der lokal erfolgreiche M6-Nachweis und der vollständige Sicherheits-, Integritäts- und Stabilitätsreview wurden ergänzt. Dazu gehören stärkere Passwortableitung, Sitzungs- und Login-Härtung, externe Netzwerk- und Backup-Grenzen, Dokumentintegrität, Browser-CSP, Sidecar-Isolation und Einzelinstanzschutz. Die öffentliche Produktfreigabe und ihre externen Apple- und Geräte-Gates bleiben ausdrücklich aufgeschoben.</w:t>
+      </w:r>
+    </w:p>
+    <w:p>
+      <w:pPr/>
+      <w:r>
+        <w:t>Änderungsstand 21.09.2026: Die geplante Einkaufsliste mit bestätigter regelbasierter Kategorisierung, Text- und Systemdiktat-Basispfad sowie einer nur nach lokalem Nachweis zulässigen Mikrofonoption wurde ergänzt. Die Erweiterung ist geplant, noch nicht implementiert und keine allgemeine Sprachsteuerung.</w:t>
       </w:r>
     </w:p>
     <w:p>
@@ -14931,6 +15425,12 @@
     </w:lvlOverride>
   </w:num>
   <w:num w:numId="50" w16cid:durableId="40248940">
+    <w:abstractNumId w:val="9"/>
+    <w:lvlOverride w:ilvl="0">
+      <w:startOverride w:val="1"/>
+    </w:lvlOverride>
+  </w:num>
+  <w:num w:numId="51" w16cid:durableId="310720333">
     <w:abstractNumId w:val="9"/>
     <w:lvlOverride w:ilvl="0">
       <w:startOverride w:val="1"/>

</xml_diff>

<commit_message>
feat(shopping): add deterministic shopping list foundation
</commit_message>
<xml_diff>
--- a/LifeOS Leitfaden.docx
+++ b/LifeOS Leitfaden.docx
@@ -60,7 +60,7 @@
         </w:rPr>
       </w:pPr>
       <w:r>
-        <w:t>Version 0.6 (Arbeitsgrundlage)</w:t>
+        <w:t>Version 0.7 (Arbeitsgrundlage)</w:t>
       </w:r>
     </w:p>
     <w:p>
@@ -6048,6 +6048,38 @@
     </w:p>
     <w:p>
       <w:pPr>
+        <w:pStyle w:val="Heading2"/>
+      </w:pPr>
+      <w:r>
+        <w:t>5.12 Einkaufsliste</w:t>
+      </w:r>
+    </w:p>
+    <w:p>
+      <w:pPr/>
+      <w:r>
+        <w:t>Die lokale Einkaufsliste ist als eigenes, besitzgebundenes Fachmodul umgesetzt. Pro Besitzer gibt es genau eine aktive Liste; archivierte Listen bleiben erhalten. Positionen werden zunächst als flüchtige Vorschau aus Text zerlegt und erst nach ausdrücklicher Bestätigung atomar gespeichert.</w:t>
+      </w:r>
+    </w:p>
+    <w:p>
+      <w:pPr/>
+      <w:r>
+        <w:t>Die erste Version verwendet zehn dokumentierte Systemkategorien. Unbekannte Begriffe erscheinen sichtbar als Sonstiges. Stück, Packung, Gramm, Kilogramm, Milliliter und Liter werden strukturiert erkannt; andere Mengen bleiben als sichtbarer Text erhalten. Eine persönliche Kategorieregel entsteht nur nach einer separaten Bestätigung.</w:t>
+      </w:r>
+    </w:p>
+    <w:p>
+      <w:pPr/>
+      <w:r>
+        <w:t>Die Migration 20260921190000_grocery_lists ist für PostgreSQL und SQLite versioniert. Die Lieferstufe ist auf SQLite lokal mit Parser-, Besitz-, Atomaritäts-, Migrations- und Transferprüfungen nachgewiesen. Die responsive Oberfläche, der PostgreSQL-Lauf und ein eigener Mikrofonmodus sind weitere Lieferstufen beziehungsweise offene Nachweise.</w:t>
+      </w:r>
+    </w:p>
+    <w:p>
+      <w:pPr/>
+      <w:r>
+        <w:t>Audio, Teiltranskripte und Rohtranskripte werden nicht an die LifeOS-API übertragen und nicht in Datenbank, Browser-Storage, Service-Worker-Cache, Logs, Audit oder Backup gespeichert. Text und Betriebssystem-Diktat bleiben der vollständige Basispfad; einen Cloud-Fallback gibt es nicht.</w:t>
+      </w:r>
+    </w:p>
+    <w:p>
+      <w:pPr>
         <w:pStyle w:val="Heading1"/>
       </w:pPr>
       <w:r>
@@ -14767,7 +14799,7 @@
         <w:color w:val="667085"/>
         <w:sz w:val="18"/>
       </w:rPr>
-      <w:t>0.6  |</w:t>
+      <w:t>0.7  |</w:t>
     </w:r>
     <w:proofErr w:type="gramEnd"/>
     <w:r>

</xml_diff>

<commit_message>
feat(shopping): add deterministic shopping list foundation (#112)
* feat(shopping): add deterministic shopping list foundation

* fix(shopping): accept preview uncertainty metadata

* fix(shopping): accept preview display metadata
</commit_message>
<xml_diff>
--- a/LifeOS Leitfaden.docx
+++ b/LifeOS Leitfaden.docx
@@ -60,7 +60,7 @@
         </w:rPr>
       </w:pPr>
       <w:r>
-        <w:t>Version 0.6 (Arbeitsgrundlage)</w:t>
+        <w:t>Version 0.7 (Arbeitsgrundlage)</w:t>
       </w:r>
     </w:p>
     <w:p>
@@ -6048,6 +6048,38 @@
     </w:p>
     <w:p>
       <w:pPr>
+        <w:pStyle w:val="Heading2"/>
+      </w:pPr>
+      <w:r>
+        <w:t>5.12 Einkaufsliste</w:t>
+      </w:r>
+    </w:p>
+    <w:p>
+      <w:pPr/>
+      <w:r>
+        <w:t>Die lokale Einkaufsliste ist als eigenes, besitzgebundenes Fachmodul umgesetzt. Pro Besitzer gibt es genau eine aktive Liste; archivierte Listen bleiben erhalten. Positionen werden zunächst als flüchtige Vorschau aus Text zerlegt und erst nach ausdrücklicher Bestätigung atomar gespeichert.</w:t>
+      </w:r>
+    </w:p>
+    <w:p>
+      <w:pPr/>
+      <w:r>
+        <w:t>Die erste Version verwendet zehn dokumentierte Systemkategorien. Unbekannte Begriffe erscheinen sichtbar als Sonstiges. Stück, Packung, Gramm, Kilogramm, Milliliter und Liter werden strukturiert erkannt; andere Mengen bleiben als sichtbarer Text erhalten. Eine persönliche Kategorieregel entsteht nur nach einer separaten Bestätigung.</w:t>
+      </w:r>
+    </w:p>
+    <w:p>
+      <w:pPr/>
+      <w:r>
+        <w:t>Die Migration 20260921190000_grocery_lists ist für PostgreSQL und SQLite versioniert. Die Lieferstufe ist auf SQLite lokal mit Parser-, Besitz-, Atomaritäts-, Migrations- und Transferprüfungen nachgewiesen. Die responsive Oberfläche, der PostgreSQL-Lauf und ein eigener Mikrofonmodus sind weitere Lieferstufen beziehungsweise offene Nachweise.</w:t>
+      </w:r>
+    </w:p>
+    <w:p>
+      <w:pPr/>
+      <w:r>
+        <w:t>Audio, Teiltranskripte und Rohtranskripte werden nicht an die LifeOS-API übertragen und nicht in Datenbank, Browser-Storage, Service-Worker-Cache, Logs, Audit oder Backup gespeichert. Text und Betriebssystem-Diktat bleiben der vollständige Basispfad; einen Cloud-Fallback gibt es nicht.</w:t>
+      </w:r>
+    </w:p>
+    <w:p>
+      <w:pPr>
         <w:pStyle w:val="Heading1"/>
       </w:pPr>
       <w:r>
@@ -14767,7 +14799,7 @@
         <w:color w:val="667085"/>
         <w:sz w:val="18"/>
       </w:rPr>
-      <w:t>0.6  |</w:t>
+      <w:t>0.7  |</w:t>
     </w:r>
     <w:proofErr w:type="gramEnd"/>
     <w:r>

</xml_diff>

<commit_message>
test(shopping): verify local speech capability
</commit_message>
<xml_diff>
--- a/LifeOS Leitfaden.docx
+++ b/LifeOS Leitfaden.docx
@@ -60,7 +60,7 @@
         </w:rPr>
       </w:pPr>
       <w:r>
-        <w:t>Version 0.7 (Arbeitsgrundlage)</w:t>
+        <w:t>Version 0.8 (Arbeitsgrundlage)</w:t>
       </w:r>
     </w:p>
     <w:p>
@@ -72,7 +72,7 @@
         </w:rPr>
       </w:pPr>
       <w:r>
-        <w:t>Stand: 21.09.2026</w:t>
+        <w:t>Stand: 22.09.2026</w:t>
       </w:r>
     </w:p>
     <w:p>
@@ -164,17 +164,17 @@
         </w:rPr>
       </w:pPr>
       <w:r>
-        <w:t>Version: 0.6 (Arbeitsgrundlage)</w:t>
-      </w:r>
-    </w:p>
-    <w:p>
-      <w:pPr>
-        <w:rPr>
-          <w:lang w:val="de-DE"/>
-        </w:rPr>
-      </w:pPr>
-      <w:r>
-        <w:t>Stand: 21.09.2026</w:t>
+        <w:t>Version: 0.8 (Arbeitsgrundlage)</w:t>
+      </w:r>
+    </w:p>
+    <w:p>
+      <w:pPr>
+        <w:rPr>
+          <w:lang w:val="de-DE"/>
+        </w:rPr>
+      </w:pPr>
+      <w:r>
+        <w:t>Stand: 22.09.2026</w:t>
       </w:r>
     </w:p>
     <w:p>
@@ -1636,7 +1636,7 @@
           </w:tcPr>
           <w:p>
             <w:r>
-              <w:t>Einstellungen, lokale Spracheingabe</w:t>
+              <w:t>Einstellungen, Text und Systemdiktat</w:t>
             </w:r>
           </w:p>
         </w:tc>
@@ -5083,7 +5083,7 @@
     <w:p>
       <w:pPr/>
       <w:r>
-        <w:t>Die Einkaufsliste erfasst Lebensmittel lokal und gruppiert sie nach nachvollziehbaren Kategorien. Sprache ist eine zusätzliche Eingabemethode und keine allgemeine Sprachsteuerung.</w:t>
+        <w:t>Die umgesetzte Einkaufsliste erfasst Lebensmittel lokal und gruppiert sie nach nachvollziehbaren Kategorien. Text und Betriebssystem-Diktat bilden den vollständigen Basispfad; ein eigener Mikrofonmodus bleibt eine getrennte, nachweispflichtige Eingabemethode und ist keine allgemeine Sprachsteuerung.</w:t>
       </w:r>
     </w:p>
     <w:p>
@@ -5190,7 +5190,7 @@
         <w:ind w:hanging="271"/>
       </w:pPr>
       <w:r>
-        <w:t>LifeOS speichert und protokolliert kein Audio. Ein eigener Mikrofonmodus ist nur zulässig, wenn die konkrete Plattform lokale deutsche Spracherkennung erzwingen kann; andernfalls bleiben Text und Systemdiktat verfügbar.</w:t>
+        <w:t>LifeOS speichert und protokolliert kein Audio. Ein eigener Mikrofonmodus ist nur zulässig, wenn die konkrete Plattform lokale deutsche Spracherkennung Ende zu Ende und bei deaktiviertem Netzwerk erzwingen kann. Der ARM64-Test auf macOS 26.6 weist deutsche Unterstützung nach, aber kein installiertes deutsches SpeechTranscriber-Modell und keinen berechtigten Offline-Lauf; deshalb bleibt der Mikrofonmodus gesperrt.</w:t>
       </w:r>
     </w:p>
     <w:p>
@@ -6051,7 +6051,7 @@
         <w:pStyle w:val="Heading2"/>
       </w:pPr>
       <w:r>
-        <w:t>5.12 Einkaufsliste</w:t>
+        <w:t>5.13 Umsetzungsstand Einkaufsliste</w:t>
       </w:r>
     </w:p>
     <w:p>
@@ -6069,13 +6069,13 @@
     <w:p>
       <w:pPr/>
       <w:r>
-        <w:t>Die Migration 20260921190000_grocery_lists ist für PostgreSQL und SQLite versioniert. Die Lieferstufe ist auf SQLite lokal mit Parser-, Besitz-, Atomaritäts-, Migrations- und Transferprüfungen nachgewiesen. Die responsive Oberfläche, der PostgreSQL-Lauf und ein eigener Mikrofonmodus sind weitere Lieferstufen beziehungsweise offene Nachweise.</w:t>
+        <w:t>Die Migration 20260921190000_grocery_lists ist für PostgreSQL und SQLite versioniert. Parser, Besitzgrenzen, Atomarität, Migration, Import und Recovery sind lokal geprüft. Die responsive gemeinsame React-Oberfläche ist zusätzlich in Desktop- und Smartphone-Chrome nachgewiesen; der frische PostgreSQL-Lauf umfasst alle Migrationen und den Einkaufslisten-Integrationstest. Die Pflicht-CI der Daten-/API- und UI-Lieferstufen war vor dem jeweiligen Merge vollständig grün.</w:t>
       </w:r>
     </w:p>
     <w:p>
       <w:pPr/>
       <w:r>
-        <w:t>Audio, Teiltranskripte und Rohtranskripte werden nicht an die LifeOS-API übertragen und nicht in Datenbank, Browser-Storage, Service-Worker-Cache, Logs, Audit oder Backup gespeichert. Text und Betriebssystem-Diktat bleiben der vollständige Basispfad; einen Cloud-Fallback gibt es nicht.</w:t>
+        <w:t>Audio, Teiltranskripte und Rohtranskripte werden nicht an die LifeOS-API übertragen und nicht in Datenbank, Browser-Storage, Service-Worker-Cache, Logs, Audit oder Backup gespeichert. Text und Betriebssystem-Diktat bleiben der vollständige Basispfad. Der reproduzierbare App-Bundle-Test öffnet kein Mikrofon, fordert keine Berechtigung an und installiert kein Sprachmodell; einen Cloud-Fallback gibt es nicht.</w:t>
       </w:r>
     </w:p>
     <w:p>
@@ -6899,7 +6899,7 @@
         <w:pStyle w:val="Heading2"/>
       </w:pPr>
       <w:r>
-        <w:t>6.6 Einkaufsliste per Sprache erfassen</w:t>
+        <w:t>6.6 Einkaufsliste per Text oder Systemdiktat erfassen</w:t>
       </w:r>
     </w:p>
     <w:p>
@@ -6931,7 +6931,7 @@
         </w:rPr>
       </w:pPr>
       <w:r>
-        <w:t>Er spricht oder schreibt zum Beispiel zwei Liter Milch, Käse, Hähnchenbrust, Chips und sechs Äpfel.</w:t>
+        <w:t>Er schreibt oder nutzt das Betriebssystem-Diktat, zum Beispiel für zwei Liter Milch, Käse, Hähnchenbrust, Chips und sechs Äpfel.</w:t>
       </w:r>
     </w:p>
     <w:p>
@@ -13035,7 +13035,7 @@
           </w:tcPr>
           <w:p>
             <w:r>
-              <w:t>Bestätigte lokale Erfassung, Kategorisierung und optional nachgewiesene Mikrofoneingabe</w:t>
+              <w:t>Daten, API und responsive Oberfläche umgesetzt; lokaler Mikrofonmodus bis zum Offline-End-to-End-Nachweis gesperrt</w:t>
             </w:r>
           </w:p>
         </w:tc>
@@ -14039,7 +14039,7 @@
         <w:ind w:hanging="271"/>
       </w:pPr>
       <w:r>
-        <w:t>Der vollständige Textweg funktioniert auch bei verweigertem Mikrofonzugriff oder fehlender lokaler Spracherkennung.</w:t>
+        <w:t>Der vollständige Text- und Systemdiktat-Weg funktioniert unabhängig vom bewusst nicht freigegebenen LifeOS-Mikrofonmodus.</w:t>
       </w:r>
     </w:p>
     <w:p>
@@ -14052,7 +14052,7 @@
         <w:ind w:hanging="271"/>
       </w:pPr>
       <w:r>
-        <w:t>Audio wird weder gespeichert noch protokolliert oder an die LifeOS-API übertragen; ein eigener Mikrofonmodus besitzt keinen stillen Cloud-Rückfall.</w:t>
+        <w:t>Audio wird weder gespeichert noch protokolliert oder an die LifeOS-API übertragen. Ein eigener Mikrofonmodus ist nicht implementiert und darf später keinen stillen Cloud-Rückfall besitzen.</w:t>
       </w:r>
     </w:p>
     <w:p>
@@ -14495,7 +14495,7 @@
         <w:ind w:hanging="271"/>
       </w:pPr>
       <w:r>
-        <w:t>Soll die erste Einkaufslisten-Version genau eine aktive Liste oder mehrere parallele aktive Listen unterstützen?</w:t>
+        <w:t>Für die erste Einkaufslisten-Version ist genau eine aktive Liste pro Besitzer entschieden; archivierte Listen bleiben erhalten.</w:t>
       </w:r>
     </w:p>
     <w:p>
@@ -14508,7 +14508,7 @@
         <w:ind w:hanging="271"/>
       </w:pPr>
       <w:r>
-        <w:t>Soll ein eigener Mikrofonmodus zuerst ausschließlich in der Mac-App angeboten werden, wenn dort lokale deutsche Erkennung zuverlässig nachgewiesen ist?</w:t>
+        <w:t>Offen bleibt, ob ein eigener Mikrofonmodus nach installiertem deutschem Modell, erteilten Systemberechtigungen und bestandenem Offline-End-to-End-Test in einer späteren Mac-Lieferstufe freigegeben wird.</w:t>
       </w:r>
     </w:p>
     <w:p>
@@ -14721,7 +14721,7 @@
     <w:p>
       <w:pPr/>
       <w:r>
-        <w:t>Änderungsstand 21.09.2026: Die geplante Einkaufsliste mit bestätigter regelbasierter Kategorisierung, Text- und Systemdiktat-Basispfad sowie einer nur nach lokalem Nachweis zulässigen Mikrofonoption wurde ergänzt. Die Erweiterung ist geplant, noch nicht implementiert und keine allgemeine Sprachsteuerung.</w:t>
+        <w:t>Änderungsstand 22.09.2026: Datenmodell, Parser, API und responsive Einkaufsliste mit atomarer Bestätigung, Archiv, Systemkategorien und ausdrücklich bestätigten persönlichen Regeln sind umgesetzt und lokal sowie in der Pflicht-CI geprüft. Der read-only ARM64-App-Bundle-Test bestätigt deutsche Apple-Speech-Unterstützung, aber kein installiertes deutsches SpeechTranscriber-Modell und keinen berechtigten Offline-End-to-End-Lauf. Deshalb bleibt der eigene Mikrofonmodus ohne Cloud-Fallback gesperrt.</w:t>
       </w:r>
     </w:p>
     <w:p>
@@ -14799,7 +14799,7 @@
         <w:color w:val="667085"/>
         <w:sz w:val="18"/>
       </w:rPr>
-      <w:t>0.7  |</w:t>
+      <w:t>0.8  |</w:t>
     </w:r>
     <w:proofErr w:type="gramEnd"/>
     <w:r>

</xml_diff>

<commit_message>
chore(release): synchronize current develop to main
</commit_message>
<xml_diff>
--- a/LifeOS Leitfaden.docx
+++ b/LifeOS Leitfaden.docx
@@ -60,7 +60,7 @@
         </w:rPr>
       </w:pPr>
       <w:r>
-        <w:t>Version 0.6 (Arbeitsgrundlage)</w:t>
+        <w:t>Version 0.8 (Arbeitsgrundlage)</w:t>
       </w:r>
     </w:p>
     <w:p>
@@ -72,7 +72,7 @@
         </w:rPr>
       </w:pPr>
       <w:r>
-        <w:t>Stand: 07.09.2026</w:t>
+        <w:t>Stand: 22.09.2026</w:t>
       </w:r>
     </w:p>
     <w:p>
@@ -164,17 +164,17 @@
         </w:rPr>
       </w:pPr>
       <w:r>
-        <w:t>Version: 0.6 (Arbeitsgrundlage)</w:t>
-      </w:r>
-    </w:p>
-    <w:p>
-      <w:pPr>
-        <w:rPr>
-          <w:lang w:val="de-DE"/>
-        </w:rPr>
-      </w:pPr>
-      <w:r>
-        <w:t>Stand: 07.09.2026</w:t>
+        <w:t>Version: 0.8 (Arbeitsgrundlage)</w:t>
+      </w:r>
+    </w:p>
+    <w:p>
+      <w:pPr>
+        <w:rPr>
+          <w:lang w:val="de-DE"/>
+        </w:rPr>
+      </w:pPr>
+      <w:r>
+        <w:t>Stand: 22.09.2026</w:t>
       </w:r>
     </w:p>
     <w:p>
@@ -908,6 +908,19 @@
       </w:pPr>
       <w:r>
         <w:t>Fitness</w:t>
+      </w:r>
+    </w:p>
+    <w:p>
+      <w:pPr>
+        <w:numPr>
+          <w:ilvl w:val="0"/>
+          <w:numId w:val="1"/>
+        </w:numPr>
+        <w:spacing w:after="80"/>
+        <w:ind w:hanging="271"/>
+      </w:pPr>
+      <w:r>
+        <w:t>Einkauf</w:t>
       </w:r>
     </w:p>
     <w:p>
@@ -1602,6 +1615,38 @@
             <w:tcW w:w="2100" w:type="dxa"/>
           </w:tcPr>
           <w:p>
+            <w:r>
+              <w:t>Einkauf</w:t>
+            </w:r>
+          </w:p>
+        </w:tc>
+        <w:tc>
+          <w:tcPr>
+            <w:tcW w:w="2500" w:type="dxa"/>
+          </w:tcPr>
+          <w:p>
+            <w:r>
+              <w:t>Lebensmittel schnell erfassen und nach Kategorien einkaufen</w:t>
+            </w:r>
+          </w:p>
+        </w:tc>
+        <w:tc>
+          <w:tcPr>
+            <w:tcW w:w="4760" w:type="dxa"/>
+          </w:tcPr>
+          <w:p>
+            <w:r>
+              <w:t>Einstellungen, Text und Systemdiktat</w:t>
+            </w:r>
+          </w:p>
+        </w:tc>
+      </w:tr>
+      <w:tr>
+        <w:tc>
+          <w:tcPr>
+            <w:tcW w:w="2100" w:type="dxa"/>
+          </w:tcPr>
+          <w:p>
             <w:pPr>
               <w:spacing w:after="0"/>
             </w:pPr>
@@ -5030,30 +5075,357 @@
     <w:p>
       <w:pPr>
         <w:pStyle w:val="Heading2"/>
-        <w:rPr>
-          <w:lang w:val="de-DE"/>
-        </w:rPr>
-      </w:pPr>
+      </w:pPr>
+      <w:r>
+        <w:t>5.9 Einkaufsliste und Spracheingabe</w:t>
+      </w:r>
+    </w:p>
+    <w:p>
+      <w:pPr/>
+      <w:r>
+        <w:t>Die umgesetzte Einkaufsliste erfasst Lebensmittel lokal und gruppiert sie nach nachvollziehbaren Kategorien. Text und Betriebssystem-Diktat bilden den vollständigen Basispfad; ein eigener Mikrofonmodus bleibt eine getrennte, nachweispflichtige Eingabemethode und ist keine allgemeine Sprachsteuerung.</w:t>
+      </w:r>
+    </w:p>
+    <w:p>
+      <w:pPr>
+        <w:pStyle w:val="Heading3"/>
+      </w:pPr>
+      <w:r>
+        <w:t>Funktionen</w:t>
+      </w:r>
+    </w:p>
+    <w:p>
+      <w:pPr>
+        <w:numPr>
+          <w:ilvl w:val="0"/>
+          <w:numId w:val="18"/>
+        </w:numPr>
+        <w:spacing w:after="80"/>
+        <w:ind w:hanging="271"/>
+      </w:pPr>
+      <w:r>
+        <w:t>Mehrere Lebensmittel als Text oder Diktat in einem Eingabefeld erfassen.</w:t>
+      </w:r>
+    </w:p>
+    <w:p>
+      <w:pPr>
+        <w:numPr>
+          <w:ilvl w:val="0"/>
+          <w:numId w:val="18"/>
+        </w:numPr>
+        <w:spacing w:after="80"/>
+        <w:ind w:hanging="271"/>
+      </w:pPr>
+      <w:r>
+        <w:t>Einträge in einer bearbeitbaren Vorschau trennen und Mengen sowie Einheiten soweit eindeutig erkennen.</w:t>
+      </w:r>
+    </w:p>
+    <w:p>
+      <w:pPr>
+        <w:numPr>
+          <w:ilvl w:val="0"/>
+          <w:numId w:val="18"/>
+        </w:numPr>
+        <w:spacing w:after="80"/>
+        <w:ind w:hanging="271"/>
+      </w:pPr>
+      <w:r>
+        <w:t>Produkte über lokale, versionierte Regeln Kategorien wie Obst und Gemüse, Milchprodukte und Eier, Fleisch und Fisch, Getränke, Snacks und Sonstiges zuordnen.</w:t>
+      </w:r>
+    </w:p>
+    <w:p>
+      <w:pPr>
+        <w:numPr>
+          <w:ilvl w:val="0"/>
+          <w:numId w:val="18"/>
+        </w:numPr>
+        <w:spacing w:after="80"/>
+        <w:ind w:hanging="271"/>
+      </w:pPr>
+      <w:r>
+        <w:t>Unbekannte oder mehrdeutige Begriffe sichtbar unter Sonstiges einordnen und manuell korrigierbar halten.</w:t>
+      </w:r>
+    </w:p>
+    <w:p>
+      <w:pPr>
+        <w:numPr>
+          <w:ilvl w:val="0"/>
+          <w:numId w:val="18"/>
+        </w:numPr>
+        <w:spacing w:after="80"/>
+        <w:ind w:hanging="271"/>
+      </w:pPr>
+      <w:r>
+        <w:t>Erst nach ausdrücklicher Bestätigung alle Positionen atomar in die aktive Einkaufsliste übernehmen.</w:t>
+      </w:r>
+    </w:p>
+    <w:p>
+      <w:pPr>
+        <w:numPr>
+          <w:ilvl w:val="0"/>
+          <w:numId w:val="18"/>
+        </w:numPr>
+        <w:spacing w:after="80"/>
+        <w:ind w:hanging="271"/>
+      </w:pPr>
+      <w:r>
+        <w:t>Offene und erledigte Positionen untereinander nach Kategorie gruppieren, bearbeiten, abhaken, wieder öffnen und archivieren.</w:t>
+      </w:r>
+    </w:p>
+    <w:p>
+      <w:pPr>
+        <w:pStyle w:val="Heading3"/>
+      </w:pPr>
+      <w:r>
+        <w:t>Regeln</w:t>
+      </w:r>
+    </w:p>
+    <w:p>
+      <w:pPr>
+        <w:numPr>
+          <w:ilvl w:val="0"/>
+          <w:numId w:val="18"/>
+        </w:numPr>
+        <w:spacing w:after="80"/>
+        <w:ind w:hanging="271"/>
+      </w:pPr>
+      <w:r>
+        <w:t>LifeOS speichert und protokolliert kein Audio. Ein eigener Mikrofonmodus ist nur zulässig, wenn die konkrete Plattform lokale deutsche Spracherkennung Ende zu Ende und bei deaktiviertem Netzwerk erzwingen kann. Der ARM64-Test auf macOS 26.6 weist deutsche Unterstützung nach, aber kein installiertes deutsches SpeechTranscriber-Modell und keinen berechtigten Offline-Lauf; deshalb bleibt der Mikrofonmodus gesperrt.</w:t>
+      </w:r>
+    </w:p>
+    <w:p>
+      <w:pPr>
+        <w:numPr>
+          <w:ilvl w:val="0"/>
+          <w:numId w:val="18"/>
+        </w:numPr>
+        <w:spacing w:after="80"/>
+        <w:ind w:hanging="271"/>
+      </w:pPr>
+      <w:r>
+        <w:t>Die Funktion erstellt keine Ernährungs-, Gesundheits- oder Kaufempfehlung und verändert keine Fitness-, Finanz-, Aufgaben- oder Kalenderdaten automatisch.</w:t>
+      </w:r>
+    </w:p>
+    <w:p>
+      <w:pPr>
+        <w:pStyle w:val="Heading2"/>
+        <w:rPr>
+          <w:lang w:val="de-DE"/>
+        </w:rPr>
+      </w:pPr>
+      <w:r>
+        <w:t>5.10 Wissen</w:t>
+      </w:r>
+    </w:p>
+    <w:p>
+      <w:pPr>
+        <w:rPr>
+          <w:lang w:val="de-DE"/>
+        </w:rPr>
+      </w:pPr>
+      <w:r>
+        <w:rPr>
+          <w:lang w:val="de-DE"/>
+        </w:rPr>
+        <w:t>Das Wissensmodul ist eine persönliche, durchsuchbare Ablage für Notizen und Dokumente.</w:t>
+      </w:r>
+    </w:p>
+    <w:p>
+      <w:pPr>
+        <w:pStyle w:val="Heading3"/>
+      </w:pPr>
+      <w:proofErr w:type="spellStart"/>
       <w:r>
         <w:rPr>
           <w:rFonts w:ascii="Calibri" w:hAnsi="Calibri"/>
-          <w:lang w:val="de-DE"/>
-        </w:rPr>
-        <w:lastRenderedPageBreak/>
-        <w:t>5.9 Wissen</w:t>
-      </w:r>
-    </w:p>
-    <w:p>
-      <w:pPr>
-        <w:rPr>
-          <w:lang w:val="de-DE"/>
-        </w:rPr>
-      </w:pPr>
-      <w:r>
-        <w:rPr>
-          <w:lang w:val="de-DE"/>
-        </w:rPr>
-        <w:t>Das Wissensmodul ist eine persönliche, durchsuchbare Ablage für Notizen und Dokumente.</w:t>
+        </w:rPr>
+        <w:t>Funktionen</w:t>
+      </w:r>
+      <w:proofErr w:type="spellEnd"/>
+    </w:p>
+    <w:p>
+      <w:pPr>
+        <w:numPr>
+          <w:ilvl w:val="0"/>
+          <w:numId w:val="19"/>
+        </w:numPr>
+        <w:spacing w:after="80"/>
+        <w:ind w:hanging="271"/>
+      </w:pPr>
+      <w:proofErr w:type="spellStart"/>
+      <w:r>
+        <w:t>Notizen</w:t>
+      </w:r>
+      <w:proofErr w:type="spellEnd"/>
+      <w:r>
+        <w:t xml:space="preserve"> </w:t>
+      </w:r>
+      <w:proofErr w:type="spellStart"/>
+      <w:r>
+        <w:t>mit</w:t>
+      </w:r>
+      <w:proofErr w:type="spellEnd"/>
+      <w:r>
+        <w:t xml:space="preserve"> Markdown </w:t>
+      </w:r>
+      <w:proofErr w:type="spellStart"/>
+      <w:r>
+        <w:t>oder</w:t>
+      </w:r>
+      <w:proofErr w:type="spellEnd"/>
+      <w:r>
+        <w:t xml:space="preserve"> Rich Text.</w:t>
+      </w:r>
+    </w:p>
+    <w:p>
+      <w:pPr>
+        <w:numPr>
+          <w:ilvl w:val="0"/>
+          <w:numId w:val="19"/>
+        </w:numPr>
+        <w:spacing w:after="80"/>
+        <w:ind w:hanging="271"/>
+      </w:pPr>
+      <w:proofErr w:type="spellStart"/>
+      <w:r>
+        <w:t>Dokumente</w:t>
+      </w:r>
+      <w:proofErr w:type="spellEnd"/>
+      <w:r>
+        <w:t xml:space="preserve"> und </w:t>
+      </w:r>
+      <w:proofErr w:type="spellStart"/>
+      <w:r>
+        <w:t>Anhänge</w:t>
+      </w:r>
+      <w:proofErr w:type="spellEnd"/>
+      <w:r>
+        <w:t>.</w:t>
+      </w:r>
+    </w:p>
+    <w:p>
+      <w:pPr>
+        <w:numPr>
+          <w:ilvl w:val="0"/>
+          <w:numId w:val="19"/>
+        </w:numPr>
+        <w:spacing w:after="80"/>
+        <w:ind w:hanging="271"/>
+      </w:pPr>
+      <w:proofErr w:type="spellStart"/>
+      <w:r>
+        <w:t>Kategorien</w:t>
+      </w:r>
+      <w:proofErr w:type="spellEnd"/>
+      <w:r>
+        <w:t xml:space="preserve">, Tags und </w:t>
+      </w:r>
+      <w:proofErr w:type="spellStart"/>
+      <w:r>
+        <w:t>Verknüpfungen</w:t>
+      </w:r>
+      <w:proofErr w:type="spellEnd"/>
+      <w:r>
+        <w:t>.</w:t>
+      </w:r>
+    </w:p>
+    <w:p>
+      <w:pPr>
+        <w:numPr>
+          <w:ilvl w:val="0"/>
+          <w:numId w:val="19"/>
+        </w:numPr>
+        <w:spacing w:after="80"/>
+        <w:ind w:hanging="271"/>
+      </w:pPr>
+      <w:proofErr w:type="spellStart"/>
+      <w:r>
+        <w:t>Volltextsuche</w:t>
+      </w:r>
+      <w:proofErr w:type="spellEnd"/>
+      <w:r>
+        <w:t>.</w:t>
+      </w:r>
+    </w:p>
+    <w:p>
+      <w:pPr>
+        <w:numPr>
+          <w:ilvl w:val="0"/>
+          <w:numId w:val="19"/>
+        </w:numPr>
+        <w:spacing w:after="80"/>
+        <w:ind w:hanging="271"/>
+        <w:rPr>
+          <w:lang w:val="de-DE"/>
+        </w:rPr>
+      </w:pPr>
+      <w:r>
+        <w:rPr>
+          <w:lang w:val="de-DE"/>
+        </w:rPr>
+        <w:t>Favoriten und zuletzt bearbeitete Inhalte.</w:t>
+      </w:r>
+    </w:p>
+    <w:p>
+      <w:pPr>
+        <w:numPr>
+          <w:ilvl w:val="0"/>
+          <w:numId w:val="19"/>
+        </w:numPr>
+        <w:spacing w:after="80"/>
+        <w:ind w:hanging="271"/>
+        <w:rPr>
+          <w:lang w:val="de-DE"/>
+        </w:rPr>
+      </w:pPr>
+      <w:r>
+        <w:rPr>
+          <w:lang w:val="de-DE"/>
+        </w:rPr>
+        <w:t>Quellenangaben und Versionierung wichtiger Notizen.</w:t>
+      </w:r>
+    </w:p>
+    <w:p>
+      <w:pPr>
+        <w:numPr>
+          <w:ilvl w:val="0"/>
+          <w:numId w:val="19"/>
+        </w:numPr>
+        <w:spacing w:after="80"/>
+        <w:ind w:hanging="271"/>
+        <w:rPr>
+          <w:lang w:val="de-DE"/>
+        </w:rPr>
+      </w:pPr>
+      <w:r>
+        <w:rPr>
+          <w:lang w:val="de-DE"/>
+        </w:rPr>
+        <w:t>KI-Zusammenfassung und Fragen zu freigegebenen Inhalten.</w:t>
+      </w:r>
+    </w:p>
+    <w:p>
+      <w:pPr>
+        <w:pStyle w:val="Heading2"/>
+        <w:rPr>
+          <w:lang w:val="de-DE"/>
+        </w:rPr>
+      </w:pPr>
+      <w:r>
+        <w:t>5.11 KI-Assistent</w:t>
+      </w:r>
+    </w:p>
+    <w:p>
+      <w:pPr>
+        <w:rPr>
+          <w:lang w:val="de-DE"/>
+        </w:rPr>
+      </w:pPr>
+      <w:r>
+        <w:rPr>
+          <w:lang w:val="de-DE"/>
+        </w:rPr>
+        <w:t>Der KI-Assistent ist eine Querschnittsfunktion und keine eigenständige Datenquelle.</w:t>
       </w:r>
     </w:p>
     <w:p>
@@ -5073,14 +5445,33 @@
       <w:pPr>
         <w:numPr>
           <w:ilvl w:val="0"/>
-          <w:numId w:val="19"/>
+          <w:numId w:val="20"/>
+        </w:numPr>
+        <w:spacing w:after="80"/>
+        <w:ind w:hanging="271"/>
+        <w:rPr>
+          <w:lang w:val="de-DE"/>
+        </w:rPr>
+      </w:pPr>
+      <w:r>
+        <w:rPr>
+          <w:lang w:val="de-DE"/>
+        </w:rPr>
+        <w:t>Tagesplanung aus vorhandenen Aufgaben, Terminen und Deadlines.</w:t>
+      </w:r>
+    </w:p>
+    <w:p>
+      <w:pPr>
+        <w:numPr>
+          <w:ilvl w:val="0"/>
+          <w:numId w:val="20"/>
         </w:numPr>
         <w:spacing w:after="80"/>
         <w:ind w:hanging="271"/>
       </w:pPr>
       <w:proofErr w:type="spellStart"/>
       <w:r>
-        <w:t>Notizen</w:t>
+        <w:t>Wochenplanung</w:t>
       </w:r>
       <w:proofErr w:type="spellEnd"/>
       <w:r>
@@ -5092,37 +5483,362 @@
       </w:r>
       <w:proofErr w:type="spellEnd"/>
       <w:r>
-        <w:t xml:space="preserve"> Markdown </w:t>
+        <w:t xml:space="preserve"> </w:t>
       </w:r>
       <w:proofErr w:type="spellStart"/>
       <w:r>
-        <w:t>oder</w:t>
+        <w:t>verfügbaren</w:t>
       </w:r>
       <w:proofErr w:type="spellEnd"/>
       <w:r>
-        <w:t xml:space="preserve"> Rich Text.</w:t>
-      </w:r>
-    </w:p>
-    <w:p>
-      <w:pPr>
-        <w:numPr>
-          <w:ilvl w:val="0"/>
-          <w:numId w:val="19"/>
-        </w:numPr>
-        <w:spacing w:after="80"/>
-        <w:ind w:hanging="271"/>
-      </w:pPr>
+        <w:t xml:space="preserve"> </w:t>
+      </w:r>
       <w:proofErr w:type="spellStart"/>
       <w:r>
-        <w:t>Dokumente</w:t>
+        <w:t>Zeitblöcken</w:t>
       </w:r>
       <w:proofErr w:type="spellEnd"/>
       <w:r>
+        <w:t>.</w:t>
+      </w:r>
+    </w:p>
+    <w:p>
+      <w:pPr>
+        <w:numPr>
+          <w:ilvl w:val="0"/>
+          <w:numId w:val="20"/>
+        </w:numPr>
+        <w:spacing w:after="80"/>
+        <w:ind w:hanging="271"/>
+      </w:pPr>
+      <w:proofErr w:type="spellStart"/>
+      <w:r>
+        <w:t>Priorisierung</w:t>
+      </w:r>
+      <w:proofErr w:type="spellEnd"/>
+      <w:r>
+        <w:t xml:space="preserve"> </w:t>
+      </w:r>
+      <w:proofErr w:type="spellStart"/>
+      <w:r>
+        <w:t>mit</w:t>
+      </w:r>
+      <w:proofErr w:type="spellEnd"/>
+      <w:r>
+        <w:t xml:space="preserve"> </w:t>
+      </w:r>
+      <w:proofErr w:type="spellStart"/>
+      <w:r>
+        <w:t>kurzer</w:t>
+      </w:r>
+      <w:proofErr w:type="spellEnd"/>
+      <w:r>
+        <w:t xml:space="preserve"> </w:t>
+      </w:r>
+      <w:proofErr w:type="spellStart"/>
+      <w:r>
+        <w:t>Begründung</w:t>
+      </w:r>
+      <w:proofErr w:type="spellEnd"/>
+      <w:r>
+        <w:t>.</w:t>
+      </w:r>
+    </w:p>
+    <w:p>
+      <w:pPr>
+        <w:numPr>
+          <w:ilvl w:val="0"/>
+          <w:numId w:val="20"/>
+        </w:numPr>
+        <w:spacing w:after="80"/>
+        <w:ind w:hanging="271"/>
+        <w:rPr>
+          <w:lang w:val="de-DE"/>
+        </w:rPr>
+      </w:pPr>
+      <w:r>
+        <w:rPr>
+          <w:lang w:val="de-DE"/>
+        </w:rPr>
+        <w:t>Zusammenfassungen von Tagesberichten, Lernnotizen und Projektständen.</w:t>
+      </w:r>
+    </w:p>
+    <w:p>
+      <w:pPr>
+        <w:numPr>
+          <w:ilvl w:val="0"/>
+          <w:numId w:val="20"/>
+        </w:numPr>
+        <w:spacing w:after="80"/>
+        <w:ind w:hanging="271"/>
+      </w:pPr>
+      <w:proofErr w:type="spellStart"/>
+      <w:r>
+        <w:t>Modulbezogener</w:t>
+      </w:r>
+      <w:proofErr w:type="spellEnd"/>
+      <w:r>
+        <w:t xml:space="preserve"> RAG-Chat.</w:t>
+      </w:r>
+    </w:p>
+    <w:p>
+      <w:pPr>
+        <w:numPr>
+          <w:ilvl w:val="0"/>
+          <w:numId w:val="20"/>
+        </w:numPr>
+        <w:spacing w:after="80"/>
+        <w:ind w:hanging="271"/>
+        <w:rPr>
+          <w:lang w:val="de-DE"/>
+        </w:rPr>
+      </w:pPr>
+      <w:r>
+        <w:rPr>
+          <w:lang w:val="de-DE"/>
+        </w:rPr>
+        <w:t>Fragen über freigegebene Wissens-, Studien- und Projektdaten.</w:t>
+      </w:r>
+    </w:p>
+    <w:p>
+      <w:pPr>
+        <w:numPr>
+          <w:ilvl w:val="0"/>
+          <w:numId w:val="20"/>
+        </w:numPr>
+        <w:spacing w:after="80"/>
+        <w:ind w:hanging="271"/>
+      </w:pPr>
+      <w:proofErr w:type="spellStart"/>
+      <w:r>
+        <w:t>Vorschläge</w:t>
+      </w:r>
+      <w:proofErr w:type="spellEnd"/>
+      <w:r>
+        <w:t xml:space="preserve"> für </w:t>
+      </w:r>
+      <w:proofErr w:type="spellStart"/>
+      <w:r>
+        <w:t>nächste</w:t>
+      </w:r>
+      <w:proofErr w:type="spellEnd"/>
+      <w:r>
+        <w:t xml:space="preserve"> </w:t>
+      </w:r>
+      <w:proofErr w:type="spellStart"/>
+      <w:r>
+        <w:t>Schritte</w:t>
+      </w:r>
+      <w:proofErr w:type="spellEnd"/>
+      <w:r>
+        <w:t>.</w:t>
+      </w:r>
+    </w:p>
+    <w:p>
+      <w:pPr>
+        <w:pStyle w:val="Heading3"/>
+      </w:pPr>
+      <w:proofErr w:type="spellStart"/>
+      <w:r>
+        <w:rPr>
+          <w:rFonts w:ascii="Calibri" w:hAnsi="Calibri"/>
+        </w:rPr>
+        <w:t>Verbindliche</w:t>
+      </w:r>
+      <w:proofErr w:type="spellEnd"/>
+      <w:r>
+        <w:rPr>
+          <w:rFonts w:ascii="Calibri" w:hAnsi="Calibri"/>
+        </w:rPr>
+        <w:t xml:space="preserve"> KI-</w:t>
+      </w:r>
+      <w:proofErr w:type="spellStart"/>
+      <w:r>
+        <w:rPr>
+          <w:rFonts w:ascii="Calibri" w:hAnsi="Calibri"/>
+        </w:rPr>
+        <w:t>Regeln</w:t>
+      </w:r>
+      <w:proofErr w:type="spellEnd"/>
+    </w:p>
+    <w:p>
+      <w:pPr>
+        <w:numPr>
+          <w:ilvl w:val="0"/>
+          <w:numId w:val="21"/>
+        </w:numPr>
+        <w:spacing w:after="80"/>
+        <w:ind w:hanging="271"/>
+        <w:rPr>
+          <w:lang w:val="de-DE"/>
+        </w:rPr>
+      </w:pPr>
+      <w:r>
+        <w:rPr>
+          <w:lang w:val="de-DE"/>
+        </w:rPr>
+        <w:t>Keine erfundenen Termine, Aufgaben, Arbeitszeiten, Beträge oder Quellen.</w:t>
+      </w:r>
+    </w:p>
+    <w:p>
+      <w:pPr>
+        <w:numPr>
+          <w:ilvl w:val="0"/>
+          <w:numId w:val="21"/>
+        </w:numPr>
+        <w:spacing w:after="80"/>
+        <w:ind w:hanging="271"/>
+        <w:rPr>
+          <w:lang w:val="de-DE"/>
+        </w:rPr>
+      </w:pPr>
+      <w:r>
+        <w:rPr>
+          <w:lang w:val="de-DE"/>
+        </w:rPr>
+        <w:t>Jede Empfehlung nennt die verwendeten Daten oder zeigt „keine ausreichenden Daten“.</w:t>
+      </w:r>
+    </w:p>
+    <w:p>
+      <w:pPr>
+        <w:numPr>
+          <w:ilvl w:val="0"/>
+          <w:numId w:val="21"/>
+        </w:numPr>
+        <w:spacing w:after="80"/>
+        <w:ind w:hanging="271"/>
+      </w:pPr>
+      <w:proofErr w:type="spellStart"/>
+      <w:r>
+        <w:t>Unsicherheit</w:t>
+      </w:r>
+      <w:proofErr w:type="spellEnd"/>
+      <w:r>
+        <w:t xml:space="preserve"> </w:t>
+      </w:r>
+      <w:proofErr w:type="spellStart"/>
+      <w:r>
+        <w:t>wird</w:t>
+      </w:r>
+      <w:proofErr w:type="spellEnd"/>
+      <w:r>
+        <w:t xml:space="preserve"> </w:t>
+      </w:r>
+      <w:proofErr w:type="spellStart"/>
+      <w:r>
+        <w:t>offen</w:t>
+      </w:r>
+      <w:proofErr w:type="spellEnd"/>
+      <w:r>
+        <w:t xml:space="preserve"> </w:t>
+      </w:r>
+      <w:proofErr w:type="spellStart"/>
+      <w:r>
+        <w:t>benannt</w:t>
+      </w:r>
+      <w:proofErr w:type="spellEnd"/>
+      <w:r>
+        <w:t>.</w:t>
+      </w:r>
+    </w:p>
+    <w:p>
+      <w:pPr>
+        <w:numPr>
+          <w:ilvl w:val="0"/>
+          <w:numId w:val="21"/>
+        </w:numPr>
+        <w:spacing w:after="80"/>
+        <w:ind w:hanging="271"/>
+        <w:rPr>
+          <w:lang w:val="de-DE"/>
+        </w:rPr>
+      </w:pPr>
+      <w:r>
+        <w:rPr>
+          <w:lang w:val="de-DE"/>
+        </w:rPr>
+        <w:t>Finanz-, Arbeits- und persönliche Daten werden nur mit expliziter Freigabe extern verarbeitet.</w:t>
+      </w:r>
+    </w:p>
+    <w:p>
+      <w:pPr>
+        <w:numPr>
+          <w:ilvl w:val="0"/>
+          <w:numId w:val="21"/>
+        </w:numPr>
+        <w:spacing w:after="80"/>
+        <w:ind w:hanging="271"/>
+        <w:rPr>
+          <w:lang w:val="de-DE"/>
+        </w:rPr>
+      </w:pPr>
+      <w:r>
+        <w:rPr>
+          <w:lang w:val="de-DE"/>
+        </w:rPr>
+        <w:t>Schreibende Aktionen benötigen eine Bestätigung.</w:t>
+      </w:r>
+    </w:p>
+    <w:p>
+      <w:pPr>
+        <w:numPr>
+          <w:ilvl w:val="0"/>
+          <w:numId w:val="21"/>
+        </w:numPr>
+        <w:spacing w:after="80"/>
+        <w:ind w:hanging="271"/>
+        <w:rPr>
+          <w:lang w:val="de-DE"/>
+        </w:rPr>
+      </w:pPr>
+      <w:r>
+        <w:rPr>
+          <w:lang w:val="de-DE"/>
+        </w:rPr>
+        <w:t>KI-Ausgaben werden als Vorschläge und nicht als verbindliche Entscheidungen gespeichert.</w:t>
+      </w:r>
+    </w:p>
+    <w:p>
+      <w:pPr>
+        <w:pStyle w:val="Heading2"/>
+      </w:pPr>
+      <w:r>
+        <w:t>5.12 Einstellungen</w:t>
+      </w:r>
+    </w:p>
+    <w:p>
+      <w:pPr>
+        <w:pStyle w:val="Heading3"/>
+      </w:pPr>
+      <w:proofErr w:type="spellStart"/>
+      <w:r>
+        <w:rPr>
+          <w:rFonts w:ascii="Calibri" w:hAnsi="Calibri"/>
+        </w:rPr>
+        <w:t>Funktionen</w:t>
+      </w:r>
+      <w:proofErr w:type="spellEnd"/>
+    </w:p>
+    <w:p>
+      <w:pPr>
+        <w:numPr>
+          <w:ilvl w:val="0"/>
+          <w:numId w:val="22"/>
+        </w:numPr>
+        <w:spacing w:after="80"/>
+        <w:ind w:hanging="271"/>
+      </w:pPr>
+      <w:proofErr w:type="spellStart"/>
+      <w:r>
+        <w:t>Profil</w:t>
+      </w:r>
+      <w:proofErr w:type="spellEnd"/>
+      <w:r>
         <w:t xml:space="preserve"> und </w:t>
       </w:r>
       <w:proofErr w:type="spellStart"/>
       <w:r>
-        <w:t>Anhänge</w:t>
+        <w:t>Anzeigeeinstellungen</w:t>
       </w:r>
       <w:proofErr w:type="spellEnd"/>
       <w:r>
@@ -5133,22 +5849,60 @@
       <w:pPr>
         <w:numPr>
           <w:ilvl w:val="0"/>
-          <w:numId w:val="19"/>
+          <w:numId w:val="22"/>
+        </w:numPr>
+        <w:spacing w:after="80"/>
+        <w:ind w:hanging="271"/>
+        <w:rPr>
+          <w:lang w:val="de-DE"/>
+        </w:rPr>
+      </w:pPr>
+      <w:r>
+        <w:rPr>
+          <w:lang w:val="de-DE"/>
+        </w:rPr>
+        <w:t>Zeitzone, Sprache, Währung und Wochenbeginn.</w:t>
+      </w:r>
+    </w:p>
+    <w:p>
+      <w:pPr>
+        <w:numPr>
+          <w:ilvl w:val="0"/>
+          <w:numId w:val="22"/>
+        </w:numPr>
+        <w:spacing w:after="80"/>
+        <w:ind w:hanging="271"/>
+        <w:rPr>
+          <w:lang w:val="de-DE"/>
+        </w:rPr>
+      </w:pPr>
+      <w:r>
+        <w:rPr>
+          <w:lang w:val="de-DE"/>
+        </w:rPr>
+        <w:t>Kategorien, Statuswerte und persönliche Präferenzen.</w:t>
+      </w:r>
+    </w:p>
+    <w:p>
+      <w:pPr>
+        <w:numPr>
+          <w:ilvl w:val="0"/>
+          <w:numId w:val="22"/>
         </w:numPr>
         <w:spacing w:after="80"/>
         <w:ind w:hanging="271"/>
       </w:pPr>
       <w:proofErr w:type="spellStart"/>
       <w:r>
-        <w:t>Kategorien</w:t>
+        <w:t>Datenimport</w:t>
       </w:r>
       <w:proofErr w:type="spellEnd"/>
       <w:r>
-        <w:t xml:space="preserve">, Tags und </w:t>
+        <w:t xml:space="preserve"> und </w:t>
       </w:r>
       <w:proofErr w:type="spellStart"/>
       <w:r>
-        <w:t>Verknüpfungen</w:t>
+        <w:t>Datenexport</w:t>
       </w:r>
       <w:proofErr w:type="spellEnd"/>
       <w:r>
@@ -5159,17 +5913,33 @@
       <w:pPr>
         <w:numPr>
           <w:ilvl w:val="0"/>
-          <w:numId w:val="19"/>
+          <w:numId w:val="22"/>
         </w:numPr>
         <w:spacing w:after="80"/>
         <w:ind w:hanging="271"/>
       </w:pPr>
       <w:proofErr w:type="spellStart"/>
       <w:r>
-        <w:t>Volltextsuche</w:t>
+        <w:t>Integrationsverwaltung</w:t>
       </w:r>
       <w:proofErr w:type="spellEnd"/>
       <w:r>
+        <w:t xml:space="preserve"> </w:t>
+      </w:r>
+      <w:proofErr w:type="spellStart"/>
+      <w:r>
+        <w:t>mit</w:t>
+      </w:r>
+      <w:proofErr w:type="spellEnd"/>
+      <w:r>
+        <w:t xml:space="preserve"> </w:t>
+      </w:r>
+      <w:proofErr w:type="spellStart"/>
+      <w:r>
+        <w:t>Berechtigungsübersicht</w:t>
+      </w:r>
+      <w:proofErr w:type="spellEnd"/>
+      <w:r>
         <w:t>.</w:t>
       </w:r>
     </w:p>
@@ -5177,715 +5947,135 @@
       <w:pPr>
         <w:numPr>
           <w:ilvl w:val="0"/>
-          <w:numId w:val="19"/>
-        </w:numPr>
-        <w:spacing w:after="80"/>
-        <w:ind w:hanging="271"/>
-        <w:rPr>
-          <w:lang w:val="de-DE"/>
-        </w:rPr>
-      </w:pPr>
-      <w:r>
-        <w:rPr>
-          <w:lang w:val="de-DE"/>
-        </w:rPr>
-        <w:t>Favoriten und zuletzt bearbeitete Inhalte.</w:t>
-      </w:r>
-    </w:p>
-    <w:p>
-      <w:pPr>
-        <w:numPr>
-          <w:ilvl w:val="0"/>
-          <w:numId w:val="19"/>
-        </w:numPr>
-        <w:spacing w:after="80"/>
-        <w:ind w:hanging="271"/>
-        <w:rPr>
-          <w:lang w:val="de-DE"/>
-        </w:rPr>
-      </w:pPr>
-      <w:r>
-        <w:rPr>
-          <w:lang w:val="de-DE"/>
-        </w:rPr>
-        <w:t>Quellenangaben und Versionierung wichtiger Notizen.</w:t>
-      </w:r>
-    </w:p>
-    <w:p>
-      <w:pPr>
-        <w:numPr>
-          <w:ilvl w:val="0"/>
-          <w:numId w:val="19"/>
-        </w:numPr>
-        <w:spacing w:after="80"/>
-        <w:ind w:hanging="271"/>
-        <w:rPr>
-          <w:lang w:val="de-DE"/>
-        </w:rPr>
-      </w:pPr>
-      <w:r>
-        <w:rPr>
-          <w:lang w:val="de-DE"/>
-        </w:rPr>
-        <w:t>KI-Zusammenfassung und Fragen zu freigegebenen Inhalten.</w:t>
+          <w:numId w:val="22"/>
+        </w:numPr>
+        <w:spacing w:after="80"/>
+        <w:ind w:hanging="271"/>
+      </w:pPr>
+      <w:r>
+        <w:t>KI-</w:t>
+      </w:r>
+      <w:proofErr w:type="spellStart"/>
+      <w:r>
+        <w:t>Einstellungen</w:t>
+      </w:r>
+      <w:proofErr w:type="spellEnd"/>
+      <w:r>
+        <w:t xml:space="preserve"> und </w:t>
+      </w:r>
+      <w:proofErr w:type="spellStart"/>
+      <w:r>
+        <w:t>Datenfreigaben</w:t>
+      </w:r>
+      <w:proofErr w:type="spellEnd"/>
+      <w:r>
+        <w:t>.</w:t>
+      </w:r>
+    </w:p>
+    <w:p>
+      <w:pPr>
+        <w:numPr>
+          <w:ilvl w:val="0"/>
+          <w:numId w:val="22"/>
+        </w:numPr>
+        <w:spacing w:after="80"/>
+        <w:ind w:hanging="271"/>
+      </w:pPr>
+      <w:proofErr w:type="spellStart"/>
+      <w:r>
+        <w:t>Sicherheitsoptionen</w:t>
+      </w:r>
+      <w:proofErr w:type="spellEnd"/>
+      <w:r>
+        <w:t xml:space="preserve">, </w:t>
+      </w:r>
+      <w:proofErr w:type="spellStart"/>
+      <w:r>
+        <w:t>Sitzungen</w:t>
+      </w:r>
+      <w:proofErr w:type="spellEnd"/>
+      <w:r>
+        <w:t xml:space="preserve"> und </w:t>
+      </w:r>
+      <w:proofErr w:type="spellStart"/>
+      <w:r>
+        <w:t>Geräte</w:t>
+      </w:r>
+      <w:proofErr w:type="spellEnd"/>
+      <w:r>
+        <w:t>.</w:t>
+      </w:r>
+    </w:p>
+    <w:p>
+      <w:pPr>
+        <w:numPr>
+          <w:ilvl w:val="0"/>
+          <w:numId w:val="22"/>
+        </w:numPr>
+        <w:spacing w:after="80"/>
+        <w:ind w:hanging="271"/>
+        <w:rPr>
+          <w:lang w:val="de-DE"/>
+        </w:rPr>
+      </w:pPr>
+      <w:r>
+        <w:rPr>
+          <w:lang w:val="de-DE"/>
+        </w:rPr>
+        <w:t>Löschung einzelner Datenbereiche oder des gesamten Profils.</w:t>
+      </w:r>
+    </w:p>
+    <w:p>
+      <w:pPr>
+        <w:numPr>
+          <w:ilvl w:val="0"/>
+          <w:numId w:val="22"/>
+        </w:numPr>
+        <w:spacing w:after="80"/>
+        <w:ind w:hanging="271"/>
+      </w:pPr>
+      <w:r>
+        <w:t xml:space="preserve">Audit- und </w:t>
+      </w:r>
+      <w:proofErr w:type="spellStart"/>
+      <w:r>
+        <w:t>Aktivitätsprotokoll</w:t>
+      </w:r>
+      <w:proofErr w:type="spellEnd"/>
+      <w:r>
+        <w:t>.</w:t>
       </w:r>
     </w:p>
     <w:p>
       <w:pPr>
         <w:pStyle w:val="Heading2"/>
-        <w:rPr>
-          <w:lang w:val="de-DE"/>
-        </w:rPr>
-      </w:pPr>
-      <w:r>
-        <w:rPr>
-          <w:rFonts w:ascii="Calibri" w:hAnsi="Calibri"/>
-          <w:lang w:val="de-DE"/>
-        </w:rPr>
-        <w:t>5.10 KI-Assistent</w:t>
-      </w:r>
-    </w:p>
-    <w:p>
-      <w:pPr>
-        <w:rPr>
-          <w:lang w:val="de-DE"/>
-        </w:rPr>
-      </w:pPr>
-      <w:r>
-        <w:rPr>
-          <w:lang w:val="de-DE"/>
-        </w:rPr>
-        <w:t>Der KI-Assistent ist eine Querschnittsfunktion und keine eigenständige Datenquelle.</w:t>
-      </w:r>
-    </w:p>
-    <w:p>
-      <w:pPr>
-        <w:pStyle w:val="Heading3"/>
-      </w:pPr>
-      <w:proofErr w:type="spellStart"/>
-      <w:r>
-        <w:rPr>
-          <w:rFonts w:ascii="Calibri" w:hAnsi="Calibri"/>
-        </w:rPr>
-        <w:t>Funktionen</w:t>
-      </w:r>
-      <w:proofErr w:type="spellEnd"/>
-    </w:p>
-    <w:p>
-      <w:pPr>
-        <w:numPr>
-          <w:ilvl w:val="0"/>
-          <w:numId w:val="20"/>
-        </w:numPr>
-        <w:spacing w:after="80"/>
-        <w:ind w:hanging="271"/>
-        <w:rPr>
-          <w:lang w:val="de-DE"/>
-        </w:rPr>
-      </w:pPr>
-      <w:r>
-        <w:rPr>
-          <w:lang w:val="de-DE"/>
-        </w:rPr>
-        <w:t>Tagesplanung aus vorhandenen Aufgaben, Terminen und Deadlines.</w:t>
-      </w:r>
-    </w:p>
-    <w:p>
-      <w:pPr>
-        <w:numPr>
-          <w:ilvl w:val="0"/>
-          <w:numId w:val="20"/>
-        </w:numPr>
-        <w:spacing w:after="80"/>
-        <w:ind w:hanging="271"/>
-      </w:pPr>
-      <w:proofErr w:type="spellStart"/>
-      <w:r>
-        <w:t>Wochenplanung</w:t>
-      </w:r>
-      <w:proofErr w:type="spellEnd"/>
-      <w:r>
-        <w:t xml:space="preserve"> </w:t>
-      </w:r>
-      <w:proofErr w:type="spellStart"/>
-      <w:r>
-        <w:t>mit</w:t>
-      </w:r>
-      <w:proofErr w:type="spellEnd"/>
-      <w:r>
-        <w:t xml:space="preserve"> </w:t>
-      </w:r>
-      <w:proofErr w:type="spellStart"/>
-      <w:r>
-        <w:t>verfügbaren</w:t>
-      </w:r>
-      <w:proofErr w:type="spellEnd"/>
-      <w:r>
-        <w:t xml:space="preserve"> </w:t>
-      </w:r>
-      <w:proofErr w:type="spellStart"/>
-      <w:r>
-        <w:t>Zeitblöcken</w:t>
-      </w:r>
-      <w:proofErr w:type="spellEnd"/>
-      <w:r>
-        <w:t>.</w:t>
-      </w:r>
-    </w:p>
-    <w:p>
-      <w:pPr>
-        <w:numPr>
-          <w:ilvl w:val="0"/>
-          <w:numId w:val="20"/>
-        </w:numPr>
-        <w:spacing w:after="80"/>
-        <w:ind w:hanging="271"/>
-      </w:pPr>
-      <w:proofErr w:type="spellStart"/>
-      <w:r>
-        <w:t>Priorisierung</w:t>
-      </w:r>
-      <w:proofErr w:type="spellEnd"/>
-      <w:r>
-        <w:t xml:space="preserve"> </w:t>
-      </w:r>
-      <w:proofErr w:type="spellStart"/>
-      <w:r>
-        <w:t>mit</w:t>
-      </w:r>
-      <w:proofErr w:type="spellEnd"/>
-      <w:r>
-        <w:t xml:space="preserve"> </w:t>
-      </w:r>
-      <w:proofErr w:type="spellStart"/>
-      <w:r>
-        <w:t>kurzer</w:t>
-      </w:r>
-      <w:proofErr w:type="spellEnd"/>
-      <w:r>
-        <w:t xml:space="preserve"> </w:t>
-      </w:r>
-      <w:proofErr w:type="spellStart"/>
-      <w:r>
-        <w:t>Begründung</w:t>
-      </w:r>
-      <w:proofErr w:type="spellEnd"/>
-      <w:r>
-        <w:t>.</w:t>
-      </w:r>
-    </w:p>
-    <w:p>
-      <w:pPr>
-        <w:numPr>
-          <w:ilvl w:val="0"/>
-          <w:numId w:val="20"/>
-        </w:numPr>
-        <w:spacing w:after="80"/>
-        <w:ind w:hanging="271"/>
-        <w:rPr>
-          <w:lang w:val="de-DE"/>
-        </w:rPr>
-      </w:pPr>
-      <w:r>
-        <w:rPr>
-          <w:lang w:val="de-DE"/>
-        </w:rPr>
-        <w:t>Zusammenfassungen von Tagesberichten, Lernnotizen und Projektständen.</w:t>
-      </w:r>
-    </w:p>
-    <w:p>
-      <w:pPr>
-        <w:numPr>
-          <w:ilvl w:val="0"/>
-          <w:numId w:val="20"/>
-        </w:numPr>
-        <w:spacing w:after="80"/>
-        <w:ind w:hanging="271"/>
-      </w:pPr>
-      <w:proofErr w:type="spellStart"/>
-      <w:r>
-        <w:t>Modulbezogener</w:t>
-      </w:r>
-      <w:proofErr w:type="spellEnd"/>
-      <w:r>
-        <w:t xml:space="preserve"> RAG-Chat.</w:t>
-      </w:r>
-    </w:p>
-    <w:p>
-      <w:pPr>
-        <w:numPr>
-          <w:ilvl w:val="0"/>
-          <w:numId w:val="20"/>
-        </w:numPr>
-        <w:spacing w:after="80"/>
-        <w:ind w:hanging="271"/>
-        <w:rPr>
-          <w:lang w:val="de-DE"/>
-        </w:rPr>
-      </w:pPr>
-      <w:r>
-        <w:rPr>
-          <w:lang w:val="de-DE"/>
-        </w:rPr>
-        <w:t>Fragen über freigegebene Wissens-, Studien- und Projektdaten.</w:t>
-      </w:r>
-    </w:p>
-    <w:p>
-      <w:pPr>
-        <w:numPr>
-          <w:ilvl w:val="0"/>
-          <w:numId w:val="20"/>
-        </w:numPr>
-        <w:spacing w:after="80"/>
-        <w:ind w:hanging="271"/>
-      </w:pPr>
-      <w:proofErr w:type="spellStart"/>
-      <w:r>
-        <w:t>Vorschläge</w:t>
-      </w:r>
-      <w:proofErr w:type="spellEnd"/>
-      <w:r>
-        <w:t xml:space="preserve"> für </w:t>
-      </w:r>
-      <w:proofErr w:type="spellStart"/>
-      <w:r>
-        <w:t>nächste</w:t>
-      </w:r>
-      <w:proofErr w:type="spellEnd"/>
-      <w:r>
-        <w:t xml:space="preserve"> </w:t>
-      </w:r>
-      <w:proofErr w:type="spellStart"/>
-      <w:r>
-        <w:t>Schritte</w:t>
-      </w:r>
-      <w:proofErr w:type="spellEnd"/>
-      <w:r>
-        <w:t>.</w:t>
-      </w:r>
-    </w:p>
-    <w:p>
-      <w:pPr>
-        <w:pStyle w:val="Heading3"/>
-      </w:pPr>
-      <w:proofErr w:type="spellStart"/>
-      <w:r>
-        <w:rPr>
-          <w:rFonts w:ascii="Calibri" w:hAnsi="Calibri"/>
-        </w:rPr>
-        <w:t>Verbindliche</w:t>
-      </w:r>
-      <w:proofErr w:type="spellEnd"/>
-      <w:r>
-        <w:rPr>
-          <w:rFonts w:ascii="Calibri" w:hAnsi="Calibri"/>
-        </w:rPr>
-        <w:t xml:space="preserve"> KI-</w:t>
-      </w:r>
-      <w:proofErr w:type="spellStart"/>
-      <w:r>
-        <w:rPr>
-          <w:rFonts w:ascii="Calibri" w:hAnsi="Calibri"/>
-        </w:rPr>
-        <w:t>Regeln</w:t>
-      </w:r>
-      <w:proofErr w:type="spellEnd"/>
-    </w:p>
-    <w:p>
-      <w:pPr>
-        <w:numPr>
-          <w:ilvl w:val="0"/>
-          <w:numId w:val="21"/>
-        </w:numPr>
-        <w:spacing w:after="80"/>
-        <w:ind w:hanging="271"/>
-        <w:rPr>
-          <w:lang w:val="de-DE"/>
-        </w:rPr>
-      </w:pPr>
-      <w:r>
-        <w:rPr>
-          <w:lang w:val="de-DE"/>
-        </w:rPr>
-        <w:t>Keine erfundenen Termine, Aufgaben, Arbeitszeiten, Beträge oder Quellen.</w:t>
-      </w:r>
-    </w:p>
-    <w:p>
-      <w:pPr>
-        <w:numPr>
-          <w:ilvl w:val="0"/>
-          <w:numId w:val="21"/>
-        </w:numPr>
-        <w:spacing w:after="80"/>
-        <w:ind w:hanging="271"/>
-        <w:rPr>
-          <w:lang w:val="de-DE"/>
-        </w:rPr>
-      </w:pPr>
-      <w:r>
-        <w:rPr>
-          <w:lang w:val="de-DE"/>
-        </w:rPr>
-        <w:t>Jede Empfehlung nennt die verwendeten Daten oder zeigt „keine ausreichenden Daten“.</w:t>
-      </w:r>
-    </w:p>
-    <w:p>
-      <w:pPr>
-        <w:numPr>
-          <w:ilvl w:val="0"/>
-          <w:numId w:val="21"/>
-        </w:numPr>
-        <w:spacing w:after="80"/>
-        <w:ind w:hanging="271"/>
-      </w:pPr>
-      <w:proofErr w:type="spellStart"/>
-      <w:r>
-        <w:t>Unsicherheit</w:t>
-      </w:r>
-      <w:proofErr w:type="spellEnd"/>
-      <w:r>
-        <w:t xml:space="preserve"> </w:t>
-      </w:r>
-      <w:proofErr w:type="spellStart"/>
-      <w:r>
-        <w:t>wird</w:t>
-      </w:r>
-      <w:proofErr w:type="spellEnd"/>
-      <w:r>
-        <w:t xml:space="preserve"> </w:t>
-      </w:r>
-      <w:proofErr w:type="spellStart"/>
-      <w:r>
-        <w:t>offen</w:t>
-      </w:r>
-      <w:proofErr w:type="spellEnd"/>
-      <w:r>
-        <w:t xml:space="preserve"> </w:t>
-      </w:r>
-      <w:proofErr w:type="spellStart"/>
-      <w:r>
-        <w:t>benannt</w:t>
-      </w:r>
-      <w:proofErr w:type="spellEnd"/>
-      <w:r>
-        <w:t>.</w:t>
-      </w:r>
-    </w:p>
-    <w:p>
-      <w:pPr>
-        <w:numPr>
-          <w:ilvl w:val="0"/>
-          <w:numId w:val="21"/>
-        </w:numPr>
-        <w:spacing w:after="80"/>
-        <w:ind w:hanging="271"/>
-        <w:rPr>
-          <w:lang w:val="de-DE"/>
-        </w:rPr>
-      </w:pPr>
-      <w:r>
-        <w:rPr>
-          <w:lang w:val="de-DE"/>
-        </w:rPr>
-        <w:t>Finanz-, Arbeits- und persönliche Daten werden nur mit expliziter Freigabe extern verarbeitet.</w:t>
-      </w:r>
-    </w:p>
-    <w:p>
-      <w:pPr>
-        <w:numPr>
-          <w:ilvl w:val="0"/>
-          <w:numId w:val="21"/>
-        </w:numPr>
-        <w:spacing w:after="80"/>
-        <w:ind w:hanging="271"/>
-        <w:rPr>
-          <w:lang w:val="de-DE"/>
-        </w:rPr>
-      </w:pPr>
-      <w:r>
-        <w:rPr>
-          <w:lang w:val="de-DE"/>
-        </w:rPr>
-        <w:t>Schreibende Aktionen benötigen eine Bestätigung.</w:t>
-      </w:r>
-    </w:p>
-    <w:p>
-      <w:pPr>
-        <w:numPr>
-          <w:ilvl w:val="0"/>
-          <w:numId w:val="21"/>
-        </w:numPr>
-        <w:spacing w:after="80"/>
-        <w:ind w:hanging="271"/>
-        <w:rPr>
-          <w:lang w:val="de-DE"/>
-        </w:rPr>
-      </w:pPr>
-      <w:r>
-        <w:rPr>
-          <w:lang w:val="de-DE"/>
-        </w:rPr>
-        <w:t>KI-Ausgaben werden als Vorschläge und nicht als verbindliche Entscheidungen gespeichert.</w:t>
-      </w:r>
-    </w:p>
-    <w:p>
-      <w:pPr>
-        <w:pStyle w:val="Heading2"/>
-      </w:pPr>
-      <w:r>
-        <w:rPr>
-          <w:rFonts w:ascii="Calibri" w:hAnsi="Calibri"/>
-        </w:rPr>
-        <w:lastRenderedPageBreak/>
-        <w:t xml:space="preserve">5.11 </w:t>
-      </w:r>
-      <w:proofErr w:type="spellStart"/>
-      <w:r>
-        <w:rPr>
-          <w:rFonts w:ascii="Calibri" w:hAnsi="Calibri"/>
-        </w:rPr>
-        <w:t>Einstellungen</w:t>
-      </w:r>
-      <w:proofErr w:type="spellEnd"/>
-    </w:p>
-    <w:p>
-      <w:pPr>
-        <w:pStyle w:val="Heading3"/>
-      </w:pPr>
-      <w:proofErr w:type="spellStart"/>
-      <w:r>
-        <w:rPr>
-          <w:rFonts w:ascii="Calibri" w:hAnsi="Calibri"/>
-        </w:rPr>
-        <w:t>Funktionen</w:t>
-      </w:r>
-      <w:proofErr w:type="spellEnd"/>
-    </w:p>
-    <w:p>
-      <w:pPr>
-        <w:numPr>
-          <w:ilvl w:val="0"/>
-          <w:numId w:val="22"/>
-        </w:numPr>
-        <w:spacing w:after="80"/>
-        <w:ind w:hanging="271"/>
-      </w:pPr>
-      <w:proofErr w:type="spellStart"/>
-      <w:r>
-        <w:t>Profil</w:t>
-      </w:r>
-      <w:proofErr w:type="spellEnd"/>
-      <w:r>
-        <w:t xml:space="preserve"> und </w:t>
-      </w:r>
-      <w:proofErr w:type="spellStart"/>
-      <w:r>
-        <w:t>Anzeigeeinstellungen</w:t>
-      </w:r>
-      <w:proofErr w:type="spellEnd"/>
-      <w:r>
-        <w:t>.</w:t>
-      </w:r>
-    </w:p>
-    <w:p>
-      <w:pPr>
-        <w:numPr>
-          <w:ilvl w:val="0"/>
-          <w:numId w:val="22"/>
-        </w:numPr>
-        <w:spacing w:after="80"/>
-        <w:ind w:hanging="271"/>
-        <w:rPr>
-          <w:lang w:val="de-DE"/>
-        </w:rPr>
-      </w:pPr>
-      <w:r>
-        <w:rPr>
-          <w:lang w:val="de-DE"/>
-        </w:rPr>
-        <w:t>Zeitzone, Sprache, Währung und Wochenbeginn.</w:t>
-      </w:r>
-    </w:p>
-    <w:p>
-      <w:pPr>
-        <w:numPr>
-          <w:ilvl w:val="0"/>
-          <w:numId w:val="22"/>
-        </w:numPr>
-        <w:spacing w:after="80"/>
-        <w:ind w:hanging="271"/>
-        <w:rPr>
-          <w:lang w:val="de-DE"/>
-        </w:rPr>
-      </w:pPr>
-      <w:r>
-        <w:rPr>
-          <w:lang w:val="de-DE"/>
-        </w:rPr>
-        <w:t>Kategorien, Statuswerte und persönliche Präferenzen.</w:t>
-      </w:r>
-    </w:p>
-    <w:p>
-      <w:pPr>
-        <w:numPr>
-          <w:ilvl w:val="0"/>
-          <w:numId w:val="22"/>
-        </w:numPr>
-        <w:spacing w:after="80"/>
-        <w:ind w:hanging="271"/>
-      </w:pPr>
-      <w:proofErr w:type="spellStart"/>
-      <w:r>
-        <w:t>Datenimport</w:t>
-      </w:r>
-      <w:proofErr w:type="spellEnd"/>
-      <w:r>
-        <w:t xml:space="preserve"> und </w:t>
-      </w:r>
-      <w:proofErr w:type="spellStart"/>
-      <w:r>
-        <w:t>Datenexport</w:t>
-      </w:r>
-      <w:proofErr w:type="spellEnd"/>
-      <w:r>
-        <w:t>.</w:t>
-      </w:r>
-    </w:p>
-    <w:p>
-      <w:pPr>
-        <w:numPr>
-          <w:ilvl w:val="0"/>
-          <w:numId w:val="22"/>
-        </w:numPr>
-        <w:spacing w:after="80"/>
-        <w:ind w:hanging="271"/>
-      </w:pPr>
-      <w:proofErr w:type="spellStart"/>
-      <w:r>
-        <w:t>Integrationsverwaltung</w:t>
-      </w:r>
-      <w:proofErr w:type="spellEnd"/>
-      <w:r>
-        <w:t xml:space="preserve"> </w:t>
-      </w:r>
-      <w:proofErr w:type="spellStart"/>
-      <w:r>
-        <w:t>mit</w:t>
-      </w:r>
-      <w:proofErr w:type="spellEnd"/>
-      <w:r>
-        <w:t xml:space="preserve"> </w:t>
-      </w:r>
-      <w:proofErr w:type="spellStart"/>
-      <w:r>
-        <w:t>Berechtigungsübersicht</w:t>
-      </w:r>
-      <w:proofErr w:type="spellEnd"/>
-      <w:r>
-        <w:t>.</w:t>
-      </w:r>
-    </w:p>
-    <w:p>
-      <w:pPr>
-        <w:numPr>
-          <w:ilvl w:val="0"/>
-          <w:numId w:val="22"/>
-        </w:numPr>
-        <w:spacing w:after="80"/>
-        <w:ind w:hanging="271"/>
-      </w:pPr>
-      <w:r>
-        <w:t>KI-</w:t>
-      </w:r>
-      <w:proofErr w:type="spellStart"/>
-      <w:r>
-        <w:t>Einstellungen</w:t>
-      </w:r>
-      <w:proofErr w:type="spellEnd"/>
-      <w:r>
-        <w:t xml:space="preserve"> und </w:t>
-      </w:r>
-      <w:proofErr w:type="spellStart"/>
-      <w:r>
-        <w:t>Datenfreigaben</w:t>
-      </w:r>
-      <w:proofErr w:type="spellEnd"/>
-      <w:r>
-        <w:t>.</w:t>
-      </w:r>
-    </w:p>
-    <w:p>
-      <w:pPr>
-        <w:numPr>
-          <w:ilvl w:val="0"/>
-          <w:numId w:val="22"/>
-        </w:numPr>
-        <w:spacing w:after="80"/>
-        <w:ind w:hanging="271"/>
-      </w:pPr>
-      <w:proofErr w:type="spellStart"/>
-      <w:r>
-        <w:t>Sicherheitsoptionen</w:t>
-      </w:r>
-      <w:proofErr w:type="spellEnd"/>
-      <w:r>
-        <w:t xml:space="preserve">, </w:t>
-      </w:r>
-      <w:proofErr w:type="spellStart"/>
-      <w:r>
-        <w:t>Sitzungen</w:t>
-      </w:r>
-      <w:proofErr w:type="spellEnd"/>
-      <w:r>
-        <w:t xml:space="preserve"> und </w:t>
-      </w:r>
-      <w:proofErr w:type="spellStart"/>
-      <w:r>
-        <w:t>Geräte</w:t>
-      </w:r>
-      <w:proofErr w:type="spellEnd"/>
-      <w:r>
-        <w:t>.</w:t>
-      </w:r>
-    </w:p>
-    <w:p>
-      <w:pPr>
-        <w:numPr>
-          <w:ilvl w:val="0"/>
-          <w:numId w:val="22"/>
-        </w:numPr>
-        <w:spacing w:after="80"/>
-        <w:ind w:hanging="271"/>
-        <w:rPr>
-          <w:lang w:val="de-DE"/>
-        </w:rPr>
-      </w:pPr>
-      <w:r>
-        <w:rPr>
-          <w:lang w:val="de-DE"/>
-        </w:rPr>
-        <w:t>Löschung einzelner Datenbereiche oder des gesamten Profils.</w:t>
-      </w:r>
-    </w:p>
-    <w:p>
-      <w:pPr>
-        <w:numPr>
-          <w:ilvl w:val="0"/>
-          <w:numId w:val="22"/>
-        </w:numPr>
-        <w:spacing w:after="80"/>
-        <w:ind w:hanging="271"/>
-      </w:pPr>
-      <w:r>
-        <w:t xml:space="preserve">Audit- und </w:t>
-      </w:r>
-      <w:proofErr w:type="spellStart"/>
-      <w:r>
-        <w:t>Aktivitätsprotokoll</w:t>
-      </w:r>
-      <w:proofErr w:type="spellEnd"/>
-      <w:r>
-        <w:t>.</w:t>
+      </w:pPr>
+      <w:r>
+        <w:t>5.13 Umsetzungsstand Einkaufsliste</w:t>
+      </w:r>
+    </w:p>
+    <w:p>
+      <w:pPr/>
+      <w:r>
+        <w:t>Die lokale Einkaufsliste ist als eigenes, besitzgebundenes Fachmodul umgesetzt. Pro Besitzer gibt es genau eine aktive Liste; archivierte Listen bleiben erhalten. Positionen werden zunächst als flüchtige Vorschau aus Text zerlegt und erst nach ausdrücklicher Bestätigung atomar gespeichert.</w:t>
+      </w:r>
+    </w:p>
+    <w:p>
+      <w:pPr/>
+      <w:r>
+        <w:t>Die erste Version verwendet zehn dokumentierte Systemkategorien. Unbekannte Begriffe erscheinen sichtbar als Sonstiges. Stück, Packung, Gramm, Kilogramm, Milliliter und Liter werden strukturiert erkannt; andere Mengen bleiben als sichtbarer Text erhalten. Eine persönliche Kategorieregel entsteht nur nach einer separaten Bestätigung.</w:t>
+      </w:r>
+    </w:p>
+    <w:p>
+      <w:pPr/>
+      <w:r>
+        <w:t>Die Migration 20260921190000_grocery_lists ist für PostgreSQL und SQLite versioniert. Parser, Besitzgrenzen, Atomarität, Migration, Import und Recovery sind lokal geprüft. Die responsive gemeinsame React-Oberfläche ist zusätzlich in Desktop- und Smartphone-Chrome nachgewiesen; der frische PostgreSQL-Lauf umfasst alle Migrationen und den Einkaufslisten-Integrationstest. Die Pflicht-CI der Daten-/API- und UI-Lieferstufen war vor dem jeweiligen Merge vollständig grün.</w:t>
+      </w:r>
+    </w:p>
+    <w:p>
+      <w:pPr/>
+      <w:r>
+        <w:t>Audio, Teiltranskripte und Rohtranskripte werden nicht an die LifeOS-API übertragen und nicht in Datenbank, Browser-Storage, Service-Worker-Cache, Logs, Audit oder Backup gespeichert. Text und Betriebssystem-Diktat bleiben der vollständige Basispfad. Der reproduzierbare App-Bundle-Test öffnet kein Mikrofon, fordert keine Berechtigung an und installiert kein Sprachmodell; einen Cloud-Fallback gibt es nicht.</w:t>
       </w:r>
     </w:p>
     <w:p>
@@ -6702,6 +6892,94 @@
           <w:lang w:val="de-DE"/>
         </w:rPr>
         <w:t>Erst danach wird er gespeichert oder exportiert.</w:t>
+      </w:r>
+    </w:p>
+    <w:p>
+      <w:pPr>
+        <w:pStyle w:val="Heading2"/>
+      </w:pPr>
+      <w:r>
+        <w:t>6.6 Einkaufsliste per Text oder Systemdiktat erfassen</w:t>
+      </w:r>
+    </w:p>
+    <w:p>
+      <w:pPr>
+        <w:numPr>
+          <w:ilvl w:val="0"/>
+          <w:numId w:val="51"/>
+        </w:numPr>
+        <w:spacing w:after="80"/>
+        <w:ind w:hanging="271"/>
+        <w:rPr>
+          <w:lang w:val="de-DE"/>
+        </w:rPr>
+      </w:pPr>
+      <w:r>
+        <w:t>Anton öffnet die aktive Einkaufsliste.</w:t>
+      </w:r>
+    </w:p>
+    <w:p>
+      <w:pPr>
+        <w:numPr>
+          <w:ilvl w:val="0"/>
+          <w:numId w:val="51"/>
+        </w:numPr>
+        <w:spacing w:after="80"/>
+        <w:ind w:hanging="271"/>
+        <w:rPr>
+          <w:lang w:val="de-DE"/>
+        </w:rPr>
+      </w:pPr>
+      <w:r>
+        <w:t>Er schreibt oder nutzt das Betriebssystem-Diktat, zum Beispiel für zwei Liter Milch, Käse, Hähnchenbrust, Chips und sechs Äpfel.</w:t>
+      </w:r>
+    </w:p>
+    <w:p>
+      <w:pPr>
+        <w:numPr>
+          <w:ilvl w:val="0"/>
+          <w:numId w:val="51"/>
+        </w:numPr>
+        <w:spacing w:after="80"/>
+        <w:ind w:hanging="271"/>
+        <w:rPr>
+          <w:lang w:val="de-DE"/>
+        </w:rPr>
+      </w:pPr>
+      <w:r>
+        <w:t>Das System zeigt einzelne Positionen mit Menge und vorgeschlagener Kategorie als bearbeitbare Vorschau.</w:t>
+      </w:r>
+    </w:p>
+    <w:p>
+      <w:pPr>
+        <w:numPr>
+          <w:ilvl w:val="0"/>
+          <w:numId w:val="51"/>
+        </w:numPr>
+        <w:spacing w:after="80"/>
+        <w:ind w:hanging="271"/>
+        <w:rPr>
+          <w:lang w:val="de-DE"/>
+        </w:rPr>
+      </w:pPr>
+      <w:r>
+        <w:t>Anton korrigiert bei Bedarf Bezeichnung, Menge oder Kategorie.</w:t>
+      </w:r>
+    </w:p>
+    <w:p>
+      <w:pPr>
+        <w:numPr>
+          <w:ilvl w:val="0"/>
+          <w:numId w:val="51"/>
+        </w:numPr>
+        <w:spacing w:after="80"/>
+        <w:ind w:hanging="271"/>
+        <w:rPr>
+          <w:lang w:val="de-DE"/>
+        </w:rPr>
+      </w:pPr>
+      <w:r>
+        <w:t>Erst nach seiner Bestätigung werden alle gültigen Positionen gemeinsam gespeichert und nach Kategorien gruppiert.</w:t>
       </w:r>
     </w:p>
     <w:p>
@@ -9782,6 +10060,94 @@
           </w:p>
         </w:tc>
       </w:tr>
+      <w:tr>
+        <w:tc>
+          <w:tcPr>
+            <w:tcW w:w="2200" w:type="dxa"/>
+          </w:tcPr>
+          <w:p>
+            <w:r>
+              <w:t>Einkaufsliste</w:t>
+            </w:r>
+          </w:p>
+        </w:tc>
+        <w:tc>
+          <w:tcPr>
+            <w:tcW w:w="7160" w:type="dxa"/>
+          </w:tcPr>
+          <w:p>
+            <w:r>
+              <w:t>id, nutzer_id, titel, status, archiviert_am, erstellt_am, aktualisiert_am</w:t>
+            </w:r>
+          </w:p>
+        </w:tc>
+      </w:tr>
+      <w:tr>
+        <w:tc>
+          <w:tcPr>
+            <w:tcW w:w="2200" w:type="dxa"/>
+          </w:tcPr>
+          <w:p>
+            <w:r>
+              <w:t>Einkaufsposition</w:t>
+            </w:r>
+          </w:p>
+        </w:tc>
+        <w:tc>
+          <w:tcPr>
+            <w:tcW w:w="7160" w:type="dxa"/>
+          </w:tcPr>
+          <w:p>
+            <w:r>
+              <w:t>id, einkaufsliste_id, nutzer_id, bezeichnung, menge, einheit, kategorie_id, status, quelle, sortierung</w:t>
+            </w:r>
+          </w:p>
+        </w:tc>
+      </w:tr>
+      <w:tr>
+        <w:tc>
+          <w:tcPr>
+            <w:tcW w:w="2200" w:type="dxa"/>
+          </w:tcPr>
+          <w:p>
+            <w:r>
+              <w:t>Einkaufskategorie</w:t>
+            </w:r>
+          </w:p>
+        </w:tc>
+        <w:tc>
+          <w:tcPr>
+            <w:tcW w:w="7160" w:type="dxa"/>
+          </w:tcPr>
+          <w:p>
+            <w:r>
+              <w:t>id, nutzer_id, name, sortierung, farbe, aktiv</w:t>
+            </w:r>
+          </w:p>
+        </w:tc>
+      </w:tr>
+      <w:tr>
+        <w:tc>
+          <w:tcPr>
+            <w:tcW w:w="2200" w:type="dxa"/>
+          </w:tcPr>
+          <w:p>
+            <w:r>
+              <w:t>Kategorisierungsregel</w:t>
+            </w:r>
+          </w:p>
+        </w:tc>
+        <w:tc>
+          <w:tcPr>
+            <w:tcW w:w="7160" w:type="dxa"/>
+          </w:tcPr>
+          <w:p>
+            <w:r>
+              <w:t>id, nutzer_id, normalisierter_begriff, kategorie_id, ursprung</w:t>
+            </w:r>
+          </w:p>
+        </w:tc>
+      </w:tr>
     </w:tbl>
     <w:p>
       <w:pPr>
@@ -9968,6 +10334,32 @@
           <w:lang w:val="de-DE"/>
         </w:rPr>
         <w:t>KI-Anfragen speichern Quellenverweise, aber keine unkontrollierten Schattenkopien sensibler Daten.</w:t>
+      </w:r>
+    </w:p>
+    <w:p>
+      <w:pPr>
+        <w:numPr>
+          <w:ilvl w:val="0"/>
+          <w:numId w:val="18"/>
+        </w:numPr>
+        <w:spacing w:after="80"/>
+        <w:ind w:hanging="271"/>
+      </w:pPr>
+      <w:r>
+        <w:t>Eine Einkaufsliste besitzt viele Einkaufspositionen; jede Position gehört genau einer Kategorie und demselben Besitzer wie die Liste.</w:t>
+      </w:r>
+    </w:p>
+    <w:p>
+      <w:pPr>
+        <w:numPr>
+          <w:ilvl w:val="0"/>
+          <w:numId w:val="18"/>
+        </w:numPr>
+        <w:spacing w:after="80"/>
+        <w:ind w:hanging="271"/>
+      </w:pPr>
+      <w:r>
+        <w:t>Persönliche Kategorisierungsregeln entstehen nur aus ausdrücklich bestätigten Korrekturen und verändern andere Module nicht automatisch.</w:t>
       </w:r>
     </w:p>
     <w:p>
@@ -11941,10 +12333,7 @@
         </w:rPr>
       </w:pPr>
       <w:r>
-        <w:rPr>
-          <w:lang w:val="de-DE"/>
-        </w:rPr>
-        <w:t>Sprachsteuerung und mobile native Apps.</w:t>
+        <w:t>Allgemeine Sprachsteuerung und mobile native Apps. Die geplante, eng begrenzte Spracheingabe für die Einkaufsliste ist eine spätere Erweiterung und keine allgemeine Sprachsteuerung.</w:t>
       </w:r>
     </w:p>
     <w:p>
@@ -12619,6 +13008,38 @@
           </w:p>
         </w:tc>
       </w:tr>
+      <w:tr>
+        <w:tc>
+          <w:tcPr>
+            <w:tcW w:w="2100" w:type="dxa"/>
+          </w:tcPr>
+          <w:p>
+            <w:r>
+              <w:t>1.1</w:t>
+            </w:r>
+          </w:p>
+        </w:tc>
+        <w:tc>
+          <w:tcPr>
+            <w:tcW w:w="2500" w:type="dxa"/>
+          </w:tcPr>
+          <w:p>
+            <w:r>
+              <w:t>Einkaufsliste und Spracheingabe</w:t>
+            </w:r>
+          </w:p>
+        </w:tc>
+        <w:tc>
+          <w:tcPr>
+            <w:tcW w:w="4760" w:type="dxa"/>
+          </w:tcPr>
+          <w:p>
+            <w:r>
+              <w:t>Daten, API und responsive Oberfläche umgesetzt; lokaler Mikrofonmodus bis zum Offline-End-to-End-Nachweis gesperrt</w:t>
+            </w:r>
+          </w:p>
+        </w:tc>
+      </w:tr>
     </w:tbl>
     <w:p>
       <w:pPr>
@@ -13566,6 +13987,79 @@
         <w:pStyle w:val="Heading2"/>
       </w:pPr>
       <w:r>
+        <w:t>Einkaufsliste und Spracheingabe</w:t>
+      </w:r>
+    </w:p>
+    <w:p>
+      <w:pPr>
+        <w:numPr>
+          <w:ilvl w:val="0"/>
+          <w:numId w:val="18"/>
+        </w:numPr>
+        <w:spacing w:after="80"/>
+        <w:ind w:hanging="271"/>
+      </w:pPr>
+      <w:r>
+        <w:t>Mehrere geschriebene oder diktierte Lebensmittel erscheinen vor dem Speichern als einzelne bearbeitbare Vorschaupositionen.</w:t>
+      </w:r>
+    </w:p>
+    <w:p>
+      <w:pPr>
+        <w:numPr>
+          <w:ilvl w:val="0"/>
+          <w:numId w:val="18"/>
+        </w:numPr>
+        <w:spacing w:after="80"/>
+        <w:ind w:hanging="271"/>
+      </w:pPr>
+      <w:r>
+        <w:t>Käse wird nachvollziehbar Milchprodukte und Eiern, Chips werden Snacks und Süßem zugeordnet; unbekannte Begriffe bleiben sichtbar unter Sonstiges.</w:t>
+      </w:r>
+    </w:p>
+    <w:p>
+      <w:pPr>
+        <w:numPr>
+          <w:ilvl w:val="0"/>
+          <w:numId w:val="18"/>
+        </w:numPr>
+        <w:spacing w:after="80"/>
+        <w:ind w:hanging="271"/>
+      </w:pPr>
+      <w:r>
+        <w:t>Ohne ausdrückliche Bestätigung entsteht kein Einkaufsdatensatz; eine Bestätigung schreibt entweder alle gültigen Positionen oder keine.</w:t>
+      </w:r>
+    </w:p>
+    <w:p>
+      <w:pPr>
+        <w:numPr>
+          <w:ilvl w:val="0"/>
+          <w:numId w:val="18"/>
+        </w:numPr>
+        <w:spacing w:after="80"/>
+        <w:ind w:hanging="271"/>
+      </w:pPr>
+      <w:r>
+        <w:t>Der vollständige Text- und Systemdiktat-Weg funktioniert unabhängig vom bewusst nicht freigegebenen LifeOS-Mikrofonmodus.</w:t>
+      </w:r>
+    </w:p>
+    <w:p>
+      <w:pPr>
+        <w:numPr>
+          <w:ilvl w:val="0"/>
+          <w:numId w:val="18"/>
+        </w:numPr>
+        <w:spacing w:after="80"/>
+        <w:ind w:hanging="271"/>
+      </w:pPr>
+      <w:r>
+        <w:t>Audio wird weder gespeichert noch protokolliert oder an die LifeOS-API übertragen. Ein eigener Mikrofonmodus ist nicht implementiert und darf später keinen stillen Cloud-Rückfall besitzen.</w:t>
+      </w:r>
+    </w:p>
+    <w:p>
+      <w:pPr>
+        <w:pStyle w:val="Heading2"/>
+      </w:pPr>
+      <w:r>
         <w:rPr>
           <w:rFonts w:ascii="Calibri" w:hAnsi="Calibri"/>
         </w:rPr>
@@ -13993,6 +14487,32 @@
     </w:p>
     <w:p>
       <w:pPr>
+        <w:numPr>
+          <w:ilvl w:val="0"/>
+          <w:numId w:val="18"/>
+        </w:numPr>
+        <w:spacing w:after="80"/>
+        <w:ind w:hanging="271"/>
+      </w:pPr>
+      <w:r>
+        <w:t>Für die erste Einkaufslisten-Version ist genau eine aktive Liste pro Besitzer entschieden; archivierte Listen bleiben erhalten.</w:t>
+      </w:r>
+    </w:p>
+    <w:p>
+      <w:pPr>
+        <w:numPr>
+          <w:ilvl w:val="0"/>
+          <w:numId w:val="18"/>
+        </w:numPr>
+        <w:spacing w:after="80"/>
+        <w:ind w:hanging="271"/>
+      </w:pPr>
+      <w:r>
+        <w:t>Offen bleibt, ob ein eigener Mikrofonmodus nach installiertem deutschem Modell, erteilten Systemberechtigungen und bestandenem Offline-End-to-End-Test in einer späteren Mac-Lieferstufe freigegeben wird.</w:t>
+      </w:r>
+    </w:p>
+    <w:p>
+      <w:pPr>
         <w:rPr>
           <w:lang w:val="de-DE"/>
         </w:rPr>
@@ -14196,6 +14716,12 @@
     <w:p>
       <w:r>
         <w:t>Änderungsstand 07.09.2026: Der lokal erfolgreiche M6-Nachweis und der vollständige Sicherheits-, Integritäts- und Stabilitätsreview wurden ergänzt. Dazu gehören stärkere Passwortableitung, Sitzungs- und Login-Härtung, externe Netzwerk- und Backup-Grenzen, Dokumentintegrität, Browser-CSP, Sidecar-Isolation und Einzelinstanzschutz. Die öffentliche Produktfreigabe und ihre externen Apple- und Geräte-Gates bleiben ausdrücklich aufgeschoben.</w:t>
+      </w:r>
+    </w:p>
+    <w:p>
+      <w:pPr/>
+      <w:r>
+        <w:t>Änderungsstand 22.09.2026: Datenmodell, Parser, API und responsive Einkaufsliste mit atomarer Bestätigung, Archiv, Systemkategorien und ausdrücklich bestätigten persönlichen Regeln sind umgesetzt und lokal sowie in der Pflicht-CI geprüft. Der read-only ARM64-App-Bundle-Test bestätigt deutsche Apple-Speech-Unterstützung, aber kein installiertes deutsches SpeechTranscriber-Modell und keinen berechtigten Offline-End-to-End-Lauf. Deshalb bleibt der eigene Mikrofonmodus ohne Cloud-Fallback gesperrt.</w:t>
       </w:r>
     </w:p>
     <w:p>
@@ -14273,7 +14799,7 @@
         <w:color w:val="667085"/>
         <w:sz w:val="18"/>
       </w:rPr>
-      <w:t>0.6  |</w:t>
+      <w:t>0.8  |</w:t>
     </w:r>
     <w:proofErr w:type="gramEnd"/>
     <w:r>
@@ -14931,6 +15457,12 @@
     </w:lvlOverride>
   </w:num>
   <w:num w:numId="50" w16cid:durableId="40248940">
+    <w:abstractNumId w:val="9"/>
+    <w:lvlOverride w:ilvl="0">
+      <w:startOverride w:val="1"/>
+    </w:lvlOverride>
+  </w:num>
+  <w:num w:numId="51" w16cid:durableId="310720333">
     <w:abstractNumId w:val="9"/>
     <w:lvlOverride w:ilvl="0">
       <w:startOverride w:val="1"/>

</xml_diff>

<commit_message>
feat(settings): embed integrations in settings
</commit_message>
<xml_diff>
--- a/LifeOS Leitfaden.docx
+++ b/LifeOS Leitfaden.docx
@@ -72,7 +72,7 @@
         </w:rPr>
       </w:pPr>
       <w:r>
-        <w:t>Stand: 22.09.2026</w:t>
+        <w:t>Stand: 24.09.2026</w:t>
       </w:r>
     </w:p>
     <w:p>
@@ -174,7 +174,7 @@
         </w:rPr>
       </w:pPr>
       <w:r>
-        <w:t>Stand: 22.09.2026</w:t>
+        <w:t>Stand: 24.09.2026</w:t>
       </w:r>
     </w:p>
     <w:p>
@@ -6047,6 +6047,11 @@
       </w:r>
     </w:p>
     <w:p>
+      <w:r>
+        <w:t>Umsetzungsstand 24.09.2026: CalDAV- und GitHub-Verbindungen liegen in der gemeinsamen Oberfläche ausschließlich unter Einstellungen im Abschnitt Integrationen. Sicherheitsgrenzen, Standarddeaktivierung und Bestätigungsabläufe bleiben unverändert.</w:t>
+      </w:r>
+    </w:p>
+    <w:p>
       <w:pPr>
         <w:pStyle w:val="Heading2"/>
       </w:pPr>
@@ -14722,6 +14727,11 @@
       <w:pPr/>
       <w:r>
         <w:t>Änderungsstand 22.09.2026: Datenmodell, Parser, API und responsive Einkaufsliste mit atomarer Bestätigung, Archiv, Systemkategorien und ausdrücklich bestätigten persönlichen Regeln sind umgesetzt und lokal sowie in der Pflicht-CI geprüft. Der read-only ARM64-App-Bundle-Test bestätigt deutsche Apple-Speech-Unterstützung, aber kein installiertes deutsches SpeechTranscriber-Modell und keinen berechtigten Offline-End-to-End-Lauf. Deshalb bleibt der eigene Mikrofonmodus ohne Cloud-Fallback gesperrt.</w:t>
+      </w:r>
+    </w:p>
+    <w:p>
+      <w:r>
+        <w:t>Änderungsstand 24.09.2026: Integrationen wurden in der gemeinsamen Desktop- und Smartphone-Navigation unter Einstellungen eingeordnet. Der bestehende read-only-Funktionsumfang, die Tastaturbedienung und die schnellen Neuanlagen für Aufgaben, Termine und Studium wurden lokal geprüft.</w:t>
       </w:r>
     </w:p>
     <w:p>

</xml_diff>

<commit_message>
feat(settings): embed integrations in settings (#121)
* feat(settings): embed integrations in settings

* docs(coherence): record package 1 pull request
</commit_message>
<xml_diff>
--- a/LifeOS Leitfaden.docx
+++ b/LifeOS Leitfaden.docx
@@ -72,7 +72,7 @@
         </w:rPr>
       </w:pPr>
       <w:r>
-        <w:t>Stand: 22.09.2026</w:t>
+        <w:t>Stand: 24.09.2026</w:t>
       </w:r>
     </w:p>
     <w:p>
@@ -174,7 +174,7 @@
         </w:rPr>
       </w:pPr>
       <w:r>
-        <w:t>Stand: 22.09.2026</w:t>
+        <w:t>Stand: 24.09.2026</w:t>
       </w:r>
     </w:p>
     <w:p>
@@ -6047,6 +6047,11 @@
       </w:r>
     </w:p>
     <w:p>
+      <w:r>
+        <w:t>Umsetzungsstand 24.09.2026: CalDAV- und GitHub-Verbindungen liegen in der gemeinsamen Oberfläche ausschließlich unter Einstellungen im Abschnitt Integrationen. Sicherheitsgrenzen, Standarddeaktivierung und Bestätigungsabläufe bleiben unverändert.</w:t>
+      </w:r>
+    </w:p>
+    <w:p>
       <w:pPr>
         <w:pStyle w:val="Heading2"/>
       </w:pPr>
@@ -14722,6 +14727,11 @@
       <w:pPr/>
       <w:r>
         <w:t>Änderungsstand 22.09.2026: Datenmodell, Parser, API und responsive Einkaufsliste mit atomarer Bestätigung, Archiv, Systemkategorien und ausdrücklich bestätigten persönlichen Regeln sind umgesetzt und lokal sowie in der Pflicht-CI geprüft. Der read-only ARM64-App-Bundle-Test bestätigt deutsche Apple-Speech-Unterstützung, aber kein installiertes deutsches SpeechTranscriber-Modell und keinen berechtigten Offline-End-to-End-Lauf. Deshalb bleibt der eigene Mikrofonmodus ohne Cloud-Fallback gesperrt.</w:t>
+      </w:r>
+    </w:p>
+    <w:p>
+      <w:r>
+        <w:t>Änderungsstand 24.09.2026: Integrationen wurden in der gemeinsamen Desktop- und Smartphone-Navigation unter Einstellungen eingeordnet. Der bestehende read-only-Funktionsumfang, die Tastaturbedienung und die schnellen Neuanlagen für Aufgaben, Termine und Studium wurden lokal geprüft.</w:t>
       </w:r>
     </w:p>
     <w:p>

</xml_diff>

<commit_message>
refactor(profile): retire finance-only settings and document package 2
</commit_message>
<xml_diff>
--- a/LifeOS Leitfaden.docx
+++ b/LifeOS Leitfaden.docx
@@ -783,24 +783,7 @@
         </w:rPr>
       </w:pPr>
       <w:r>
-        <w:rPr>
-          <w:lang w:val="de-DE"/>
-        </w:rPr>
-        <w:t xml:space="preserve">Die Hauptnavigation besteht </w:t>
-      </w:r>
-      <w:proofErr w:type="gramStart"/>
-      <w:r>
-        <w:rPr>
-          <w:lang w:val="de-DE"/>
-        </w:rPr>
-        <w:t>aus folgenden</w:t>
-      </w:r>
-      <w:proofErr w:type="gramEnd"/>
-      <w:r>
-        <w:rPr>
-          <w:lang w:val="de-DE"/>
-        </w:rPr>
-        <w:t xml:space="preserve"> Bereichen:</w:t>
+        <w:t>Die aktuelle Hauptnavigation enthält keinen Finanzbereich. Die nachfolgende Liste zeigt die verbleibenden Bereiche; die Finanzabschnitte und älteren Tabellen dieses Leitfadens dokumentieren den historischen Ausgangsstand. Maßgeblich für den Kohärenzumbau sind der beschlossene Paketplan und die Fortschrittsdatei.</w:t>
       </w:r>
     </w:p>
     <w:p>
@@ -853,21 +836,6 @@
       <w:r>
         <w:t>Projekte</w:t>
       </w:r>
-    </w:p>
-    <w:p>
-      <w:pPr>
-        <w:numPr>
-          <w:ilvl w:val="0"/>
-          <w:numId w:val="1"/>
-        </w:numPr>
-        <w:spacing w:after="80"/>
-        <w:ind w:hanging="271"/>
-      </w:pPr>
-      <w:proofErr w:type="spellStart"/>
-      <w:r>
-        <w:t>Finanzen</w:t>
-      </w:r>
-      <w:proofErr w:type="spellEnd"/>
     </w:p>
     <w:p>
       <w:pPr>
@@ -4032,12 +4000,12 @@
         </w:rPr>
       </w:pPr>
       <w:r>
-        <w:rPr>
-          <w:rFonts w:ascii="Calibri" w:hAnsi="Calibri"/>
-          <w:lang w:val="de-DE"/>
-        </w:rPr>
-        <w:lastRenderedPageBreak/>
-        <w:t>5.5 Finanzen</w:t>
+        <w:t>5.5 Finanzen (historischer Ausgangsstand)</w:t>
+      </w:r>
+    </w:p>
+    <w:p>
+      <w:r>
+        <w:t>Stand 25.09.2026, Paket 2 noch ohne CI-/Merge-Abnahme: Finanznavigation, Finanzansicht, Finanz-API und aktive Finanzverträge sind im Paketbranch entfernt. Alte /api/v1/finance-Pfade antworten mit 404 NOT_FOUND. Historische Finanzmodelle und Bestandsdaten werden nicht stillschweigend gelöscht; ihre gesicherte Migration ist Paket 3. Die folgenden Funktionen sind kein aktuelles Produktversprechen. Der verbindliche Kohärenzplan und docs/coherence-progress.md trennen Ziel und geprüften Lieferstand.</w:t>
       </w:r>
     </w:p>
     <w:p>
@@ -5861,7 +5829,7 @@
         <w:rPr>
           <w:lang w:val="de-DE"/>
         </w:rPr>
-        <w:t>Zeitzone, Sprache, Währung und Wochenbeginn.</w:t>
+        <w:t>Zeitzone, Sprache und Wochenbeginn.</w:t>
       </w:r>
     </w:p>
     <w:p>
@@ -6049,6 +6017,11 @@
     <w:p>
       <w:r>
         <w:t>Umsetzungsstand 24.09.2026: CalDAV- und GitHub-Verbindungen liegen in der gemeinsamen Oberfläche ausschließlich unter Einstellungen im Abschnitt Integrationen. Sicherheitsgrenzen, Standarddeaktivierung und Bestätigungsabläufe bleiben unverändert.</w:t>
+      </w:r>
+    </w:p>
+    <w:p>
+      <w:r>
+        <w:t>Umsetzungsstand 25.09.2026: Die ausschließlich für Finanzen benötigte Währungseinstellung ist aus dem aktiven Profilvertrag entfernt. Profil- und Einstellungsantworten enthalten keine Währung mehr, und ein Schreibversuch mit einer Währung wird abgewiesen. Der gespeicherte Bestandswert bleibt bis zur gesicherten Datenmigration in Paket 3 unverändert erhalten.</w:t>
       </w:r>
     </w:p>
     <w:p>
@@ -14727,6 +14700,11 @@
       <w:pPr/>
       <w:r>
         <w:t>Änderungsstand 22.09.2026: Datenmodell, Parser, API und responsive Einkaufsliste mit atomarer Bestätigung, Archiv, Systemkategorien und ausdrücklich bestätigten persönlichen Regeln sind umgesetzt und lokal sowie in der Pflicht-CI geprüft. Der read-only ARM64-App-Bundle-Test bestätigt deutsche Apple-Speech-Unterstützung, aber kein installiertes deutsches SpeechTranscriber-Modell und keinen berechtigten Offline-End-to-End-Lauf. Deshalb bleibt der eigene Mikrofonmodus ohne Cloud-Fallback gesperrt.</w:t>
+      </w:r>
+    </w:p>
+    <w:p>
+      <w:r>
+        <w:t>Änderungsstand 25.09.2026: Die Finanzfunktionen sind im Kohärenzpaket 2 aus Navigation, Oberfläche, API und aktiven Verträgen entfernt und lokal mit synthetischen Tests geprüft. Historische Daten und Migrationen bleiben bis Paket 3 unverändert. Die Pflicht-CI und der Merge von Paket 2 stehen noch aus; historische Finanzabschnitte gelten nicht als aktive Funktionsbeschreibung.</w:t>
       </w:r>
     </w:p>
     <w:p>

</xml_diff>

<commit_message>
refactor(finance): retire active finance surface and API (#122)
Paket 2: Finanzoberfläche und -routen stillgelegt; Bestandsdaten und Schemareste bleiben bis Paket 3 erhalten. Repository checks und Local macOS release für Head 67710dd erfolgreich.
</commit_message>
<xml_diff>
--- a/LifeOS Leitfaden.docx
+++ b/LifeOS Leitfaden.docx
@@ -783,24 +783,7 @@
         </w:rPr>
       </w:pPr>
       <w:r>
-        <w:rPr>
-          <w:lang w:val="de-DE"/>
-        </w:rPr>
-        <w:t xml:space="preserve">Die Hauptnavigation besteht </w:t>
-      </w:r>
-      <w:proofErr w:type="gramStart"/>
-      <w:r>
-        <w:rPr>
-          <w:lang w:val="de-DE"/>
-        </w:rPr>
-        <w:t>aus folgenden</w:t>
-      </w:r>
-      <w:proofErr w:type="gramEnd"/>
-      <w:r>
-        <w:rPr>
-          <w:lang w:val="de-DE"/>
-        </w:rPr>
-        <w:t xml:space="preserve"> Bereichen:</w:t>
+        <w:t>Die aktuelle Hauptnavigation enthält keinen Finanzbereich. Die nachfolgende Liste zeigt die verbleibenden Bereiche; die Finanzabschnitte und älteren Tabellen dieses Leitfadens dokumentieren den historischen Ausgangsstand. Maßgeblich für den Kohärenzumbau sind der beschlossene Paketplan und die Fortschrittsdatei.</w:t>
       </w:r>
     </w:p>
     <w:p>
@@ -853,21 +836,6 @@
       <w:r>
         <w:t>Projekte</w:t>
       </w:r>
-    </w:p>
-    <w:p>
-      <w:pPr>
-        <w:numPr>
-          <w:ilvl w:val="0"/>
-          <w:numId w:val="1"/>
-        </w:numPr>
-        <w:spacing w:after="80"/>
-        <w:ind w:hanging="271"/>
-      </w:pPr>
-      <w:proofErr w:type="spellStart"/>
-      <w:r>
-        <w:t>Finanzen</w:t>
-      </w:r>
-      <w:proofErr w:type="spellEnd"/>
     </w:p>
     <w:p>
       <w:pPr>
@@ -4032,12 +4000,12 @@
         </w:rPr>
       </w:pPr>
       <w:r>
-        <w:rPr>
-          <w:rFonts w:ascii="Calibri" w:hAnsi="Calibri"/>
-          <w:lang w:val="de-DE"/>
-        </w:rPr>
-        <w:lastRenderedPageBreak/>
-        <w:t>5.5 Finanzen</w:t>
+        <w:t>5.5 Finanzen (historischer Ausgangsstand)</w:t>
+      </w:r>
+    </w:p>
+    <w:p>
+      <w:r>
+        <w:t>Stand 25.09.2026, Paket 2 noch ohne CI-/Merge-Abnahme: Finanznavigation, Finanzansicht, Finanz-API und aktive Finanzverträge sind im Paketbranch entfernt. Alte /api/v1/finance-Pfade antworten mit 404 NOT_FOUND. Historische Finanzmodelle und Bestandsdaten werden nicht stillschweigend gelöscht; ihre gesicherte Migration ist Paket 3. Die folgenden Funktionen sind kein aktuelles Produktversprechen. Der verbindliche Kohärenzplan und docs/coherence-progress.md trennen Ziel und geprüften Lieferstand.</w:t>
       </w:r>
     </w:p>
     <w:p>
@@ -5861,7 +5829,7 @@
         <w:rPr>
           <w:lang w:val="de-DE"/>
         </w:rPr>
-        <w:t>Zeitzone, Sprache, Währung und Wochenbeginn.</w:t>
+        <w:t>Zeitzone, Sprache und Wochenbeginn.</w:t>
       </w:r>
     </w:p>
     <w:p>
@@ -6049,6 +6017,11 @@
     <w:p>
       <w:r>
         <w:t>Umsetzungsstand 24.09.2026: CalDAV- und GitHub-Verbindungen liegen in der gemeinsamen Oberfläche ausschließlich unter Einstellungen im Abschnitt Integrationen. Sicherheitsgrenzen, Standarddeaktivierung und Bestätigungsabläufe bleiben unverändert.</w:t>
+      </w:r>
+    </w:p>
+    <w:p>
+      <w:r>
+        <w:t>Umsetzungsstand 25.09.2026: Die ausschließlich für Finanzen benötigte Währungseinstellung ist aus dem aktiven Profilvertrag entfernt. Profil- und Einstellungsantworten enthalten keine Währung mehr, und ein Schreibversuch mit einer Währung wird abgewiesen. Der gespeicherte Bestandswert bleibt bis zur gesicherten Datenmigration in Paket 3 unverändert erhalten.</w:t>
       </w:r>
     </w:p>
     <w:p>
@@ -14727,6 +14700,11 @@
       <w:pPr/>
       <w:r>
         <w:t>Änderungsstand 22.09.2026: Datenmodell, Parser, API und responsive Einkaufsliste mit atomarer Bestätigung, Archiv, Systemkategorien und ausdrücklich bestätigten persönlichen Regeln sind umgesetzt und lokal sowie in der Pflicht-CI geprüft. Der read-only ARM64-App-Bundle-Test bestätigt deutsche Apple-Speech-Unterstützung, aber kein installiertes deutsches SpeechTranscriber-Modell und keinen berechtigten Offline-End-to-End-Lauf. Deshalb bleibt der eigene Mikrofonmodus ohne Cloud-Fallback gesperrt.</w:t>
+      </w:r>
+    </w:p>
+    <w:p>
+      <w:r>
+        <w:t>Änderungsstand 25.09.2026: Die Finanzfunktionen sind im Kohärenzpaket 2 aus Navigation, Oberfläche, API und aktiven Verträgen entfernt und lokal mit synthetischen Tests geprüft. Historische Daten und Migrationen bleiben bis Paket 3 unverändert. Die Pflicht-CI und der Merge von Paket 2 stehen noch aus; historische Finanzabschnitte gelten nicht als aktive Funktionsbeschreibung.</w:t>
       </w:r>
     </w:p>
     <w:p>

</xml_diff>

<commit_message>
fix(database): remove finance schema safely
</commit_message>
<xml_diff>
--- a/LifeOS Leitfaden.docx
+++ b/LifeOS Leitfaden.docx
@@ -4005,7 +4005,7 @@
     </w:p>
     <w:p>
       <w:r>
-        <w:t>Stand 25.09.2026, Paket 2 noch ohne CI-/Merge-Abnahme: Finanznavigation, Finanzansicht, Finanz-API und aktive Finanzverträge sind im Paketbranch entfernt. Alte /api/v1/finance-Pfade antworten mit 404 NOT_FOUND. Historische Finanzmodelle und Bestandsdaten werden nicht stillschweigend gelöscht; ihre gesicherte Migration ist Paket 3. Die folgenden Funktionen sind kein aktuelles Produktversprechen. Der verbindliche Kohärenzplan und docs/coherence-progress.md trennen Ziel und geprüften Lieferstand.</w:t>
+        <w:t>Stand 25.09.2026, Paket 3 umgesetzt: Finanznavigation, Finanzansicht, Finanz-API und aktive Finanzverträge sind in Paket 2 entfernt und über PR #122 integriert. Paket 3 entfernt zusätzlich Finanzmodelle, Finanztabellen, die zugehörigen Enums, das gespeicherte Währungsfeld und den Aufgabenbereich Finanzen über die versionierte Migration 20260925120000_remove_finance_module; vorhandene Aufgaben mit dem früheren Bereich Finanzen wurden datenerhaltend zu Persönlich überführt. Alte /api/v1/finance-Pfade antworten mit 404 NOT_FOUND. Vor jeder destruktiven Migration verlangt LifeOS ein geprüftes Backup: PostgreSQL nur mit Dump samt SHA-256, der Mac-Sidecar erzeugt selbst ein vollständiges und geprüftes Datenbank- und Dokumentenbackup, bevor er migriert. Entfernte Finanzdaten lassen sich nur aus einem vorher erstellten Backup in ein neues Ziel wiederherstellen; ein App-Downgrade ist kein Rollback. Die folgenden Funktionen sind historischer Ausgangsstand und kein aktuelles Produktversprechen.</w:t>
       </w:r>
     </w:p>
     <w:p>
@@ -4246,7 +4246,7 @@
         <w:rPr>
           <w:lang w:val="de-DE"/>
         </w:rPr>
-        <w:t>Beträge werden mit Währung und Buchungsdatum gespeichert.</w:t>
+        <w:t>Beträge wurden als ganze kleinste Währungseinheiten mit Währung und Buchungsdatum gespeichert (historisch).</w:t>
       </w:r>
     </w:p>
     <w:p>
@@ -4727,7 +4727,7 @@
         <w:rPr>
           <w:lang w:val="de-DE"/>
         </w:rPr>
-        <w:t>Kategorien: Studium, Arbeit, Projekt, Finanzen, Fitness, Privat.</w:t>
+        <w:t>Kategorien: Studium, Arbeit, Projekte, Fitness, Persönlich.</w:t>
       </w:r>
     </w:p>
     <w:p>
@@ -6021,7 +6021,7 @@
     </w:p>
     <w:p>
       <w:r>
-        <w:t>Umsetzungsstand 25.09.2026: Die ausschließlich für Finanzen benötigte Währungseinstellung ist aus dem aktiven Profilvertrag entfernt. Profil- und Einstellungsantworten enthalten keine Währung mehr, und ein Schreibversuch mit einer Währung wird abgewiesen. Der gespeicherte Bestandswert bleibt bis zur gesicherten Datenmigration in Paket 3 unverändert erhalten.</w:t>
+        <w:t>Umsetzungsstand 25.09.2026: Die ausschließlich für Finanzen benötigte Währungseinstellung ist aus dem aktiven Profilvertrag entfernt und seit Paket 3 auch aus Datenbank und Modell entfernt. Profil- und Einstellungsantworten enthalten keine Währung mehr, und ein Schreibversuch mit einer Währung wird abgewiesen.</w:t>
       </w:r>
     </w:p>
     <w:p>
@@ -10273,7 +10273,7 @@
         <w:rPr>
           <w:lang w:val="de-DE"/>
         </w:rPr>
-        <w:t>Aufgaben können auf Entitäten in Studium, Arbeit, Projekten, Finanzen oder Fitness verweisen.</w:t>
+        <w:t>Aufgaben können auf Entitäten in Studium, Arbeit, Projekten, Fitness oder Persönlich verweisen; der frühere Bereich Finanzen ist in Paket 3 entfallen.</w:t>
       </w:r>
     </w:p>
     <w:p>
@@ -14422,7 +14422,7 @@
         <w:rPr>
           <w:lang w:val="de-DE"/>
         </w:rPr>
-        <w:t>Welche Finanzkategorien und Währungen werden tatsächlich benötigt?</w:t>
+        <w:t>Welche Finanzkategorien und Währungen werden tatsächlich benötigt? Diese Frage ist durch den Kohärenzumbau beantwortet: keine. Finanzen sind in den Paketen 2 und 3 vollständig entfernt.</w:t>
       </w:r>
     </w:p>
     <w:p>
@@ -14704,7 +14704,7 @@
     </w:p>
     <w:p>
       <w:r>
-        <w:t>Änderungsstand 25.09.2026: Die Finanzfunktionen sind im Kohärenzpaket 2 aus Navigation, Oberfläche, API und aktiven Verträgen entfernt und lokal mit synthetischen Tests geprüft. Historische Daten und Migrationen bleiben bis Paket 3 unverändert. Die Pflicht-CI und der Merge von Paket 2 stehen noch aus; historische Finanzabschnitte gelten nicht als aktive Funktionsbeschreibung.</w:t>
+        <w:t>Änderungsstand 25.09.2026: Paket 2 ist über PR #122 mit beiden Pflichtchecks integriert. Paket 3 entfernt Finanzmodelle, Finanz-Enums, die Finanztabellen und das gespeicherte Währungsfeld über die versionierte Migration 20260925120000_remove_finance_module und überführt Aufgaben mit dem früheren Bereich Finanzen datenerhaltend zu Persönlich. Vor destruktiven Migrationen ist ein geprüftes Backup verpflichtend: PostgreSQL nur mit Dump samt SHA-256, der Mac-Sidecar erzeugt automatisch ein vollständiges und geprüftes Datenbank- und Dokumentenbackup. Historische Finanzabschnitte bleiben als historischer Stand erkennbar.</w:t>
       </w:r>
     </w:p>
     <w:p>

</xml_diff>

<commit_message>
fix(database): remove finance schema safely (#123)
</commit_message>
<xml_diff>
--- a/LifeOS Leitfaden.docx
+++ b/LifeOS Leitfaden.docx
@@ -4005,7 +4005,7 @@
     </w:p>
     <w:p>
       <w:r>
-        <w:t>Stand 25.09.2026, Paket 2 noch ohne CI-/Merge-Abnahme: Finanznavigation, Finanzansicht, Finanz-API und aktive Finanzverträge sind im Paketbranch entfernt. Alte /api/v1/finance-Pfade antworten mit 404 NOT_FOUND. Historische Finanzmodelle und Bestandsdaten werden nicht stillschweigend gelöscht; ihre gesicherte Migration ist Paket 3. Die folgenden Funktionen sind kein aktuelles Produktversprechen. Der verbindliche Kohärenzplan und docs/coherence-progress.md trennen Ziel und geprüften Lieferstand.</w:t>
+        <w:t>Stand 25.09.2026, Paket 3 umgesetzt: Finanznavigation, Finanzansicht, Finanz-API und aktive Finanzverträge sind in Paket 2 entfernt und über PR #122 integriert. Paket 3 entfernt zusätzlich Finanzmodelle, Finanztabellen, die zugehörigen Enums, das gespeicherte Währungsfeld und den Aufgabenbereich Finanzen über die versionierte Migration 20260925120000_remove_finance_module; vorhandene Aufgaben mit dem früheren Bereich Finanzen wurden datenerhaltend zu Persönlich überführt. Alte /api/v1/finance-Pfade antworten mit 404 NOT_FOUND. Vor jeder destruktiven Migration verlangt LifeOS ein geprüftes Backup: PostgreSQL nur mit Dump samt SHA-256, der Mac-Sidecar erzeugt selbst ein vollständiges und geprüftes Datenbank- und Dokumentenbackup, bevor er migriert. Entfernte Finanzdaten lassen sich nur aus einem vorher erstellten Backup in ein neues Ziel wiederherstellen; ein App-Downgrade ist kein Rollback. Die folgenden Funktionen sind historischer Ausgangsstand und kein aktuelles Produktversprechen.</w:t>
       </w:r>
     </w:p>
     <w:p>
@@ -4246,7 +4246,7 @@
         <w:rPr>
           <w:lang w:val="de-DE"/>
         </w:rPr>
-        <w:t>Beträge werden mit Währung und Buchungsdatum gespeichert.</w:t>
+        <w:t>Beträge wurden als ganze kleinste Währungseinheiten mit Währung und Buchungsdatum gespeichert (historisch).</w:t>
       </w:r>
     </w:p>
     <w:p>
@@ -4727,7 +4727,7 @@
         <w:rPr>
           <w:lang w:val="de-DE"/>
         </w:rPr>
-        <w:t>Kategorien: Studium, Arbeit, Projekt, Finanzen, Fitness, Privat.</w:t>
+        <w:t>Kategorien: Studium, Arbeit, Projekte, Fitness, Persönlich.</w:t>
       </w:r>
     </w:p>
     <w:p>
@@ -6021,7 +6021,7 @@
     </w:p>
     <w:p>
       <w:r>
-        <w:t>Umsetzungsstand 25.09.2026: Die ausschließlich für Finanzen benötigte Währungseinstellung ist aus dem aktiven Profilvertrag entfernt. Profil- und Einstellungsantworten enthalten keine Währung mehr, und ein Schreibversuch mit einer Währung wird abgewiesen. Der gespeicherte Bestandswert bleibt bis zur gesicherten Datenmigration in Paket 3 unverändert erhalten.</w:t>
+        <w:t>Umsetzungsstand 25.09.2026: Die ausschließlich für Finanzen benötigte Währungseinstellung ist aus dem aktiven Profilvertrag entfernt und seit Paket 3 auch aus Datenbank und Modell entfernt. Profil- und Einstellungsantworten enthalten keine Währung mehr, und ein Schreibversuch mit einer Währung wird abgewiesen.</w:t>
       </w:r>
     </w:p>
     <w:p>
@@ -10273,7 +10273,7 @@
         <w:rPr>
           <w:lang w:val="de-DE"/>
         </w:rPr>
-        <w:t>Aufgaben können auf Entitäten in Studium, Arbeit, Projekten, Finanzen oder Fitness verweisen.</w:t>
+        <w:t>Aufgaben können auf Entitäten in Studium, Arbeit, Projekten, Fitness oder Persönlich verweisen; der frühere Bereich Finanzen ist in Paket 3 entfallen.</w:t>
       </w:r>
     </w:p>
     <w:p>
@@ -14422,7 +14422,7 @@
         <w:rPr>
           <w:lang w:val="de-DE"/>
         </w:rPr>
-        <w:t>Welche Finanzkategorien und Währungen werden tatsächlich benötigt?</w:t>
+        <w:t>Welche Finanzkategorien und Währungen werden tatsächlich benötigt? Diese Frage ist durch den Kohärenzumbau beantwortet: keine. Finanzen sind in den Paketen 2 und 3 vollständig entfernt.</w:t>
       </w:r>
     </w:p>
     <w:p>
@@ -14704,7 +14704,7 @@
     </w:p>
     <w:p>
       <w:r>
-        <w:t>Änderungsstand 25.09.2026: Die Finanzfunktionen sind im Kohärenzpaket 2 aus Navigation, Oberfläche, API und aktiven Verträgen entfernt und lokal mit synthetischen Tests geprüft. Historische Daten und Migrationen bleiben bis Paket 3 unverändert. Die Pflicht-CI und der Merge von Paket 2 stehen noch aus; historische Finanzabschnitte gelten nicht als aktive Funktionsbeschreibung.</w:t>
+        <w:t>Änderungsstand 25.09.2026: Paket 2 ist über PR #122 mit beiden Pflichtchecks integriert. Paket 3 entfernt Finanzmodelle, Finanz-Enums, die Finanztabellen und das gespeicherte Währungsfeld über die versionierte Migration 20260925120000_remove_finance_module und überführt Aufgaben mit dem früheren Bereich Finanzen datenerhaltend zu Persönlich. Vor destruktiven Migrationen ist ein geprüftes Backup verpflichtend: PostgreSQL nur mit Dump samt SHA-256, der Mac-Sidecar erzeugt automatisch ein vollständiges und geprüftes Datenbank- und Dokumentenbackup. Historische Finanzabschnitte bleiben als historischer Stand erkennbar.</w:t>
       </w:r>
     </w:p>
     <w:p>

</xml_diff>